<commit_message>
added milestone 2 normalization and schema refinements to version control doc
</commit_message>
<xml_diff>
--- a/Crypto & Stock Anomaly Detection System - Version Control Document.docx
+++ b/Crypto & Stock Anomaly Detection System - Version Control Document.docx
@@ -607,22 +607,22 @@
     <w:tbl>
       <w:tblPr>
         <w:tblStyle w:val="TableGrid"/>
-        <w:tblW w:w="10412" w:type="dxa"/>
+        <w:tblW w:w="10444" w:type="dxa"/>
         <w:tblLook w:val="04A0" w:firstRow="1" w:lastRow="0" w:firstColumn="1" w:lastColumn="0" w:noHBand="0" w:noVBand="1"/>
       </w:tblPr>
       <w:tblGrid>
-        <w:gridCol w:w="2603"/>
-        <w:gridCol w:w="2603"/>
-        <w:gridCol w:w="2603"/>
-        <w:gridCol w:w="2603"/>
+        <w:gridCol w:w="2611"/>
+        <w:gridCol w:w="2611"/>
+        <w:gridCol w:w="2611"/>
+        <w:gridCol w:w="2611"/>
       </w:tblGrid>
       <w:tr>
         <w:trPr>
-          <w:trHeight w:val="1368"/>
+          <w:trHeight w:val="1353"/>
         </w:trPr>
         <w:tc>
           <w:tcPr>
-            <w:tcW w:w="2603" w:type="dxa"/>
+            <w:tcW w:w="2611" w:type="dxa"/>
           </w:tcPr>
           <w:p>
             <w:pPr>
@@ -661,7 +661,7 @@
         </w:tc>
         <w:tc>
           <w:tcPr>
-            <w:tcW w:w="2603" w:type="dxa"/>
+            <w:tcW w:w="2611" w:type="dxa"/>
           </w:tcPr>
           <w:p>
             <w:pPr>
@@ -700,7 +700,7 @@
         </w:tc>
         <w:tc>
           <w:tcPr>
-            <w:tcW w:w="2603" w:type="dxa"/>
+            <w:tcW w:w="2611" w:type="dxa"/>
           </w:tcPr>
           <w:p>
             <w:pPr>
@@ -739,7 +739,7 @@
         </w:tc>
         <w:tc>
           <w:tcPr>
-            <w:tcW w:w="2603" w:type="dxa"/>
+            <w:tcW w:w="2611" w:type="dxa"/>
           </w:tcPr>
           <w:p>
             <w:pPr>
@@ -779,11 +779,11 @@
       </w:tr>
       <w:tr>
         <w:trPr>
-          <w:trHeight w:val="1412"/>
+          <w:trHeight w:val="1396"/>
         </w:trPr>
         <w:tc>
           <w:tcPr>
-            <w:tcW w:w="2603" w:type="dxa"/>
+            <w:tcW w:w="2611" w:type="dxa"/>
           </w:tcPr>
           <w:p>
             <w:pPr>
@@ -816,7 +816,7 @@
         </w:tc>
         <w:tc>
           <w:tcPr>
-            <w:tcW w:w="2603" w:type="dxa"/>
+            <w:tcW w:w="2611" w:type="dxa"/>
           </w:tcPr>
           <w:p>
             <w:pPr>
@@ -873,7 +873,7 @@
         </w:tc>
         <w:tc>
           <w:tcPr>
-            <w:tcW w:w="2603" w:type="dxa"/>
+            <w:tcW w:w="2611" w:type="dxa"/>
           </w:tcPr>
           <w:p>
             <w:pPr>
@@ -890,7 +890,7 @@
         </w:tc>
         <w:tc>
           <w:tcPr>
-            <w:tcW w:w="2603" w:type="dxa"/>
+            <w:tcW w:w="2611" w:type="dxa"/>
           </w:tcPr>
           <w:p>
             <w:pPr>
@@ -924,11 +924,11 @@
       </w:tr>
       <w:tr>
         <w:trPr>
-          <w:trHeight w:val="1368"/>
+          <w:trHeight w:val="1353"/>
         </w:trPr>
         <w:tc>
           <w:tcPr>
-            <w:tcW w:w="2603" w:type="dxa"/>
+            <w:tcW w:w="2611" w:type="dxa"/>
           </w:tcPr>
           <w:p>
             <w:pPr>
@@ -942,11 +942,39 @@
               </w:rPr>
             </w:pPr>
           </w:p>
-        </w:tc>
-        <w:tc>
-          <w:tcPr>
-            <w:tcW w:w="2603" w:type="dxa"/>
-          </w:tcPr>
+          <w:p>
+            <w:pPr>
+              <w:jc w:val="center"/>
+              <w:rPr>
+                <w:rFonts w:asciiTheme="majorBidi" w:hAnsiTheme="majorBidi" w:cstheme="majorBidi"/>
+                <w:sz w:val="32"/>
+                <w:szCs w:val="32"/>
+              </w:rPr>
+            </w:pPr>
+            <w:r>
+              <w:rPr>
+                <w:rFonts w:asciiTheme="majorBidi" w:hAnsiTheme="majorBidi" w:cstheme="majorBidi"/>
+                <w:sz w:val="32"/>
+                <w:szCs w:val="32"/>
+              </w:rPr>
+              <w:t>ERD &amp; Schema Refinement</w:t>
+            </w:r>
+          </w:p>
+        </w:tc>
+        <w:tc>
+          <w:tcPr>
+            <w:tcW w:w="2611" w:type="dxa"/>
+          </w:tcPr>
+          <w:p>
+            <w:pPr>
+              <w:jc w:val="center"/>
+              <w:rPr>
+                <w:rFonts w:ascii="Calibri" w:hAnsi="Calibri" w:cs="Calibri"/>
+                <w:sz w:val="32"/>
+                <w:szCs w:val="32"/>
+              </w:rPr>
+            </w:pPr>
+          </w:p>
           <w:p>
             <w:pPr>
               <w:jc w:val="center"/>
@@ -958,11 +986,43 @@
                 <w:szCs w:val="32"/>
               </w:rPr>
             </w:pPr>
-          </w:p>
-        </w:tc>
-        <w:tc>
-          <w:tcPr>
-            <w:tcW w:w="2603" w:type="dxa"/>
+            <w:r>
+              <w:rPr>
+                <w:rFonts w:ascii="Calibri" w:hAnsi="Calibri" w:cs="Calibri"/>
+                <w:sz w:val="32"/>
+                <w:szCs w:val="32"/>
+              </w:rPr>
+              <w:t>Ver</w:t>
+            </w:r>
+            <w:r>
+              <w:rPr>
+                <w:rFonts w:ascii="Calibri" w:hAnsi="Calibri" w:cs="Calibri"/>
+                <w:sz w:val="32"/>
+                <w:szCs w:val="32"/>
+              </w:rPr>
+              <w:t>s</w:t>
+            </w:r>
+            <w:r>
+              <w:rPr>
+                <w:rFonts w:ascii="Calibri" w:hAnsi="Calibri" w:cs="Calibri"/>
+                <w:sz w:val="32"/>
+                <w:szCs w:val="32"/>
+              </w:rPr>
+              <w:t>ion</w:t>
+            </w:r>
+            <w:r>
+              <w:rPr>
+                <w:rFonts w:ascii="Calibri" w:hAnsi="Calibri" w:cs="Calibri"/>
+                <w:sz w:val="32"/>
+                <w:szCs w:val="32"/>
+              </w:rPr>
+              <w:t xml:space="preserve"> 1.1</w:t>
+            </w:r>
+          </w:p>
+        </w:tc>
+        <w:tc>
+          <w:tcPr>
+            <w:tcW w:w="2611" w:type="dxa"/>
           </w:tcPr>
           <w:p>
             <w:pPr>
@@ -979,8 +1039,18 @@
         </w:tc>
         <w:tc>
           <w:tcPr>
-            <w:tcW w:w="2603" w:type="dxa"/>
-          </w:tcPr>
+            <w:tcW w:w="2611" w:type="dxa"/>
+          </w:tcPr>
+          <w:p>
+            <w:pPr>
+              <w:jc w:val="center"/>
+              <w:rPr>
+                <w:rFonts w:ascii="Calibri" w:hAnsi="Calibri" w:cs="Calibri"/>
+                <w:sz w:val="32"/>
+                <w:szCs w:val="32"/>
+              </w:rPr>
+            </w:pPr>
+          </w:p>
           <w:p>
             <w:pPr>
               <w:jc w:val="center"/>
@@ -992,16 +1062,32 @@
                 <w:szCs w:val="32"/>
               </w:rPr>
             </w:pPr>
+            <w:r>
+              <w:rPr>
+                <w:rFonts w:ascii="Calibri" w:hAnsi="Calibri" w:cs="Calibri"/>
+                <w:sz w:val="32"/>
+                <w:szCs w:val="32"/>
+              </w:rPr>
+              <w:t>May 15</w:t>
+            </w:r>
+            <w:r>
+              <w:rPr>
+                <w:rFonts w:ascii="Calibri" w:hAnsi="Calibri" w:cs="Calibri"/>
+                <w:sz w:val="32"/>
+                <w:szCs w:val="32"/>
+              </w:rPr>
+              <w:t>, 2026</w:t>
+            </w:r>
           </w:p>
         </w:tc>
       </w:tr>
       <w:tr>
         <w:trPr>
-          <w:trHeight w:val="1412"/>
+          <w:trHeight w:val="1396"/>
         </w:trPr>
         <w:tc>
           <w:tcPr>
-            <w:tcW w:w="2603" w:type="dxa"/>
+            <w:tcW w:w="2611" w:type="dxa"/>
           </w:tcPr>
           <w:p>
             <w:pPr>
@@ -1018,7 +1104,7 @@
         </w:tc>
         <w:tc>
           <w:tcPr>
-            <w:tcW w:w="2603" w:type="dxa"/>
+            <w:tcW w:w="2611" w:type="dxa"/>
           </w:tcPr>
           <w:p>
             <w:pPr>
@@ -1035,7 +1121,7 @@
         </w:tc>
         <w:tc>
           <w:tcPr>
-            <w:tcW w:w="2603" w:type="dxa"/>
+            <w:tcW w:w="2611" w:type="dxa"/>
           </w:tcPr>
           <w:p>
             <w:pPr>
@@ -1052,7 +1138,7 @@
         </w:tc>
         <w:tc>
           <w:tcPr>
-            <w:tcW w:w="2603" w:type="dxa"/>
+            <w:tcW w:w="2611" w:type="dxa"/>
           </w:tcPr>
           <w:p>
             <w:pPr>
@@ -1068,6 +1154,79 @@
           </w:p>
         </w:tc>
       </w:tr>
+      <w:tr>
+        <w:trPr>
+          <w:trHeight w:val="1396"/>
+        </w:trPr>
+        <w:tc>
+          <w:tcPr>
+            <w:tcW w:w="2611" w:type="dxa"/>
+          </w:tcPr>
+          <w:p>
+            <w:pPr>
+              <w:jc w:val="center"/>
+              <w:rPr>
+                <w:rFonts w:asciiTheme="majorBidi" w:hAnsiTheme="majorBidi" w:cstheme="majorBidi"/>
+                <w:b/>
+                <w:bCs/>
+                <w:sz w:val="32"/>
+                <w:szCs w:val="32"/>
+              </w:rPr>
+            </w:pPr>
+          </w:p>
+        </w:tc>
+        <w:tc>
+          <w:tcPr>
+            <w:tcW w:w="2611" w:type="dxa"/>
+          </w:tcPr>
+          <w:p>
+            <w:pPr>
+              <w:jc w:val="center"/>
+              <w:rPr>
+                <w:rFonts w:asciiTheme="majorBidi" w:hAnsiTheme="majorBidi" w:cstheme="majorBidi"/>
+                <w:b/>
+                <w:bCs/>
+                <w:sz w:val="32"/>
+                <w:szCs w:val="32"/>
+              </w:rPr>
+            </w:pPr>
+          </w:p>
+        </w:tc>
+        <w:tc>
+          <w:tcPr>
+            <w:tcW w:w="2611" w:type="dxa"/>
+          </w:tcPr>
+          <w:p>
+            <w:pPr>
+              <w:jc w:val="center"/>
+              <w:rPr>
+                <w:rFonts w:asciiTheme="majorBidi" w:hAnsiTheme="majorBidi" w:cstheme="majorBidi"/>
+                <w:b/>
+                <w:bCs/>
+                <w:sz w:val="32"/>
+                <w:szCs w:val="32"/>
+              </w:rPr>
+            </w:pPr>
+          </w:p>
+        </w:tc>
+        <w:tc>
+          <w:tcPr>
+            <w:tcW w:w="2611" w:type="dxa"/>
+          </w:tcPr>
+          <w:p>
+            <w:pPr>
+              <w:jc w:val="center"/>
+              <w:rPr>
+                <w:rFonts w:asciiTheme="majorBidi" w:hAnsiTheme="majorBidi" w:cstheme="majorBidi"/>
+                <w:b/>
+                <w:bCs/>
+                <w:sz w:val="32"/>
+                <w:szCs w:val="32"/>
+              </w:rPr>
+            </w:pPr>
+          </w:p>
+        </w:tc>
+      </w:tr>
     </w:tbl>
     <w:p>
       <w:pPr>
@@ -1088,6 +1247,101 @@
       <w:pPr>
         <w:jc w:val="center"/>
         <w:rPr>
+          <w:rFonts w:asciiTheme="majorBidi" w:hAnsiTheme="majorBidi" w:cstheme="majorBidi"/>
+          <w:b/>
+          <w:bCs/>
+          <w:sz w:val="56"/>
+          <w:szCs w:val="56"/>
+        </w:rPr>
+      </w:pPr>
+    </w:p>
+    <w:p>
+      <w:pPr>
+        <w:jc w:val="center"/>
+        <w:rPr>
+          <w:rFonts w:asciiTheme="majorBidi" w:hAnsiTheme="majorBidi" w:cstheme="majorBidi"/>
+          <w:b/>
+          <w:bCs/>
+          <w:sz w:val="56"/>
+          <w:szCs w:val="56"/>
+        </w:rPr>
+      </w:pPr>
+    </w:p>
+    <w:p>
+      <w:pPr>
+        <w:jc w:val="center"/>
+        <w:rPr>
+          <w:rFonts w:asciiTheme="majorBidi" w:hAnsiTheme="majorBidi" w:cstheme="majorBidi"/>
+          <w:b/>
+          <w:bCs/>
+          <w:sz w:val="56"/>
+          <w:szCs w:val="56"/>
+        </w:rPr>
+      </w:pPr>
+    </w:p>
+    <w:p>
+      <w:pPr>
+        <w:jc w:val="center"/>
+        <w:rPr>
+          <w:rFonts w:asciiTheme="majorBidi" w:hAnsiTheme="majorBidi" w:cstheme="majorBidi"/>
+          <w:b/>
+          <w:bCs/>
+          <w:sz w:val="56"/>
+          <w:szCs w:val="56"/>
+        </w:rPr>
+      </w:pPr>
+    </w:p>
+    <w:p>
+      <w:pPr>
+        <w:jc w:val="center"/>
+        <w:rPr>
+          <w:rFonts w:asciiTheme="majorBidi" w:hAnsiTheme="majorBidi" w:cstheme="majorBidi"/>
+          <w:b/>
+          <w:bCs/>
+          <w:sz w:val="56"/>
+          <w:szCs w:val="56"/>
+        </w:rPr>
+      </w:pPr>
+    </w:p>
+    <w:p>
+      <w:pPr>
+        <w:jc w:val="center"/>
+        <w:rPr>
+          <w:rFonts w:asciiTheme="majorBidi" w:hAnsiTheme="majorBidi" w:cstheme="majorBidi"/>
+          <w:b/>
+          <w:bCs/>
+          <w:sz w:val="56"/>
+          <w:szCs w:val="56"/>
+        </w:rPr>
+      </w:pPr>
+    </w:p>
+    <w:p>
+      <w:pPr>
+        <w:jc w:val="center"/>
+        <w:rPr>
+          <w:rFonts w:asciiTheme="majorBidi" w:hAnsiTheme="majorBidi" w:cstheme="majorBidi"/>
+          <w:b/>
+          <w:bCs/>
+          <w:sz w:val="56"/>
+          <w:szCs w:val="56"/>
+        </w:rPr>
+      </w:pPr>
+      <w:r>
+        <w:rPr>
+          <w:rFonts w:asciiTheme="majorBidi" w:hAnsiTheme="majorBidi" w:cstheme="majorBidi"/>
+          <w:b/>
+          <w:bCs/>
+          <w:sz w:val="56"/>
+          <w:szCs w:val="56"/>
+        </w:rPr>
+        <w:lastRenderedPageBreak/>
+        <w:t>Milestone 1</w:t>
+      </w:r>
+    </w:p>
+    <w:p>
+      <w:pPr>
+        <w:jc w:val="center"/>
+        <w:rPr>
           <w:rFonts w:ascii="Calibri" w:hAnsi="Calibri" w:cs="Calibri"/>
           <w:b/>
           <w:bCs/>
@@ -1097,37 +1351,14 @@
       </w:pPr>
       <w:r>
         <w:rPr>
-          <w:rFonts w:asciiTheme="majorBidi" w:hAnsiTheme="majorBidi" w:cstheme="majorBidi"/>
-          <w:b/>
-          <w:bCs/>
-          <w:sz w:val="40"/>
-          <w:szCs w:val="40"/>
-        </w:rPr>
-        <w:br w:type="page"/>
-      </w:r>
-      <w:r>
-        <w:rPr>
           <w:rFonts w:ascii="Calibri" w:hAnsi="Calibri" w:cs="Calibri"/>
           <w:b/>
           <w:bCs/>
           <w:sz w:val="52"/>
           <w:szCs w:val="52"/>
         </w:rPr>
-        <w:lastRenderedPageBreak/>
         <w:t>Entity Relationship Diagram (ERD)</w:t>
       </w:r>
-    </w:p>
-    <w:p>
-      <w:pPr>
-        <w:jc w:val="center"/>
-        <w:rPr>
-          <w:rFonts w:ascii="Calibri" w:hAnsi="Calibri" w:cs="Calibri"/>
-          <w:b/>
-          <w:bCs/>
-          <w:sz w:val="52"/>
-          <w:szCs w:val="52"/>
-        </w:rPr>
-      </w:pPr>
     </w:p>
     <w:p>
       <w:pPr>
@@ -2008,7 +2239,749 @@
         <w:t> tables demonstrates a clear audit trail, where each model run is mapped to the specific user who executed it.</w:t>
       </w:r>
     </w:p>
-    <w:p/>
+    <w:p>
+      <w:pPr>
+        <w:pBdr>
+          <w:bottom w:val="single" w:sz="6" w:space="1" w:color="auto"/>
+        </w:pBdr>
+      </w:pPr>
+    </w:p>
+    <w:p>
+      <w:pPr>
+        <w:jc w:val="center"/>
+        <w:rPr>
+          <w:rFonts w:asciiTheme="majorBidi" w:hAnsiTheme="majorBidi" w:cstheme="majorBidi"/>
+          <w:b/>
+          <w:bCs/>
+          <w:sz w:val="56"/>
+          <w:szCs w:val="56"/>
+        </w:rPr>
+      </w:pPr>
+    </w:p>
+    <w:p>
+      <w:pPr>
+        <w:jc w:val="center"/>
+        <w:rPr>
+          <w:rFonts w:asciiTheme="majorBidi" w:hAnsiTheme="majorBidi" w:cstheme="majorBidi"/>
+          <w:b/>
+          <w:bCs/>
+          <w:sz w:val="56"/>
+          <w:szCs w:val="56"/>
+        </w:rPr>
+      </w:pPr>
+    </w:p>
+    <w:p>
+      <w:pPr>
+        <w:jc w:val="center"/>
+        <w:rPr>
+          <w:rFonts w:asciiTheme="majorBidi" w:hAnsiTheme="majorBidi" w:cstheme="majorBidi"/>
+          <w:b/>
+          <w:bCs/>
+          <w:sz w:val="56"/>
+          <w:szCs w:val="56"/>
+        </w:rPr>
+      </w:pPr>
+      <w:r>
+        <w:rPr>
+          <w:rFonts w:asciiTheme="majorBidi" w:hAnsiTheme="majorBidi" w:cstheme="majorBidi"/>
+          <w:b/>
+          <w:bCs/>
+          <w:sz w:val="56"/>
+          <w:szCs w:val="56"/>
+        </w:rPr>
+        <w:lastRenderedPageBreak/>
+        <w:t xml:space="preserve">Milestone </w:t>
+      </w:r>
+      <w:r>
+        <w:rPr>
+          <w:rFonts w:asciiTheme="majorBidi" w:hAnsiTheme="majorBidi" w:cstheme="majorBidi"/>
+          <w:b/>
+          <w:bCs/>
+          <w:sz w:val="56"/>
+          <w:szCs w:val="56"/>
+        </w:rPr>
+        <w:t>2</w:t>
+      </w:r>
+    </w:p>
+    <w:p>
+      <w:pPr>
+        <w:rPr>
+          <w:b/>
+          <w:bCs/>
+          <w:sz w:val="32"/>
+          <w:szCs w:val="32"/>
+        </w:rPr>
+      </w:pPr>
+      <w:r>
+        <w:rPr>
+          <w:b/>
+          <w:bCs/>
+          <w:sz w:val="32"/>
+          <w:szCs w:val="32"/>
+        </w:rPr>
+        <w:t>Normalization Justification</w:t>
+      </w:r>
+    </w:p>
+    <w:p>
+      <w:pPr>
+        <w:spacing w:line="276" w:lineRule="auto"/>
+        <w:rPr>
+          <w:sz w:val="24"/>
+          <w:szCs w:val="24"/>
+        </w:rPr>
+      </w:pPr>
+      <w:r>
+        <w:rPr>
+          <w:sz w:val="24"/>
+          <w:szCs w:val="24"/>
+        </w:rPr>
+        <w:t>The database schema has been refined to satisfy </w:t>
+      </w:r>
+      <w:r>
+        <w:rPr>
+          <w:b/>
+          <w:bCs/>
+          <w:sz w:val="24"/>
+          <w:szCs w:val="24"/>
+        </w:rPr>
+        <w:t>Third Normal Form (3NF)</w:t>
+      </w:r>
+      <w:r>
+        <w:rPr>
+          <w:sz w:val="24"/>
+          <w:szCs w:val="24"/>
+        </w:rPr>
+        <w:t> to ensure data integrity and eliminate redundancy.</w:t>
+      </w:r>
+    </w:p>
+    <w:p>
+      <w:pPr>
+        <w:numPr>
+          <w:ilvl w:val="0"/>
+          <w:numId w:val="2"/>
+        </w:numPr>
+        <w:spacing w:line="276" w:lineRule="auto"/>
+        <w:rPr>
+          <w:sz w:val="24"/>
+          <w:szCs w:val="24"/>
+        </w:rPr>
+      </w:pPr>
+      <w:r>
+        <w:rPr>
+          <w:b/>
+          <w:bCs/>
+          <w:sz w:val="24"/>
+          <w:szCs w:val="24"/>
+        </w:rPr>
+        <w:t>1NF:</w:t>
+      </w:r>
+      <w:r>
+        <w:rPr>
+          <w:sz w:val="24"/>
+          <w:szCs w:val="24"/>
+        </w:rPr>
+        <w:t> All attributes contain atomic values, and each table has a defined Primary Key.</w:t>
+      </w:r>
+    </w:p>
+    <w:p>
+      <w:pPr>
+        <w:numPr>
+          <w:ilvl w:val="0"/>
+          <w:numId w:val="2"/>
+        </w:numPr>
+        <w:spacing w:line="276" w:lineRule="auto"/>
+        <w:rPr>
+          <w:sz w:val="24"/>
+          <w:szCs w:val="24"/>
+        </w:rPr>
+      </w:pPr>
+      <w:r>
+        <w:rPr>
+          <w:b/>
+          <w:bCs/>
+          <w:sz w:val="24"/>
+          <w:szCs w:val="24"/>
+        </w:rPr>
+        <w:t>2NF:</w:t>
+      </w:r>
+      <w:r>
+        <w:rPr>
+          <w:sz w:val="24"/>
+          <w:szCs w:val="24"/>
+        </w:rPr>
+        <w:t> Removed partial dependencies by ensuring all non-key attributes (like </w:t>
+      </w:r>
+      <w:proofErr w:type="spellStart"/>
+      <w:r>
+        <w:rPr>
+          <w:sz w:val="24"/>
+          <w:szCs w:val="24"/>
+        </w:rPr>
+        <w:t>price_close</w:t>
+      </w:r>
+      <w:proofErr w:type="spellEnd"/>
+      <w:r>
+        <w:rPr>
+          <w:sz w:val="24"/>
+          <w:szCs w:val="24"/>
+        </w:rPr>
+        <w:t>) depend entirely on the primary key (</w:t>
+      </w:r>
+      <w:proofErr w:type="spellStart"/>
+      <w:r>
+        <w:rPr>
+          <w:sz w:val="24"/>
+          <w:szCs w:val="24"/>
+        </w:rPr>
+        <w:t>price_id</w:t>
+      </w:r>
+      <w:proofErr w:type="spellEnd"/>
+      <w:r>
+        <w:rPr>
+          <w:sz w:val="24"/>
+          <w:szCs w:val="24"/>
+        </w:rPr>
+        <w:t>).</w:t>
+      </w:r>
+    </w:p>
+    <w:p>
+      <w:pPr>
+        <w:numPr>
+          <w:ilvl w:val="0"/>
+          <w:numId w:val="2"/>
+        </w:numPr>
+        <w:spacing w:line="276" w:lineRule="auto"/>
+        <w:rPr>
+          <w:sz w:val="24"/>
+          <w:szCs w:val="24"/>
+        </w:rPr>
+      </w:pPr>
+      <w:r>
+        <w:rPr>
+          <w:b/>
+          <w:bCs/>
+          <w:sz w:val="24"/>
+          <w:szCs w:val="24"/>
+        </w:rPr>
+        <w:t>3NF:</w:t>
+      </w:r>
+      <w:r>
+        <w:rPr>
+          <w:sz w:val="24"/>
+          <w:szCs w:val="24"/>
+        </w:rPr>
+        <w:t> Eliminated transitive dependencies. Attributes like </w:t>
+      </w:r>
+      <w:proofErr w:type="spellStart"/>
+      <w:r>
+        <w:rPr>
+          <w:sz w:val="24"/>
+          <w:szCs w:val="24"/>
+        </w:rPr>
+        <w:t>asset_type</w:t>
+      </w:r>
+      <w:proofErr w:type="spellEnd"/>
+      <w:r>
+        <w:rPr>
+          <w:sz w:val="24"/>
+          <w:szCs w:val="24"/>
+        </w:rPr>
+        <w:t xml:space="preserve"> are kept in </w:t>
+      </w:r>
+      <w:r>
+        <w:rPr>
+          <w:sz w:val="28"/>
+          <w:szCs w:val="28"/>
+        </w:rPr>
+        <w:t>the assets table to prevent duplication across the </w:t>
+      </w:r>
+      <w:proofErr w:type="spellStart"/>
+      <w:r>
+        <w:rPr>
+          <w:sz w:val="28"/>
+          <w:szCs w:val="28"/>
+        </w:rPr>
+        <w:t>price_history</w:t>
+      </w:r>
+      <w:proofErr w:type="spellEnd"/>
+      <w:r>
+        <w:rPr>
+          <w:sz w:val="28"/>
+          <w:szCs w:val="28"/>
+        </w:rPr>
+        <w:t> table</w:t>
+      </w:r>
+      <w:r>
+        <w:rPr>
+          <w:sz w:val="24"/>
+          <w:szCs w:val="24"/>
+        </w:rPr>
+        <w:t>.</w:t>
+      </w:r>
+    </w:p>
+    <w:p>
+      <w:pPr>
+        <w:rPr>
+          <w:b/>
+          <w:bCs/>
+          <w:sz w:val="32"/>
+          <w:szCs w:val="32"/>
+        </w:rPr>
+      </w:pPr>
+      <w:r>
+        <w:rPr>
+          <w:b/>
+          <w:bCs/>
+          <w:sz w:val="32"/>
+          <w:szCs w:val="32"/>
+        </w:rPr>
+        <w:t>Updated Relational Schema (Milestone 2 Changes)</w:t>
+      </w:r>
+    </w:p>
+    <w:p>
+      <w:pPr>
+        <w:rPr>
+          <w:b/>
+          <w:bCs/>
+          <w:sz w:val="32"/>
+          <w:szCs w:val="32"/>
+        </w:rPr>
+      </w:pPr>
+    </w:p>
+    <w:tbl>
+      <w:tblPr>
+        <w:tblStyle w:val="GridTable4-Accent1"/>
+        <w:tblW w:w="0" w:type="auto"/>
+        <w:tblLook w:val="04A0" w:firstRow="1" w:lastRow="0" w:firstColumn="1" w:lastColumn="0" w:noHBand="0" w:noVBand="1"/>
+      </w:tblPr>
+      <w:tblGrid>
+        <w:gridCol w:w="2167"/>
+        <w:gridCol w:w="2195"/>
+        <w:gridCol w:w="1948"/>
+        <w:gridCol w:w="3266"/>
+      </w:tblGrid>
+      <w:tr>
+        <w:trPr>
+          <w:cnfStyle w:val="100000000000" w:firstRow="1" w:lastRow="0" w:firstColumn="0" w:lastColumn="0" w:oddVBand="0" w:evenVBand="0" w:oddHBand="0" w:evenHBand="0" w:firstRowFirstColumn="0" w:firstRowLastColumn="0" w:lastRowFirstColumn="0" w:lastRowLastColumn="0"/>
+        </w:trPr>
+        <w:tc>
+          <w:tcPr>
+            <w:cnfStyle w:val="001000000000" w:firstRow="0" w:lastRow="0" w:firstColumn="1" w:lastColumn="0" w:oddVBand="0" w:evenVBand="0" w:oddHBand="0" w:evenHBand="0" w:firstRowFirstColumn="0" w:firstRowLastColumn="0" w:lastRowFirstColumn="0" w:lastRowLastColumn="0"/>
+            <w:tcW w:w="0" w:type="auto"/>
+            <w:hideMark/>
+          </w:tcPr>
+          <w:p>
+            <w:pPr>
+              <w:spacing w:after="160" w:line="259" w:lineRule="auto"/>
+            </w:pPr>
+            <w:r>
+              <w:t>Table Name</w:t>
+            </w:r>
+          </w:p>
+        </w:tc>
+        <w:tc>
+          <w:tcPr>
+            <w:tcW w:w="0" w:type="auto"/>
+            <w:hideMark/>
+          </w:tcPr>
+          <w:p>
+            <w:pPr>
+              <w:spacing w:after="160" w:line="259" w:lineRule="auto"/>
+              <w:cnfStyle w:val="100000000000" w:firstRow="1" w:lastRow="0" w:firstColumn="0" w:lastColumn="0" w:oddVBand="0" w:evenVBand="0" w:oddHBand="0" w:evenHBand="0" w:firstRowFirstColumn="0" w:firstRowLastColumn="0" w:lastRowFirstColumn="0" w:lastRowLastColumn="0"/>
+            </w:pPr>
+            <w:r>
+              <w:t>Attributes</w:t>
+            </w:r>
+          </w:p>
+        </w:tc>
+        <w:tc>
+          <w:tcPr>
+            <w:tcW w:w="0" w:type="auto"/>
+            <w:hideMark/>
+          </w:tcPr>
+          <w:p>
+            <w:pPr>
+              <w:spacing w:after="160" w:line="259" w:lineRule="auto"/>
+              <w:cnfStyle w:val="100000000000" w:firstRow="1" w:lastRow="0" w:firstColumn="0" w:lastColumn="0" w:oddVBand="0" w:evenVBand="0" w:oddHBand="0" w:evenHBand="0" w:firstRowFirstColumn="0" w:firstRowLastColumn="0" w:lastRowFirstColumn="0" w:lastRowLastColumn="0"/>
+            </w:pPr>
+            <w:r>
+              <w:t>Keys</w:t>
+            </w:r>
+          </w:p>
+        </w:tc>
+        <w:tc>
+          <w:tcPr>
+            <w:tcW w:w="0" w:type="auto"/>
+            <w:hideMark/>
+          </w:tcPr>
+          <w:p>
+            <w:pPr>
+              <w:spacing w:after="160" w:line="259" w:lineRule="auto"/>
+              <w:cnfStyle w:val="100000000000" w:firstRow="1" w:lastRow="0" w:firstColumn="0" w:lastColumn="0" w:oddVBand="0" w:evenVBand="0" w:oddHBand="0" w:evenHBand="0" w:firstRowFirstColumn="0" w:firstRowLastColumn="0" w:lastRowFirstColumn="0" w:lastRowLastColumn="0"/>
+            </w:pPr>
+            <w:r>
+              <w:t>Improvements Made</w:t>
+            </w:r>
+          </w:p>
+        </w:tc>
+      </w:tr>
+      <w:tr>
+        <w:trPr>
+          <w:cnfStyle w:val="000000100000" w:firstRow="0" w:lastRow="0" w:firstColumn="0" w:lastColumn="0" w:oddVBand="0" w:evenVBand="0" w:oddHBand="1" w:evenHBand="0" w:firstRowFirstColumn="0" w:firstRowLastColumn="0" w:lastRowFirstColumn="0" w:lastRowLastColumn="0"/>
+        </w:trPr>
+        <w:tc>
+          <w:tcPr>
+            <w:cnfStyle w:val="001000000000" w:firstRow="0" w:lastRow="0" w:firstColumn="1" w:lastColumn="0" w:oddVBand="0" w:evenVBand="0" w:oddHBand="0" w:evenHBand="0" w:firstRowFirstColumn="0" w:firstRowLastColumn="0" w:lastRowFirstColumn="0" w:lastRowLastColumn="0"/>
+            <w:tcW w:w="0" w:type="auto"/>
+            <w:hideMark/>
+          </w:tcPr>
+          <w:p>
+            <w:pPr>
+              <w:spacing w:after="160" w:line="259" w:lineRule="auto"/>
+            </w:pPr>
+            <w:r>
+              <w:t>assets</w:t>
+            </w:r>
+          </w:p>
+        </w:tc>
+        <w:tc>
+          <w:tcPr>
+            <w:tcW w:w="0" w:type="auto"/>
+            <w:hideMark/>
+          </w:tcPr>
+          <w:p>
+            <w:pPr>
+              <w:spacing w:after="160" w:line="259" w:lineRule="auto"/>
+              <w:cnfStyle w:val="000000100000" w:firstRow="0" w:lastRow="0" w:firstColumn="0" w:lastColumn="0" w:oddVBand="0" w:evenVBand="0" w:oddHBand="1" w:evenHBand="0" w:firstRowFirstColumn="0" w:firstRowLastColumn="0" w:lastRowFirstColumn="0" w:lastRowLastColumn="0"/>
+            </w:pPr>
+            <w:proofErr w:type="spellStart"/>
+            <w:r>
+              <w:t>asset_id</w:t>
+            </w:r>
+            <w:proofErr w:type="spellEnd"/>
+            <w:r>
+              <w:t xml:space="preserve">, symbol, name, </w:t>
+            </w:r>
+            <w:proofErr w:type="spellStart"/>
+            <w:r>
+              <w:t>asset_type</w:t>
+            </w:r>
+            <w:proofErr w:type="spellEnd"/>
+          </w:p>
+        </w:tc>
+        <w:tc>
+          <w:tcPr>
+            <w:tcW w:w="0" w:type="auto"/>
+            <w:hideMark/>
+          </w:tcPr>
+          <w:p>
+            <w:pPr>
+              <w:spacing w:after="160" w:line="259" w:lineRule="auto"/>
+              <w:cnfStyle w:val="000000100000" w:firstRow="0" w:lastRow="0" w:firstColumn="0" w:lastColumn="0" w:oddVBand="0" w:evenVBand="0" w:oddHBand="1" w:evenHBand="0" w:firstRowFirstColumn="0" w:firstRowLastColumn="0" w:lastRowFirstColumn="0" w:lastRowLastColumn="0"/>
+            </w:pPr>
+            <w:r>
+              <w:t xml:space="preserve">PK: </w:t>
+            </w:r>
+            <w:proofErr w:type="spellStart"/>
+            <w:r>
+              <w:t>asset_id</w:t>
+            </w:r>
+            <w:proofErr w:type="spellEnd"/>
+            <w:r>
+              <w:t>, </w:t>
+            </w:r>
+            <w:r>
+              <w:rPr>
+                <w:b/>
+                <w:bCs/>
+              </w:rPr>
+              <w:t>UQ: symbol</w:t>
+            </w:r>
+          </w:p>
+        </w:tc>
+        <w:tc>
+          <w:tcPr>
+            <w:tcW w:w="0" w:type="auto"/>
+            <w:hideMark/>
+          </w:tcPr>
+          <w:p>
+            <w:pPr>
+              <w:spacing w:after="160" w:line="259" w:lineRule="auto"/>
+              <w:cnfStyle w:val="000000100000" w:firstRow="0" w:lastRow="0" w:firstColumn="0" w:lastColumn="0" w:oddVBand="0" w:evenVBand="0" w:oddHBand="1" w:evenHBand="0" w:firstRowFirstColumn="0" w:firstRowLastColumn="0" w:lastRowFirstColumn="0" w:lastRowLastColumn="0"/>
+            </w:pPr>
+            <w:r>
+              <w:t>Added UNIQUE constraint to prevent duplicate symbols.</w:t>
+            </w:r>
+          </w:p>
+        </w:tc>
+      </w:tr>
+      <w:tr>
+        <w:tc>
+          <w:tcPr>
+            <w:cnfStyle w:val="001000000000" w:firstRow="0" w:lastRow="0" w:firstColumn="1" w:lastColumn="0" w:oddVBand="0" w:evenVBand="0" w:oddHBand="0" w:evenHBand="0" w:firstRowFirstColumn="0" w:firstRowLastColumn="0" w:lastRowFirstColumn="0" w:lastRowLastColumn="0"/>
+            <w:tcW w:w="0" w:type="auto"/>
+            <w:hideMark/>
+          </w:tcPr>
+          <w:p>
+            <w:pPr>
+              <w:spacing w:after="160" w:line="259" w:lineRule="auto"/>
+            </w:pPr>
+            <w:r>
+              <w:t>users</w:t>
+            </w:r>
+          </w:p>
+        </w:tc>
+        <w:tc>
+          <w:tcPr>
+            <w:tcW w:w="0" w:type="auto"/>
+            <w:hideMark/>
+          </w:tcPr>
+          <w:p>
+            <w:pPr>
+              <w:spacing w:after="160" w:line="259" w:lineRule="auto"/>
+              <w:cnfStyle w:val="000000000000" w:firstRow="0" w:lastRow="0" w:firstColumn="0" w:lastColumn="0" w:oddVBand="0" w:evenVBand="0" w:oddHBand="0" w:evenHBand="0" w:firstRowFirstColumn="0" w:firstRowLastColumn="0" w:lastRowFirstColumn="0" w:lastRowLastColumn="0"/>
+            </w:pPr>
+            <w:proofErr w:type="spellStart"/>
+            <w:r>
+              <w:t>user_id</w:t>
+            </w:r>
+            <w:proofErr w:type="spellEnd"/>
+            <w:r>
+              <w:t>, username, password, role</w:t>
+            </w:r>
+          </w:p>
+        </w:tc>
+        <w:tc>
+          <w:tcPr>
+            <w:tcW w:w="0" w:type="auto"/>
+            <w:hideMark/>
+          </w:tcPr>
+          <w:p>
+            <w:pPr>
+              <w:spacing w:after="160" w:line="259" w:lineRule="auto"/>
+              <w:cnfStyle w:val="000000000000" w:firstRow="0" w:lastRow="0" w:firstColumn="0" w:lastColumn="0" w:oddVBand="0" w:evenVBand="0" w:oddHBand="0" w:evenHBand="0" w:firstRowFirstColumn="0" w:firstRowLastColumn="0" w:lastRowFirstColumn="0" w:lastRowLastColumn="0"/>
+            </w:pPr>
+            <w:r>
+              <w:t xml:space="preserve">PK </w:t>
+            </w:r>
+            <w:proofErr w:type="spellStart"/>
+            <w:r>
+              <w:t>user_id</w:t>
+            </w:r>
+            <w:proofErr w:type="spellEnd"/>
+            <w:r>
+              <w:t>, </w:t>
+            </w:r>
+            <w:r>
+              <w:rPr>
+                <w:b/>
+                <w:bCs/>
+              </w:rPr>
+              <w:t>UQ: username</w:t>
+            </w:r>
+          </w:p>
+        </w:tc>
+        <w:tc>
+          <w:tcPr>
+            <w:tcW w:w="0" w:type="auto"/>
+            <w:hideMark/>
+          </w:tcPr>
+          <w:p>
+            <w:pPr>
+              <w:spacing w:after="160" w:line="259" w:lineRule="auto"/>
+              <w:cnfStyle w:val="000000000000" w:firstRow="0" w:lastRow="0" w:firstColumn="0" w:lastColumn="0" w:oddVBand="0" w:evenVBand="0" w:oddHBand="0" w:evenHBand="0" w:firstRowFirstColumn="0" w:firstRowLastColumn="0" w:lastRowFirstColumn="0" w:lastRowLastColumn="0"/>
+            </w:pPr>
+            <w:r>
+              <w:t>Added UNIQUE constraint for secure authentication.</w:t>
+            </w:r>
+          </w:p>
+        </w:tc>
+      </w:tr>
+      <w:tr>
+        <w:trPr>
+          <w:cnfStyle w:val="000000100000" w:firstRow="0" w:lastRow="0" w:firstColumn="0" w:lastColumn="0" w:oddVBand="0" w:evenVBand="0" w:oddHBand="1" w:evenHBand="0" w:firstRowFirstColumn="0" w:firstRowLastColumn="0" w:lastRowFirstColumn="0" w:lastRowLastColumn="0"/>
+        </w:trPr>
+        <w:tc>
+          <w:tcPr>
+            <w:cnfStyle w:val="001000000000" w:firstRow="0" w:lastRow="0" w:firstColumn="1" w:lastColumn="0" w:oddVBand="0" w:evenVBand="0" w:oddHBand="0" w:evenHBand="0" w:firstRowFirstColumn="0" w:firstRowLastColumn="0" w:lastRowFirstColumn="0" w:lastRowLastColumn="0"/>
+            <w:tcW w:w="0" w:type="auto"/>
+            <w:hideMark/>
+          </w:tcPr>
+          <w:p>
+            <w:pPr>
+              <w:spacing w:after="160" w:line="259" w:lineRule="auto"/>
+            </w:pPr>
+            <w:hyperlink r:id="rId7" w:history="1">
+              <w:r>
+                <w:rPr>
+                  <w:rStyle w:val="Hyperlink"/>
+                </w:rPr>
+                <w:t>NORMALIZATION.md</w:t>
+              </w:r>
+            </w:hyperlink>
+          </w:p>
+        </w:tc>
+        <w:tc>
+          <w:tcPr>
+            <w:tcW w:w="0" w:type="auto"/>
+            <w:hideMark/>
+          </w:tcPr>
+          <w:p>
+            <w:pPr>
+              <w:spacing w:after="160" w:line="259" w:lineRule="auto"/>
+              <w:cnfStyle w:val="000000100000" w:firstRow="0" w:lastRow="0" w:firstColumn="0" w:lastColumn="0" w:oddVBand="0" w:evenVBand="0" w:oddHBand="1" w:evenHBand="0" w:firstRowFirstColumn="0" w:firstRowLastColumn="0" w:lastRowFirstColumn="0" w:lastRowLastColumn="0"/>
+            </w:pPr>
+            <w:r>
+              <w:t>N/A</w:t>
+            </w:r>
+          </w:p>
+        </w:tc>
+        <w:tc>
+          <w:tcPr>
+            <w:tcW w:w="0" w:type="auto"/>
+            <w:hideMark/>
+          </w:tcPr>
+          <w:p>
+            <w:pPr>
+              <w:spacing w:after="160" w:line="259" w:lineRule="auto"/>
+              <w:cnfStyle w:val="000000100000" w:firstRow="0" w:lastRow="0" w:firstColumn="0" w:lastColumn="0" w:oddVBand="0" w:evenVBand="0" w:oddHBand="1" w:evenHBand="0" w:firstRowFirstColumn="0" w:firstRowLastColumn="0" w:lastRowFirstColumn="0" w:lastRowLastColumn="0"/>
+            </w:pPr>
+            <w:r>
+              <w:t>N/A</w:t>
+            </w:r>
+          </w:p>
+        </w:tc>
+        <w:tc>
+          <w:tcPr>
+            <w:tcW w:w="0" w:type="auto"/>
+            <w:hideMark/>
+          </w:tcPr>
+          <w:p>
+            <w:pPr>
+              <w:spacing w:after="160" w:line="259" w:lineRule="auto"/>
+              <w:cnfStyle w:val="000000100000" w:firstRow="0" w:lastRow="0" w:firstColumn="0" w:lastColumn="0" w:oddVBand="0" w:evenVBand="0" w:oddHBand="1" w:evenHBand="0" w:firstRowFirstColumn="0" w:firstRowLastColumn="0" w:lastRowFirstColumn="0" w:lastRowLastColumn="0"/>
+            </w:pPr>
+            <w:r>
+              <w:t>Created a dedicated report explaining the 3NF logic.</w:t>
+            </w:r>
+          </w:p>
+        </w:tc>
+      </w:tr>
+    </w:tbl>
+    <w:p>
+      <w:pPr>
+        <w:rPr>
+          <w:b/>
+          <w:bCs/>
+          <w:sz w:val="36"/>
+          <w:szCs w:val="36"/>
+        </w:rPr>
+      </w:pPr>
+    </w:p>
+    <w:p>
+      <w:pPr>
+        <w:rPr>
+          <w:b/>
+          <w:bCs/>
+          <w:sz w:val="36"/>
+          <w:szCs w:val="36"/>
+        </w:rPr>
+      </w:pPr>
+      <w:r>
+        <w:rPr>
+          <w:b/>
+          <w:bCs/>
+          <w:sz w:val="36"/>
+          <w:szCs w:val="36"/>
+        </w:rPr>
+        <w:t>Updated ERD Summary</w:t>
+      </w:r>
+    </w:p>
+    <w:p>
+      <w:pPr>
+        <w:pBdr>
+          <w:bottom w:val="single" w:sz="6" w:space="1" w:color="auto"/>
+        </w:pBdr>
+        <w:rPr>
+          <w:i/>
+          <w:iCs/>
+          <w:sz w:val="28"/>
+          <w:szCs w:val="28"/>
+        </w:rPr>
+      </w:pPr>
+      <w:r>
+        <w:rPr>
+          <w:i/>
+          <w:iCs/>
+          <w:sz w:val="28"/>
+          <w:szCs w:val="28"/>
+        </w:rPr>
+        <w:t>The ERD has been updated to reflect the UNIQUE constraints and the relationship cardinalities (</w:t>
+      </w:r>
+      <w:proofErr w:type="gramStart"/>
+      <w:r>
+        <w:rPr>
+          <w:i/>
+          <w:iCs/>
+          <w:sz w:val="28"/>
+          <w:szCs w:val="28"/>
+        </w:rPr>
+        <w:t>1:N</w:t>
+      </w:r>
+      <w:proofErr w:type="gramEnd"/>
+      <w:r>
+        <w:rPr>
+          <w:i/>
+          <w:iCs/>
+          <w:sz w:val="28"/>
+          <w:szCs w:val="28"/>
+        </w:rPr>
+        <w:t>) between assets and </w:t>
+      </w:r>
+      <w:proofErr w:type="spellStart"/>
+      <w:r>
+        <w:rPr>
+          <w:i/>
+          <w:iCs/>
+          <w:sz w:val="28"/>
+          <w:szCs w:val="28"/>
+        </w:rPr>
+        <w:t>price_history</w:t>
+      </w:r>
+      <w:proofErr w:type="spellEnd"/>
+      <w:r>
+        <w:rPr>
+          <w:i/>
+          <w:iCs/>
+          <w:sz w:val="28"/>
+          <w:szCs w:val="28"/>
+        </w:rPr>
+        <w:t>. This ensures that each price record belongs to exactly one specific asset.</w:t>
+      </w:r>
+    </w:p>
+    <w:p>
+      <w:pPr>
+        <w:pBdr>
+          <w:bottom w:val="single" w:sz="6" w:space="1" w:color="auto"/>
+        </w:pBdr>
+        <w:rPr>
+          <w:i/>
+          <w:iCs/>
+          <w:sz w:val="28"/>
+          <w:szCs w:val="28"/>
+        </w:rPr>
+      </w:pPr>
+    </w:p>
+    <w:p>
+      <w:pPr>
+        <w:rPr>
+          <w:i/>
+          <w:iCs/>
+          <w:sz w:val="28"/>
+          <w:szCs w:val="28"/>
+        </w:rPr>
+      </w:pPr>
+    </w:p>
     <w:p/>
     <w:sectPr>
       <w:pgSz w:w="12240" w:h="15840"/>
@@ -2023,6 +2996,155 @@
 <file path=word/numbering.xml><?xml version="1.0" encoding="utf-8"?>
 <w:numbering xmlns:wpc="http://schemas.microsoft.com/office/word/2010/wordprocessingCanvas" xmlns:cx="http://schemas.microsoft.com/office/drawing/2014/chartex" xmlns:cx1="http://schemas.microsoft.com/office/drawing/2015/9/8/chartex" xmlns:cx2="http://schemas.microsoft.com/office/drawing/2015/10/21/chartex" xmlns:cx3="http://schemas.microsoft.com/office/drawing/2016/5/9/chartex" xmlns:cx4="http://schemas.microsoft.com/office/drawing/2016/5/10/chartex" xmlns:cx5="http://schemas.microsoft.com/office/drawing/2016/5/11/chartex" xmlns:cx6="http://schemas.microsoft.com/office/drawing/2016/5/12/chartex" xmlns:cx7="http://schemas.microsoft.com/office/drawing/2016/5/13/chartex" xmlns:cx8="http://schemas.microsoft.com/office/drawing/2016/5/14/chartex" xmlns:mc="http://schemas.openxmlformats.org/markup-compatibility/2006" xmlns:aink="http://schemas.microsoft.com/office/drawing/2016/ink" xmlns:am3d="http://schemas.microsoft.com/office/drawing/2017/model3d" xmlns:o="urn:schemas-microsoft-com:office:office" xmlns:oel="http://schemas.microsoft.com/office/2019/extlst" xmlns:r="http://schemas.openxmlformats.org/officeDocument/2006/relationships" xmlns:m="http://schemas.openxmlformats.org/officeDocument/2006/math" xmlns:v="urn:schemas-microsoft-com:vml" xmlns:wp14="http://schemas.microsoft.com/office/word/2010/wordprocessingDrawing" xmlns:wp="http://schemas.openxmlformats.org/drawingml/2006/wordprocessingDrawing" xmlns:w10="urn:schemas-microsoft-com:office:word" xmlns:w="http://schemas.openxmlformats.org/wordprocessingml/2006/main" xmlns:w14="http://schemas.microsoft.com/office/word/2010/wordml" xmlns:w15="http://schemas.microsoft.com/office/word/2012/wordml" xmlns:w16cex="http://schemas.microsoft.com/office/word/2018/wordml/cex" xmlns:w16cid="http://schemas.microsoft.com/office/word/2016/wordml/cid" xmlns:w16="http://schemas.microsoft.com/office/word/2018/wordml" xmlns:w16du="http://schemas.microsoft.com/office/word/2023/wordml/word16du" xmlns:w16sdtdh="http://schemas.microsoft.com/office/word/2020/wordml/sdtdatahash" xmlns:w16sdtfl="http://schemas.microsoft.com/office/word/2024/wordml/sdtformatlock" xmlns:w16se="http://schemas.microsoft.com/office/word/2015/wordml/symex" xmlns:wpg="http://schemas.microsoft.com/office/word/2010/wordprocessingGroup" xmlns:wpi="http://schemas.microsoft.com/office/word/2010/wordprocessingInk" xmlns:wne="http://schemas.microsoft.com/office/word/2006/wordml" xmlns:wps="http://schemas.microsoft.com/office/word/2010/wordprocessingShape" mc:Ignorable="w14 w15 w16se w16cid w16 w16cex w16sdtdh w16sdtfl w16du wp14">
   <w:abstractNum w:abstractNumId="0" w15:restartNumberingAfterBreak="0">
+    <w:nsid w:val="1FAD7782"/>
+    <w:multiLevelType w:val="multilevel"/>
+    <w:tmpl w:val="1010BB26"/>
+    <w:lvl w:ilvl="0">
+      <w:start w:val="1"/>
+      <w:numFmt w:val="bullet"/>
+      <w:lvlText w:val=""/>
+      <w:lvlJc w:val="left"/>
+      <w:pPr>
+        <w:tabs>
+          <w:tab w:val="num" w:pos="720"/>
+        </w:tabs>
+        <w:ind w:left="720" w:hanging="360"/>
+      </w:pPr>
+      <w:rPr>
+        <w:rFonts w:ascii="Symbol" w:hAnsi="Symbol" w:hint="default"/>
+        <w:sz w:val="20"/>
+      </w:rPr>
+    </w:lvl>
+    <w:lvl w:ilvl="1" w:tentative="1">
+      <w:start w:val="1"/>
+      <w:numFmt w:val="bullet"/>
+      <w:lvlText w:val="o"/>
+      <w:lvlJc w:val="left"/>
+      <w:pPr>
+        <w:tabs>
+          <w:tab w:val="num" w:pos="1440"/>
+        </w:tabs>
+        <w:ind w:left="1440" w:hanging="360"/>
+      </w:pPr>
+      <w:rPr>
+        <w:rFonts w:ascii="Courier New" w:hAnsi="Courier New" w:hint="default"/>
+        <w:sz w:val="20"/>
+      </w:rPr>
+    </w:lvl>
+    <w:lvl w:ilvl="2" w:tentative="1">
+      <w:start w:val="1"/>
+      <w:numFmt w:val="bullet"/>
+      <w:lvlText w:val=""/>
+      <w:lvlJc w:val="left"/>
+      <w:pPr>
+        <w:tabs>
+          <w:tab w:val="num" w:pos="2160"/>
+        </w:tabs>
+        <w:ind w:left="2160" w:hanging="360"/>
+      </w:pPr>
+      <w:rPr>
+        <w:rFonts w:ascii="Wingdings" w:hAnsi="Wingdings" w:hint="default"/>
+        <w:sz w:val="20"/>
+      </w:rPr>
+    </w:lvl>
+    <w:lvl w:ilvl="3" w:tentative="1">
+      <w:start w:val="1"/>
+      <w:numFmt w:val="bullet"/>
+      <w:lvlText w:val=""/>
+      <w:lvlJc w:val="left"/>
+      <w:pPr>
+        <w:tabs>
+          <w:tab w:val="num" w:pos="2880"/>
+        </w:tabs>
+        <w:ind w:left="2880" w:hanging="360"/>
+      </w:pPr>
+      <w:rPr>
+        <w:rFonts w:ascii="Wingdings" w:hAnsi="Wingdings" w:hint="default"/>
+        <w:sz w:val="20"/>
+      </w:rPr>
+    </w:lvl>
+    <w:lvl w:ilvl="4" w:tentative="1">
+      <w:start w:val="1"/>
+      <w:numFmt w:val="bullet"/>
+      <w:lvlText w:val=""/>
+      <w:lvlJc w:val="left"/>
+      <w:pPr>
+        <w:tabs>
+          <w:tab w:val="num" w:pos="3600"/>
+        </w:tabs>
+        <w:ind w:left="3600" w:hanging="360"/>
+      </w:pPr>
+      <w:rPr>
+        <w:rFonts w:ascii="Wingdings" w:hAnsi="Wingdings" w:hint="default"/>
+        <w:sz w:val="20"/>
+      </w:rPr>
+    </w:lvl>
+    <w:lvl w:ilvl="5" w:tentative="1">
+      <w:start w:val="1"/>
+      <w:numFmt w:val="bullet"/>
+      <w:lvlText w:val=""/>
+      <w:lvlJc w:val="left"/>
+      <w:pPr>
+        <w:tabs>
+          <w:tab w:val="num" w:pos="4320"/>
+        </w:tabs>
+        <w:ind w:left="4320" w:hanging="360"/>
+      </w:pPr>
+      <w:rPr>
+        <w:rFonts w:ascii="Wingdings" w:hAnsi="Wingdings" w:hint="default"/>
+        <w:sz w:val="20"/>
+      </w:rPr>
+    </w:lvl>
+    <w:lvl w:ilvl="6" w:tentative="1">
+      <w:start w:val="1"/>
+      <w:numFmt w:val="bullet"/>
+      <w:lvlText w:val=""/>
+      <w:lvlJc w:val="left"/>
+      <w:pPr>
+        <w:tabs>
+          <w:tab w:val="num" w:pos="5040"/>
+        </w:tabs>
+        <w:ind w:left="5040" w:hanging="360"/>
+      </w:pPr>
+      <w:rPr>
+        <w:rFonts w:ascii="Wingdings" w:hAnsi="Wingdings" w:hint="default"/>
+        <w:sz w:val="20"/>
+      </w:rPr>
+    </w:lvl>
+    <w:lvl w:ilvl="7" w:tentative="1">
+      <w:start w:val="1"/>
+      <w:numFmt w:val="bullet"/>
+      <w:lvlText w:val=""/>
+      <w:lvlJc w:val="left"/>
+      <w:pPr>
+        <w:tabs>
+          <w:tab w:val="num" w:pos="5760"/>
+        </w:tabs>
+        <w:ind w:left="5760" w:hanging="360"/>
+      </w:pPr>
+      <w:rPr>
+        <w:rFonts w:ascii="Wingdings" w:hAnsi="Wingdings" w:hint="default"/>
+        <w:sz w:val="20"/>
+      </w:rPr>
+    </w:lvl>
+    <w:lvl w:ilvl="8" w:tentative="1">
+      <w:start w:val="1"/>
+      <w:numFmt w:val="bullet"/>
+      <w:lvlText w:val=""/>
+      <w:lvlJc w:val="left"/>
+      <w:pPr>
+        <w:tabs>
+          <w:tab w:val="num" w:pos="6480"/>
+        </w:tabs>
+        <w:ind w:left="6480" w:hanging="360"/>
+      </w:pPr>
+      <w:rPr>
+        <w:rFonts w:ascii="Wingdings" w:hAnsi="Wingdings" w:hint="default"/>
+        <w:sz w:val="20"/>
+      </w:rPr>
+    </w:lvl>
+  </w:abstractNum>
+  <w:abstractNum w:abstractNumId="1" w15:restartNumberingAfterBreak="0">
     <w:nsid w:val="79E05096"/>
     <w:multiLevelType w:val="multilevel"/>
     <w:tmpl w:val="ADAE6B7A"/>
@@ -2172,6 +3294,9 @@
     </w:lvl>
   </w:abstractNum>
   <w:num w:numId="1" w16cid:durableId="1366784308">
+    <w:abstractNumId w:val="1"/>
+  </w:num>
+  <w:num w:numId="2" w16cid:durableId="253170238">
     <w:abstractNumId w:val="0"/>
   </w:num>
 </w:numbering>
@@ -2575,6 +3700,7 @@
   <w:style w:type="paragraph" w:default="1" w:styleId="Normal">
     <w:name w:val="Normal"/>
     <w:qFormat/>
+    <w:rsid w:val="0000418A"/>
   </w:style>
   <w:style w:type="character" w:default="1" w:styleId="DefaultParagraphFont">
     <w:name w:val="Default Paragraph Font"/>
@@ -3334,6 +4460,704 @@
       <w:tblPr/>
       <w:tcPr>
         <w:shd w:val="clear" w:color="auto" w:fill="BDD6EE" w:themeFill="accent1" w:themeFillTint="66"/>
+      </w:tcPr>
+    </w:tblStylePr>
+  </w:style>
+  <w:style w:type="character" w:styleId="Hyperlink">
+    <w:name w:val="Hyperlink"/>
+    <w:basedOn w:val="DefaultParagraphFont"/>
+    <w:uiPriority w:val="99"/>
+    <w:unhideWhenUsed/>
+    <w:rsid w:val="002522A2"/>
+    <w:rPr>
+      <w:color w:val="0563C1" w:themeColor="hyperlink"/>
+      <w:u w:val="single"/>
+    </w:rPr>
+  </w:style>
+  <w:style w:type="character" w:styleId="UnresolvedMention">
+    <w:name w:val="Unresolved Mention"/>
+    <w:basedOn w:val="DefaultParagraphFont"/>
+    <w:uiPriority w:val="99"/>
+    <w:semiHidden/>
+    <w:unhideWhenUsed/>
+    <w:rsid w:val="002522A2"/>
+    <w:rPr>
+      <w:color w:val="605E5C"/>
+      <w:shd w:val="clear" w:color="auto" w:fill="E1DFDD"/>
+    </w:rPr>
+  </w:style>
+  <w:style w:type="table" w:styleId="PlainTable4">
+    <w:name w:val="Plain Table 4"/>
+    <w:basedOn w:val="TableNormal"/>
+    <w:uiPriority w:val="44"/>
+    <w:rsid w:val="002522A2"/>
+    <w:pPr>
+      <w:spacing w:after="0" w:line="240" w:lineRule="auto"/>
+    </w:pPr>
+    <w:tblPr>
+      <w:tblStyleRowBandSize w:val="1"/>
+      <w:tblStyleColBandSize w:val="1"/>
+    </w:tblPr>
+    <w:tblStylePr w:type="firstRow">
+      <w:rPr>
+        <w:b/>
+        <w:bCs/>
+      </w:rPr>
+    </w:tblStylePr>
+    <w:tblStylePr w:type="lastRow">
+      <w:rPr>
+        <w:b/>
+        <w:bCs/>
+      </w:rPr>
+    </w:tblStylePr>
+    <w:tblStylePr w:type="firstCol">
+      <w:rPr>
+        <w:b/>
+        <w:bCs/>
+      </w:rPr>
+    </w:tblStylePr>
+    <w:tblStylePr w:type="lastCol">
+      <w:rPr>
+        <w:b/>
+        <w:bCs/>
+      </w:rPr>
+    </w:tblStylePr>
+    <w:tblStylePr w:type="band1Vert">
+      <w:tblPr/>
+      <w:tcPr>
+        <w:shd w:val="clear" w:color="auto" w:fill="F2F2F2" w:themeFill="background1" w:themeFillShade="F2"/>
+      </w:tcPr>
+    </w:tblStylePr>
+    <w:tblStylePr w:type="band1Horz">
+      <w:tblPr/>
+      <w:tcPr>
+        <w:shd w:val="clear" w:color="auto" w:fill="F2F2F2" w:themeFill="background1" w:themeFillShade="F2"/>
+      </w:tcPr>
+    </w:tblStylePr>
+  </w:style>
+  <w:style w:type="table" w:styleId="PlainTable5">
+    <w:name w:val="Plain Table 5"/>
+    <w:basedOn w:val="TableNormal"/>
+    <w:uiPriority w:val="45"/>
+    <w:rsid w:val="002522A2"/>
+    <w:pPr>
+      <w:spacing w:after="0" w:line="240" w:lineRule="auto"/>
+    </w:pPr>
+    <w:tblPr>
+      <w:tblStyleRowBandSize w:val="1"/>
+      <w:tblStyleColBandSize w:val="1"/>
+    </w:tblPr>
+    <w:tblStylePr w:type="firstRow">
+      <w:rPr>
+        <w:rFonts w:asciiTheme="majorHAnsi" w:eastAsiaTheme="majorEastAsia" w:hAnsiTheme="majorHAnsi" w:cstheme="majorBidi"/>
+        <w:i/>
+        <w:iCs/>
+        <w:sz w:val="26"/>
+      </w:rPr>
+      <w:tblPr/>
+      <w:tcPr>
+        <w:tcBorders>
+          <w:bottom w:val="single" w:sz="4" w:space="0" w:color="7F7F7F" w:themeColor="text1" w:themeTint="80"/>
+        </w:tcBorders>
+        <w:shd w:val="clear" w:color="auto" w:fill="FFFFFF" w:themeFill="background1"/>
+      </w:tcPr>
+    </w:tblStylePr>
+    <w:tblStylePr w:type="lastRow">
+      <w:rPr>
+        <w:rFonts w:asciiTheme="majorHAnsi" w:eastAsiaTheme="majorEastAsia" w:hAnsiTheme="majorHAnsi" w:cstheme="majorBidi"/>
+        <w:i/>
+        <w:iCs/>
+        <w:sz w:val="26"/>
+      </w:rPr>
+      <w:tblPr/>
+      <w:tcPr>
+        <w:tcBorders>
+          <w:top w:val="single" w:sz="4" w:space="0" w:color="7F7F7F" w:themeColor="text1" w:themeTint="80"/>
+        </w:tcBorders>
+        <w:shd w:val="clear" w:color="auto" w:fill="FFFFFF" w:themeFill="background1"/>
+      </w:tcPr>
+    </w:tblStylePr>
+    <w:tblStylePr w:type="firstCol">
+      <w:pPr>
+        <w:jc w:val="right"/>
+      </w:pPr>
+      <w:rPr>
+        <w:rFonts w:asciiTheme="majorHAnsi" w:eastAsiaTheme="majorEastAsia" w:hAnsiTheme="majorHAnsi" w:cstheme="majorBidi"/>
+        <w:i/>
+        <w:iCs/>
+        <w:sz w:val="26"/>
+      </w:rPr>
+      <w:tblPr/>
+      <w:tcPr>
+        <w:tcBorders>
+          <w:right w:val="single" w:sz="4" w:space="0" w:color="7F7F7F" w:themeColor="text1" w:themeTint="80"/>
+        </w:tcBorders>
+        <w:shd w:val="clear" w:color="auto" w:fill="FFFFFF" w:themeFill="background1"/>
+      </w:tcPr>
+    </w:tblStylePr>
+    <w:tblStylePr w:type="lastCol">
+      <w:rPr>
+        <w:rFonts w:asciiTheme="majorHAnsi" w:eastAsiaTheme="majorEastAsia" w:hAnsiTheme="majorHAnsi" w:cstheme="majorBidi"/>
+        <w:i/>
+        <w:iCs/>
+        <w:sz w:val="26"/>
+      </w:rPr>
+      <w:tblPr/>
+      <w:tcPr>
+        <w:tcBorders>
+          <w:left w:val="single" w:sz="4" w:space="0" w:color="7F7F7F" w:themeColor="text1" w:themeTint="80"/>
+        </w:tcBorders>
+        <w:shd w:val="clear" w:color="auto" w:fill="FFFFFF" w:themeFill="background1"/>
+      </w:tcPr>
+    </w:tblStylePr>
+    <w:tblStylePr w:type="band1Vert">
+      <w:tblPr/>
+      <w:tcPr>
+        <w:shd w:val="clear" w:color="auto" w:fill="F2F2F2" w:themeFill="background1" w:themeFillShade="F2"/>
+      </w:tcPr>
+    </w:tblStylePr>
+    <w:tblStylePr w:type="band1Horz">
+      <w:tblPr/>
+      <w:tcPr>
+        <w:shd w:val="clear" w:color="auto" w:fill="F2F2F2" w:themeFill="background1" w:themeFillShade="F2"/>
+      </w:tcPr>
+    </w:tblStylePr>
+    <w:tblStylePr w:type="neCell">
+      <w:tblPr/>
+      <w:tcPr>
+        <w:tcBorders>
+          <w:left w:val="nil"/>
+        </w:tcBorders>
+      </w:tcPr>
+    </w:tblStylePr>
+    <w:tblStylePr w:type="nwCell">
+      <w:tblPr/>
+      <w:tcPr>
+        <w:tcBorders>
+          <w:right w:val="nil"/>
+        </w:tcBorders>
+      </w:tcPr>
+    </w:tblStylePr>
+    <w:tblStylePr w:type="seCell">
+      <w:tblPr/>
+      <w:tcPr>
+        <w:tcBorders>
+          <w:left w:val="nil"/>
+        </w:tcBorders>
+      </w:tcPr>
+    </w:tblStylePr>
+    <w:tblStylePr w:type="swCell">
+      <w:tblPr/>
+      <w:tcPr>
+        <w:tcBorders>
+          <w:right w:val="nil"/>
+        </w:tcBorders>
+      </w:tcPr>
+    </w:tblStylePr>
+  </w:style>
+  <w:style w:type="table" w:styleId="GridTable5Dark-Accent5">
+    <w:name w:val="Grid Table 5 Dark Accent 5"/>
+    <w:basedOn w:val="TableNormal"/>
+    <w:uiPriority w:val="50"/>
+    <w:rsid w:val="002522A2"/>
+    <w:pPr>
+      <w:spacing w:after="0" w:line="240" w:lineRule="auto"/>
+    </w:pPr>
+    <w:tblPr>
+      <w:tblStyleRowBandSize w:val="1"/>
+      <w:tblStyleColBandSize w:val="1"/>
+      <w:tblBorders>
+        <w:top w:val="single" w:sz="4" w:space="0" w:color="FFFFFF" w:themeColor="background1"/>
+        <w:left w:val="single" w:sz="4" w:space="0" w:color="FFFFFF" w:themeColor="background1"/>
+        <w:bottom w:val="single" w:sz="4" w:space="0" w:color="FFFFFF" w:themeColor="background1"/>
+        <w:right w:val="single" w:sz="4" w:space="0" w:color="FFFFFF" w:themeColor="background1"/>
+        <w:insideH w:val="single" w:sz="4" w:space="0" w:color="FFFFFF" w:themeColor="background1"/>
+        <w:insideV w:val="single" w:sz="4" w:space="0" w:color="FFFFFF" w:themeColor="background1"/>
+      </w:tblBorders>
+    </w:tblPr>
+    <w:tcPr>
+      <w:shd w:val="clear" w:color="auto" w:fill="D9E2F3" w:themeFill="accent5" w:themeFillTint="33"/>
+    </w:tcPr>
+    <w:tblStylePr w:type="firstRow">
+      <w:rPr>
+        <w:b/>
+        <w:bCs/>
+        <w:color w:val="FFFFFF" w:themeColor="background1"/>
+      </w:rPr>
+      <w:tblPr/>
+      <w:tcPr>
+        <w:tcBorders>
+          <w:top w:val="single" w:sz="4" w:space="0" w:color="FFFFFF" w:themeColor="background1"/>
+          <w:left w:val="single" w:sz="4" w:space="0" w:color="FFFFFF" w:themeColor="background1"/>
+          <w:right w:val="single" w:sz="4" w:space="0" w:color="FFFFFF" w:themeColor="background1"/>
+          <w:insideH w:val="nil"/>
+          <w:insideV w:val="nil"/>
+        </w:tcBorders>
+        <w:shd w:val="clear" w:color="auto" w:fill="4472C4" w:themeFill="accent5"/>
+      </w:tcPr>
+    </w:tblStylePr>
+    <w:tblStylePr w:type="lastRow">
+      <w:rPr>
+        <w:b/>
+        <w:bCs/>
+        <w:color w:val="FFFFFF" w:themeColor="background1"/>
+      </w:rPr>
+      <w:tblPr/>
+      <w:tcPr>
+        <w:tcBorders>
+          <w:left w:val="single" w:sz="4" w:space="0" w:color="FFFFFF" w:themeColor="background1"/>
+          <w:bottom w:val="single" w:sz="4" w:space="0" w:color="FFFFFF" w:themeColor="background1"/>
+          <w:right w:val="single" w:sz="4" w:space="0" w:color="FFFFFF" w:themeColor="background1"/>
+          <w:insideH w:val="nil"/>
+          <w:insideV w:val="nil"/>
+        </w:tcBorders>
+        <w:shd w:val="clear" w:color="auto" w:fill="4472C4" w:themeFill="accent5"/>
+      </w:tcPr>
+    </w:tblStylePr>
+    <w:tblStylePr w:type="firstCol">
+      <w:rPr>
+        <w:b/>
+        <w:bCs/>
+        <w:color w:val="FFFFFF" w:themeColor="background1"/>
+      </w:rPr>
+      <w:tblPr/>
+      <w:tcPr>
+        <w:tcBorders>
+          <w:top w:val="single" w:sz="4" w:space="0" w:color="FFFFFF" w:themeColor="background1"/>
+          <w:left w:val="single" w:sz="4" w:space="0" w:color="FFFFFF" w:themeColor="background1"/>
+          <w:bottom w:val="single" w:sz="4" w:space="0" w:color="FFFFFF" w:themeColor="background1"/>
+          <w:insideV w:val="nil"/>
+        </w:tcBorders>
+        <w:shd w:val="clear" w:color="auto" w:fill="4472C4" w:themeFill="accent5"/>
+      </w:tcPr>
+    </w:tblStylePr>
+    <w:tblStylePr w:type="lastCol">
+      <w:rPr>
+        <w:b/>
+        <w:bCs/>
+        <w:color w:val="FFFFFF" w:themeColor="background1"/>
+      </w:rPr>
+      <w:tblPr/>
+      <w:tcPr>
+        <w:tcBorders>
+          <w:top w:val="single" w:sz="4" w:space="0" w:color="FFFFFF" w:themeColor="background1"/>
+          <w:bottom w:val="single" w:sz="4" w:space="0" w:color="FFFFFF" w:themeColor="background1"/>
+          <w:right w:val="single" w:sz="4" w:space="0" w:color="FFFFFF" w:themeColor="background1"/>
+          <w:insideV w:val="nil"/>
+        </w:tcBorders>
+        <w:shd w:val="clear" w:color="auto" w:fill="4472C4" w:themeFill="accent5"/>
+      </w:tcPr>
+    </w:tblStylePr>
+    <w:tblStylePr w:type="band1Vert">
+      <w:tblPr/>
+      <w:tcPr>
+        <w:shd w:val="clear" w:color="auto" w:fill="B4C6E7" w:themeFill="accent5" w:themeFillTint="66"/>
+      </w:tcPr>
+    </w:tblStylePr>
+    <w:tblStylePr w:type="band1Horz">
+      <w:tblPr/>
+      <w:tcPr>
+        <w:shd w:val="clear" w:color="auto" w:fill="B4C6E7" w:themeFill="accent5" w:themeFillTint="66"/>
+      </w:tcPr>
+    </w:tblStylePr>
+  </w:style>
+  <w:style w:type="table" w:styleId="ListTable5Dark-Accent5">
+    <w:name w:val="List Table 5 Dark Accent 5"/>
+    <w:basedOn w:val="TableNormal"/>
+    <w:uiPriority w:val="50"/>
+    <w:rsid w:val="002522A2"/>
+    <w:pPr>
+      <w:spacing w:after="0" w:line="240" w:lineRule="auto"/>
+    </w:pPr>
+    <w:rPr>
+      <w:color w:val="FFFFFF" w:themeColor="background1"/>
+    </w:rPr>
+    <w:tblPr>
+      <w:tblStyleRowBandSize w:val="1"/>
+      <w:tblStyleColBandSize w:val="1"/>
+      <w:tblBorders>
+        <w:top w:val="single" w:sz="24" w:space="0" w:color="4472C4" w:themeColor="accent5"/>
+        <w:left w:val="single" w:sz="24" w:space="0" w:color="4472C4" w:themeColor="accent5"/>
+        <w:bottom w:val="single" w:sz="24" w:space="0" w:color="4472C4" w:themeColor="accent5"/>
+        <w:right w:val="single" w:sz="24" w:space="0" w:color="4472C4" w:themeColor="accent5"/>
+      </w:tblBorders>
+    </w:tblPr>
+    <w:tcPr>
+      <w:shd w:val="clear" w:color="auto" w:fill="4472C4" w:themeFill="accent5"/>
+    </w:tcPr>
+    <w:tblStylePr w:type="firstRow">
+      <w:rPr>
+        <w:b/>
+        <w:bCs/>
+      </w:rPr>
+      <w:tblPr/>
+      <w:tcPr>
+        <w:tcBorders>
+          <w:bottom w:val="single" w:sz="18" w:space="0" w:color="FFFFFF" w:themeColor="background1"/>
+        </w:tcBorders>
+      </w:tcPr>
+    </w:tblStylePr>
+    <w:tblStylePr w:type="lastRow">
+      <w:rPr>
+        <w:b/>
+        <w:bCs/>
+      </w:rPr>
+      <w:tblPr/>
+      <w:tcPr>
+        <w:tcBorders>
+          <w:top w:val="single" w:sz="4" w:space="0" w:color="FFFFFF" w:themeColor="background1"/>
+        </w:tcBorders>
+      </w:tcPr>
+    </w:tblStylePr>
+    <w:tblStylePr w:type="firstCol">
+      <w:rPr>
+        <w:b/>
+        <w:bCs/>
+      </w:rPr>
+      <w:tblPr/>
+      <w:tcPr>
+        <w:tcBorders>
+          <w:right w:val="single" w:sz="4" w:space="0" w:color="FFFFFF" w:themeColor="background1"/>
+        </w:tcBorders>
+      </w:tcPr>
+    </w:tblStylePr>
+    <w:tblStylePr w:type="lastCol">
+      <w:rPr>
+        <w:b/>
+        <w:bCs/>
+      </w:rPr>
+      <w:tblPr/>
+      <w:tcPr>
+        <w:tcBorders>
+          <w:left w:val="single" w:sz="4" w:space="0" w:color="FFFFFF" w:themeColor="background1"/>
+        </w:tcBorders>
+      </w:tcPr>
+    </w:tblStylePr>
+    <w:tblStylePr w:type="band1Vert">
+      <w:tblPr/>
+      <w:tcPr>
+        <w:tcBorders>
+          <w:left w:val="single" w:sz="4" w:space="0" w:color="FFFFFF" w:themeColor="background1"/>
+          <w:right w:val="single" w:sz="4" w:space="0" w:color="FFFFFF" w:themeColor="background1"/>
+        </w:tcBorders>
+      </w:tcPr>
+    </w:tblStylePr>
+    <w:tblStylePr w:type="band2Vert">
+      <w:tblPr/>
+      <w:tcPr>
+        <w:tcBorders>
+          <w:left w:val="single" w:sz="4" w:space="0" w:color="FFFFFF" w:themeColor="background1"/>
+          <w:right w:val="single" w:sz="4" w:space="0" w:color="FFFFFF" w:themeColor="background1"/>
+        </w:tcBorders>
+      </w:tcPr>
+    </w:tblStylePr>
+    <w:tblStylePr w:type="band1Horz">
+      <w:tblPr/>
+      <w:tcPr>
+        <w:tcBorders>
+          <w:top w:val="single" w:sz="4" w:space="0" w:color="FFFFFF" w:themeColor="background1"/>
+          <w:bottom w:val="single" w:sz="4" w:space="0" w:color="FFFFFF" w:themeColor="background1"/>
+        </w:tcBorders>
+      </w:tcPr>
+    </w:tblStylePr>
+    <w:tblStylePr w:type="neCell">
+      <w:tblPr/>
+      <w:tcPr>
+        <w:tcBorders>
+          <w:left w:val="nil"/>
+        </w:tcBorders>
+      </w:tcPr>
+    </w:tblStylePr>
+    <w:tblStylePr w:type="nwCell">
+      <w:tblPr/>
+      <w:tcPr>
+        <w:tcBorders>
+          <w:right w:val="nil"/>
+        </w:tcBorders>
+      </w:tcPr>
+    </w:tblStylePr>
+    <w:tblStylePr w:type="seCell">
+      <w:tblPr/>
+      <w:tcPr>
+        <w:tcBorders>
+          <w:top w:val="nil"/>
+          <w:left w:val="nil"/>
+        </w:tcBorders>
+      </w:tcPr>
+    </w:tblStylePr>
+    <w:tblStylePr w:type="swCell">
+      <w:tblPr/>
+      <w:tcPr>
+        <w:tcBorders>
+          <w:top w:val="nil"/>
+          <w:right w:val="nil"/>
+        </w:tcBorders>
+      </w:tcPr>
+    </w:tblStylePr>
+  </w:style>
+  <w:style w:type="table" w:styleId="ListTable2-Accent5">
+    <w:name w:val="List Table 2 Accent 5"/>
+    <w:basedOn w:val="TableNormal"/>
+    <w:uiPriority w:val="47"/>
+    <w:rsid w:val="002522A2"/>
+    <w:pPr>
+      <w:spacing w:after="0" w:line="240" w:lineRule="auto"/>
+    </w:pPr>
+    <w:tblPr>
+      <w:tblStyleRowBandSize w:val="1"/>
+      <w:tblStyleColBandSize w:val="1"/>
+      <w:tblBorders>
+        <w:top w:val="single" w:sz="4" w:space="0" w:color="8EAADB" w:themeColor="accent5" w:themeTint="99"/>
+        <w:bottom w:val="single" w:sz="4" w:space="0" w:color="8EAADB" w:themeColor="accent5" w:themeTint="99"/>
+        <w:insideH w:val="single" w:sz="4" w:space="0" w:color="8EAADB" w:themeColor="accent5" w:themeTint="99"/>
+      </w:tblBorders>
+    </w:tblPr>
+    <w:tblStylePr w:type="firstRow">
+      <w:rPr>
+        <w:b/>
+        <w:bCs/>
+      </w:rPr>
+    </w:tblStylePr>
+    <w:tblStylePr w:type="lastRow">
+      <w:rPr>
+        <w:b/>
+        <w:bCs/>
+      </w:rPr>
+    </w:tblStylePr>
+    <w:tblStylePr w:type="firstCol">
+      <w:rPr>
+        <w:b/>
+        <w:bCs/>
+      </w:rPr>
+    </w:tblStylePr>
+    <w:tblStylePr w:type="lastCol">
+      <w:rPr>
+        <w:b/>
+        <w:bCs/>
+      </w:rPr>
+    </w:tblStylePr>
+    <w:tblStylePr w:type="band1Vert">
+      <w:tblPr/>
+      <w:tcPr>
+        <w:shd w:val="clear" w:color="auto" w:fill="D9E2F3" w:themeFill="accent5" w:themeFillTint="33"/>
+      </w:tcPr>
+    </w:tblStylePr>
+    <w:tblStylePr w:type="band1Horz">
+      <w:tblPr/>
+      <w:tcPr>
+        <w:shd w:val="clear" w:color="auto" w:fill="D9E2F3" w:themeFill="accent5" w:themeFillTint="33"/>
+      </w:tcPr>
+    </w:tblStylePr>
+  </w:style>
+  <w:style w:type="table" w:styleId="GridTable3-Accent4">
+    <w:name w:val="Grid Table 3 Accent 4"/>
+    <w:basedOn w:val="TableNormal"/>
+    <w:uiPriority w:val="48"/>
+    <w:rsid w:val="002522A2"/>
+    <w:pPr>
+      <w:spacing w:after="0" w:line="240" w:lineRule="auto"/>
+    </w:pPr>
+    <w:tblPr>
+      <w:tblStyleRowBandSize w:val="1"/>
+      <w:tblStyleColBandSize w:val="1"/>
+      <w:tblBorders>
+        <w:top w:val="single" w:sz="4" w:space="0" w:color="FFD966" w:themeColor="accent4" w:themeTint="99"/>
+        <w:left w:val="single" w:sz="4" w:space="0" w:color="FFD966" w:themeColor="accent4" w:themeTint="99"/>
+        <w:bottom w:val="single" w:sz="4" w:space="0" w:color="FFD966" w:themeColor="accent4" w:themeTint="99"/>
+        <w:right w:val="single" w:sz="4" w:space="0" w:color="FFD966" w:themeColor="accent4" w:themeTint="99"/>
+        <w:insideH w:val="single" w:sz="4" w:space="0" w:color="FFD966" w:themeColor="accent4" w:themeTint="99"/>
+        <w:insideV w:val="single" w:sz="4" w:space="0" w:color="FFD966" w:themeColor="accent4" w:themeTint="99"/>
+      </w:tblBorders>
+    </w:tblPr>
+    <w:tblStylePr w:type="firstRow">
+      <w:rPr>
+        <w:b/>
+        <w:bCs/>
+      </w:rPr>
+      <w:tblPr/>
+      <w:tcPr>
+        <w:tcBorders>
+          <w:top w:val="nil"/>
+          <w:left w:val="nil"/>
+          <w:right w:val="nil"/>
+          <w:insideH w:val="nil"/>
+          <w:insideV w:val="nil"/>
+        </w:tcBorders>
+        <w:shd w:val="clear" w:color="auto" w:fill="FFFFFF" w:themeFill="background1"/>
+      </w:tcPr>
+    </w:tblStylePr>
+    <w:tblStylePr w:type="lastRow">
+      <w:rPr>
+        <w:b/>
+        <w:bCs/>
+      </w:rPr>
+      <w:tblPr/>
+      <w:tcPr>
+        <w:tcBorders>
+          <w:left w:val="nil"/>
+          <w:bottom w:val="nil"/>
+          <w:right w:val="nil"/>
+          <w:insideH w:val="nil"/>
+          <w:insideV w:val="nil"/>
+        </w:tcBorders>
+        <w:shd w:val="clear" w:color="auto" w:fill="FFFFFF" w:themeFill="background1"/>
+      </w:tcPr>
+    </w:tblStylePr>
+    <w:tblStylePr w:type="firstCol">
+      <w:pPr>
+        <w:jc w:val="right"/>
+      </w:pPr>
+      <w:rPr>
+        <w:i/>
+        <w:iCs/>
+      </w:rPr>
+      <w:tblPr/>
+      <w:tcPr>
+        <w:tcBorders>
+          <w:top w:val="nil"/>
+          <w:left w:val="nil"/>
+          <w:bottom w:val="nil"/>
+          <w:insideH w:val="nil"/>
+          <w:insideV w:val="nil"/>
+        </w:tcBorders>
+        <w:shd w:val="clear" w:color="auto" w:fill="FFFFFF" w:themeFill="background1"/>
+      </w:tcPr>
+    </w:tblStylePr>
+    <w:tblStylePr w:type="lastCol">
+      <w:rPr>
+        <w:i/>
+        <w:iCs/>
+      </w:rPr>
+      <w:tblPr/>
+      <w:tcPr>
+        <w:tcBorders>
+          <w:top w:val="nil"/>
+          <w:bottom w:val="nil"/>
+          <w:right w:val="nil"/>
+          <w:insideH w:val="nil"/>
+          <w:insideV w:val="nil"/>
+        </w:tcBorders>
+        <w:shd w:val="clear" w:color="auto" w:fill="FFFFFF" w:themeFill="background1"/>
+      </w:tcPr>
+    </w:tblStylePr>
+    <w:tblStylePr w:type="band1Vert">
+      <w:tblPr/>
+      <w:tcPr>
+        <w:shd w:val="clear" w:color="auto" w:fill="FFF2CC" w:themeFill="accent4" w:themeFillTint="33"/>
+      </w:tcPr>
+    </w:tblStylePr>
+    <w:tblStylePr w:type="band1Horz">
+      <w:tblPr/>
+      <w:tcPr>
+        <w:shd w:val="clear" w:color="auto" w:fill="FFF2CC" w:themeFill="accent4" w:themeFillTint="33"/>
+      </w:tcPr>
+    </w:tblStylePr>
+    <w:tblStylePr w:type="neCell">
+      <w:tblPr/>
+      <w:tcPr>
+        <w:tcBorders>
+          <w:bottom w:val="single" w:sz="4" w:space="0" w:color="FFD966" w:themeColor="accent4" w:themeTint="99"/>
+        </w:tcBorders>
+      </w:tcPr>
+    </w:tblStylePr>
+    <w:tblStylePr w:type="nwCell">
+      <w:tblPr/>
+      <w:tcPr>
+        <w:tcBorders>
+          <w:bottom w:val="single" w:sz="4" w:space="0" w:color="FFD966" w:themeColor="accent4" w:themeTint="99"/>
+        </w:tcBorders>
+      </w:tcPr>
+    </w:tblStylePr>
+    <w:tblStylePr w:type="seCell">
+      <w:tblPr/>
+      <w:tcPr>
+        <w:tcBorders>
+          <w:top w:val="single" w:sz="4" w:space="0" w:color="FFD966" w:themeColor="accent4" w:themeTint="99"/>
+        </w:tcBorders>
+      </w:tcPr>
+    </w:tblStylePr>
+    <w:tblStylePr w:type="swCell">
+      <w:tblPr/>
+      <w:tcPr>
+        <w:tcBorders>
+          <w:top w:val="single" w:sz="4" w:space="0" w:color="FFD966" w:themeColor="accent4" w:themeTint="99"/>
+        </w:tcBorders>
+      </w:tcPr>
+    </w:tblStylePr>
+  </w:style>
+  <w:style w:type="table" w:styleId="GridTable4-Accent1">
+    <w:name w:val="Grid Table 4 Accent 1"/>
+    <w:basedOn w:val="TableNormal"/>
+    <w:uiPriority w:val="49"/>
+    <w:rsid w:val="002522A2"/>
+    <w:pPr>
+      <w:spacing w:after="0" w:line="240" w:lineRule="auto"/>
+    </w:pPr>
+    <w:tblPr>
+      <w:tblStyleRowBandSize w:val="1"/>
+      <w:tblStyleColBandSize w:val="1"/>
+      <w:tblBorders>
+        <w:top w:val="single" w:sz="4" w:space="0" w:color="9CC2E5" w:themeColor="accent1" w:themeTint="99"/>
+        <w:left w:val="single" w:sz="4" w:space="0" w:color="9CC2E5" w:themeColor="accent1" w:themeTint="99"/>
+        <w:bottom w:val="single" w:sz="4" w:space="0" w:color="9CC2E5" w:themeColor="accent1" w:themeTint="99"/>
+        <w:right w:val="single" w:sz="4" w:space="0" w:color="9CC2E5" w:themeColor="accent1" w:themeTint="99"/>
+        <w:insideH w:val="single" w:sz="4" w:space="0" w:color="9CC2E5" w:themeColor="accent1" w:themeTint="99"/>
+        <w:insideV w:val="single" w:sz="4" w:space="0" w:color="9CC2E5" w:themeColor="accent1" w:themeTint="99"/>
+      </w:tblBorders>
+    </w:tblPr>
+    <w:tblStylePr w:type="firstRow">
+      <w:rPr>
+        <w:b/>
+        <w:bCs/>
+        <w:color w:val="FFFFFF" w:themeColor="background1"/>
+      </w:rPr>
+      <w:tblPr/>
+      <w:tcPr>
+        <w:tcBorders>
+          <w:top w:val="single" w:sz="4" w:space="0" w:color="5B9BD5" w:themeColor="accent1"/>
+          <w:left w:val="single" w:sz="4" w:space="0" w:color="5B9BD5" w:themeColor="accent1"/>
+          <w:bottom w:val="single" w:sz="4" w:space="0" w:color="5B9BD5" w:themeColor="accent1"/>
+          <w:right w:val="single" w:sz="4" w:space="0" w:color="5B9BD5" w:themeColor="accent1"/>
+          <w:insideH w:val="nil"/>
+          <w:insideV w:val="nil"/>
+        </w:tcBorders>
+        <w:shd w:val="clear" w:color="auto" w:fill="5B9BD5" w:themeFill="accent1"/>
+      </w:tcPr>
+    </w:tblStylePr>
+    <w:tblStylePr w:type="lastRow">
+      <w:rPr>
+        <w:b/>
+        <w:bCs/>
+      </w:rPr>
+      <w:tblPr/>
+      <w:tcPr>
+        <w:tcBorders>
+          <w:top w:val="double" w:sz="4" w:space="0" w:color="5B9BD5" w:themeColor="accent1"/>
+        </w:tcBorders>
+      </w:tcPr>
+    </w:tblStylePr>
+    <w:tblStylePr w:type="firstCol">
+      <w:rPr>
+        <w:b/>
+        <w:bCs/>
+      </w:rPr>
+    </w:tblStylePr>
+    <w:tblStylePr w:type="lastCol">
+      <w:rPr>
+        <w:b/>
+        <w:bCs/>
+      </w:rPr>
+    </w:tblStylePr>
+    <w:tblStylePr w:type="band1Vert">
+      <w:tblPr/>
+      <w:tcPr>
+        <w:shd w:val="clear" w:color="auto" w:fill="DEEAF6" w:themeFill="accent1" w:themeFillTint="33"/>
+      </w:tcPr>
+    </w:tblStylePr>
+    <w:tblStylePr w:type="band1Horz">
+      <w:tblPr/>
+      <w:tcPr>
+        <w:shd w:val="clear" w:color="auto" w:fill="DEEAF6" w:themeFill="accent1" w:themeFillTint="33"/>
       </w:tcPr>
     </w:tblStylePr>
   </w:style>

</xml_diff>

<commit_message>
added milestone 3 dataflow and preprocessing details to version control doc
</commit_message>
<xml_diff>
--- a/Crypto & Stock Anomaly Detection System - Version Control Document.docx
+++ b/Crypto & Stock Anomaly Detection System - Version Control Document.docx
@@ -2974,6 +2974,733 @@
     </w:p>
     <w:p>
       <w:pPr>
+        <w:jc w:val="center"/>
+        <w:rPr>
+          <w:rFonts w:asciiTheme="majorBidi" w:hAnsiTheme="majorBidi" w:cstheme="majorBidi"/>
+          <w:b/>
+          <w:bCs/>
+          <w:sz w:val="56"/>
+          <w:szCs w:val="56"/>
+        </w:rPr>
+      </w:pPr>
+    </w:p>
+    <w:p>
+      <w:pPr>
+        <w:jc w:val="center"/>
+        <w:rPr>
+          <w:rFonts w:asciiTheme="majorBidi" w:hAnsiTheme="majorBidi" w:cstheme="majorBidi"/>
+          <w:b/>
+          <w:bCs/>
+          <w:sz w:val="72"/>
+          <w:szCs w:val="72"/>
+        </w:rPr>
+      </w:pPr>
+      <w:r>
+        <w:rPr>
+          <w:rFonts w:asciiTheme="majorBidi" w:hAnsiTheme="majorBidi" w:cstheme="majorBidi"/>
+          <w:b/>
+          <w:bCs/>
+          <w:sz w:val="72"/>
+          <w:szCs w:val="72"/>
+        </w:rPr>
+        <w:lastRenderedPageBreak/>
+        <w:t xml:space="preserve">Milestone </w:t>
+      </w:r>
+      <w:r>
+        <w:rPr>
+          <w:rFonts w:asciiTheme="majorBidi" w:hAnsiTheme="majorBidi" w:cstheme="majorBidi"/>
+          <w:b/>
+          <w:bCs/>
+          <w:sz w:val="72"/>
+          <w:szCs w:val="72"/>
+        </w:rPr>
+        <w:t xml:space="preserve">3 </w:t>
+      </w:r>
+    </w:p>
+    <w:p>
+      <w:pPr>
+        <w:jc w:val="center"/>
+        <w:rPr>
+          <w:rFonts w:asciiTheme="majorBidi" w:hAnsiTheme="majorBidi" w:cstheme="majorBidi"/>
+          <w:b/>
+          <w:bCs/>
+          <w:sz w:val="48"/>
+          <w:szCs w:val="48"/>
+        </w:rPr>
+      </w:pPr>
+      <w:r>
+        <w:rPr>
+          <w:rFonts w:asciiTheme="majorBidi" w:hAnsiTheme="majorBidi" w:cstheme="majorBidi"/>
+          <w:b/>
+          <w:bCs/>
+          <w:sz w:val="48"/>
+          <w:szCs w:val="48"/>
+        </w:rPr>
+        <w:t>Dataset Preprocessing &amp; Dataflow</w:t>
+      </w:r>
+    </w:p>
+    <w:p>
+      <w:pPr>
+        <w:jc w:val="center"/>
+        <w:rPr>
+          <w:rFonts w:asciiTheme="majorBidi" w:hAnsiTheme="majorBidi" w:cstheme="majorBidi"/>
+          <w:b/>
+          <w:bCs/>
+          <w:sz w:val="48"/>
+          <w:szCs w:val="48"/>
+        </w:rPr>
+      </w:pPr>
+    </w:p>
+    <w:p>
+      <w:pPr>
+        <w:rPr>
+          <w:b/>
+          <w:bCs/>
+          <w:sz w:val="32"/>
+          <w:szCs w:val="32"/>
+        </w:rPr>
+      </w:pPr>
+      <w:r>
+        <w:rPr>
+          <w:b/>
+          <w:bCs/>
+          <w:sz w:val="32"/>
+          <w:szCs w:val="32"/>
+        </w:rPr>
+        <w:t>Dataflow Description</w:t>
+      </w:r>
+    </w:p>
+    <w:p>
+      <w:pPr>
+        <w:rPr>
+          <w:sz w:val="28"/>
+          <w:szCs w:val="28"/>
+        </w:rPr>
+      </w:pPr>
+      <w:r>
+        <w:rPr>
+          <w:sz w:val="28"/>
+          <w:szCs w:val="28"/>
+        </w:rPr>
+        <w:t>The system implements an automated pipeline to handle real-time financial data.</w:t>
+      </w:r>
+    </w:p>
+    <w:p>
+      <w:pPr>
+        <w:numPr>
+          <w:ilvl w:val="0"/>
+          <w:numId w:val="3"/>
+        </w:numPr>
+        <w:rPr>
+          <w:sz w:val="28"/>
+          <w:szCs w:val="28"/>
+        </w:rPr>
+      </w:pPr>
+      <w:r>
+        <w:rPr>
+          <w:b/>
+          <w:bCs/>
+          <w:sz w:val="28"/>
+          <w:szCs w:val="28"/>
+        </w:rPr>
+        <w:t>Ingestion:</w:t>
+      </w:r>
+      <w:r>
+        <w:rPr>
+          <w:sz w:val="28"/>
+          <w:szCs w:val="28"/>
+        </w:rPr>
+        <w:t> Python scripts fetch live data from </w:t>
+      </w:r>
+      <w:proofErr w:type="spellStart"/>
+      <w:r>
+        <w:rPr>
+          <w:b/>
+          <w:bCs/>
+          <w:sz w:val="28"/>
+          <w:szCs w:val="28"/>
+        </w:rPr>
+        <w:t>CoinGecko</w:t>
+      </w:r>
+      <w:proofErr w:type="spellEnd"/>
+      <w:r>
+        <w:rPr>
+          <w:b/>
+          <w:bCs/>
+          <w:sz w:val="28"/>
+          <w:szCs w:val="28"/>
+        </w:rPr>
+        <w:t xml:space="preserve"> (Crypto)</w:t>
+      </w:r>
+      <w:r>
+        <w:rPr>
+          <w:sz w:val="28"/>
+          <w:szCs w:val="28"/>
+        </w:rPr>
+        <w:t> and </w:t>
+      </w:r>
+      <w:r>
+        <w:rPr>
+          <w:b/>
+          <w:bCs/>
+          <w:sz w:val="28"/>
+          <w:szCs w:val="28"/>
+        </w:rPr>
+        <w:t>Yahoo Finance (Stocks)</w:t>
+      </w:r>
+      <w:r>
+        <w:rPr>
+          <w:sz w:val="28"/>
+          <w:szCs w:val="28"/>
+        </w:rPr>
+        <w:t>.</w:t>
+      </w:r>
+    </w:p>
+    <w:p>
+      <w:pPr>
+        <w:numPr>
+          <w:ilvl w:val="0"/>
+          <w:numId w:val="3"/>
+        </w:numPr>
+        <w:rPr>
+          <w:sz w:val="28"/>
+          <w:szCs w:val="28"/>
+        </w:rPr>
+      </w:pPr>
+      <w:r>
+        <w:rPr>
+          <w:b/>
+          <w:bCs/>
+          <w:sz w:val="28"/>
+          <w:szCs w:val="28"/>
+        </w:rPr>
+        <w:t>Preprocessing:</w:t>
+      </w:r>
+      <w:r>
+        <w:rPr>
+          <w:sz w:val="28"/>
+          <w:szCs w:val="28"/>
+        </w:rPr>
+        <w:t> Data is cleaned using the Python Pandas library to standardize timestamps (YYYY-MM-DD HH:</w:t>
+      </w:r>
+      <w:proofErr w:type="gramStart"/>
+      <w:r>
+        <w:rPr>
+          <w:sz w:val="28"/>
+          <w:szCs w:val="28"/>
+        </w:rPr>
+        <w:t>MM:SS</w:t>
+      </w:r>
+      <w:proofErr w:type="gramEnd"/>
+      <w:r>
+        <w:rPr>
+          <w:sz w:val="28"/>
+          <w:szCs w:val="28"/>
+        </w:rPr>
+        <w:t>) and handle missing values.</w:t>
+      </w:r>
+    </w:p>
+    <w:p>
+      <w:pPr>
+        <w:numPr>
+          <w:ilvl w:val="0"/>
+          <w:numId w:val="3"/>
+        </w:numPr>
+      </w:pPr>
+      <w:r>
+        <w:rPr>
+          <w:b/>
+          <w:bCs/>
+          <w:sz w:val="28"/>
+          <w:szCs w:val="28"/>
+        </w:rPr>
+        <w:t>Storage:</w:t>
+      </w:r>
+      <w:r>
+        <w:rPr>
+          <w:sz w:val="28"/>
+          <w:szCs w:val="28"/>
+        </w:rPr>
+        <w:t> The cleaned data is converted into CSV files for initial database population</w:t>
+      </w:r>
+      <w:r>
+        <w:t>.</w:t>
+      </w:r>
+    </w:p>
+    <w:p>
+      <w:pPr>
+        <w:ind w:left="720"/>
+      </w:pPr>
+    </w:p>
+    <w:p>
+      <w:pPr>
+        <w:rPr>
+          <w:b/>
+          <w:bCs/>
+          <w:sz w:val="40"/>
+          <w:szCs w:val="40"/>
+        </w:rPr>
+      </w:pPr>
+      <w:r>
+        <w:rPr>
+          <w:b/>
+          <w:bCs/>
+          <w:sz w:val="40"/>
+          <w:szCs w:val="40"/>
+        </w:rPr>
+        <w:t>Preprocessing Summary</w:t>
+      </w:r>
+    </w:p>
+    <w:tbl>
+      <w:tblPr>
+        <w:tblStyle w:val="GridTable5Dark-Accent6"/>
+        <w:tblW w:w="0" w:type="auto"/>
+        <w:tblLook w:val="04A0" w:firstRow="1" w:lastRow="0" w:firstColumn="1" w:lastColumn="0" w:noHBand="0" w:noVBand="1"/>
+      </w:tblPr>
+      <w:tblGrid>
+        <w:gridCol w:w="1677"/>
+        <w:gridCol w:w="2815"/>
+        <w:gridCol w:w="1790"/>
+        <w:gridCol w:w="1723"/>
+      </w:tblGrid>
+      <w:tr>
+        <w:trPr>
+          <w:cnfStyle w:val="100000000000" w:firstRow="1" w:lastRow="0" w:firstColumn="0" w:lastColumn="0" w:oddVBand="0" w:evenVBand="0" w:oddHBand="0" w:evenHBand="0" w:firstRowFirstColumn="0" w:firstRowLastColumn="0" w:lastRowFirstColumn="0" w:lastRowLastColumn="0"/>
+        </w:trPr>
+        <w:tc>
+          <w:tcPr>
+            <w:cnfStyle w:val="001000000000" w:firstRow="0" w:lastRow="0" w:firstColumn="1" w:lastColumn="0" w:oddVBand="0" w:evenVBand="0" w:oddHBand="0" w:evenHBand="0" w:firstRowFirstColumn="0" w:firstRowLastColumn="0" w:lastRowFirstColumn="0" w:lastRowLastColumn="0"/>
+            <w:tcW w:w="0" w:type="auto"/>
+            <w:hideMark/>
+          </w:tcPr>
+          <w:p>
+            <w:pPr>
+              <w:spacing w:after="160" w:line="259" w:lineRule="auto"/>
+            </w:pPr>
+            <w:r>
+              <w:t>Data Source</w:t>
+            </w:r>
+          </w:p>
+        </w:tc>
+        <w:tc>
+          <w:tcPr>
+            <w:tcW w:w="0" w:type="auto"/>
+            <w:hideMark/>
+          </w:tcPr>
+          <w:p>
+            <w:pPr>
+              <w:spacing w:after="160" w:line="259" w:lineRule="auto"/>
+              <w:cnfStyle w:val="100000000000" w:firstRow="1" w:lastRow="0" w:firstColumn="0" w:lastColumn="0" w:oddVBand="0" w:evenVBand="0" w:oddHBand="0" w:evenHBand="0" w:firstRowFirstColumn="0" w:firstRowLastColumn="0" w:lastRowFirstColumn="0" w:lastRowLastColumn="0"/>
+            </w:pPr>
+            <w:r>
+              <w:t>Cleaning Step</w:t>
+            </w:r>
+          </w:p>
+        </w:tc>
+        <w:tc>
+          <w:tcPr>
+            <w:tcW w:w="0" w:type="auto"/>
+            <w:hideMark/>
+          </w:tcPr>
+          <w:p>
+            <w:pPr>
+              <w:spacing w:after="160" w:line="259" w:lineRule="auto"/>
+              <w:cnfStyle w:val="100000000000" w:firstRow="1" w:lastRow="0" w:firstColumn="0" w:lastColumn="0" w:oddVBand="0" w:evenVBand="0" w:oddHBand="0" w:evenHBand="0" w:firstRowFirstColumn="0" w:firstRowLastColumn="0" w:lastRowFirstColumn="0" w:lastRowLastColumn="0"/>
+            </w:pPr>
+            <w:r>
+              <w:t>Tool Used</w:t>
+            </w:r>
+          </w:p>
+        </w:tc>
+        <w:tc>
+          <w:tcPr>
+            <w:tcW w:w="0" w:type="auto"/>
+            <w:hideMark/>
+          </w:tcPr>
+          <w:p>
+            <w:pPr>
+              <w:spacing w:after="160" w:line="259" w:lineRule="auto"/>
+              <w:cnfStyle w:val="100000000000" w:firstRow="1" w:lastRow="0" w:firstColumn="0" w:lastColumn="0" w:oddVBand="0" w:evenVBand="0" w:oddHBand="0" w:evenHBand="0" w:firstRowFirstColumn="0" w:firstRowLastColumn="0" w:lastRowFirstColumn="0" w:lastRowLastColumn="0"/>
+            </w:pPr>
+            <w:r>
+              <w:t>Output</w:t>
+            </w:r>
+          </w:p>
+        </w:tc>
+      </w:tr>
+      <w:tr>
+        <w:trPr>
+          <w:cnfStyle w:val="000000100000" w:firstRow="0" w:lastRow="0" w:firstColumn="0" w:lastColumn="0" w:oddVBand="0" w:evenVBand="0" w:oddHBand="1" w:evenHBand="0" w:firstRowFirstColumn="0" w:firstRowLastColumn="0" w:lastRowFirstColumn="0" w:lastRowLastColumn="0"/>
+        </w:trPr>
+        <w:tc>
+          <w:tcPr>
+            <w:cnfStyle w:val="001000000000" w:firstRow="0" w:lastRow="0" w:firstColumn="1" w:lastColumn="0" w:oddVBand="0" w:evenVBand="0" w:oddHBand="0" w:evenHBand="0" w:firstRowFirstColumn="0" w:firstRowLastColumn="0" w:lastRowFirstColumn="0" w:lastRowLastColumn="0"/>
+            <w:tcW w:w="0" w:type="auto"/>
+            <w:hideMark/>
+          </w:tcPr>
+          <w:p>
+            <w:pPr>
+              <w:spacing w:after="160" w:line="259" w:lineRule="auto"/>
+            </w:pPr>
+            <w:proofErr w:type="spellStart"/>
+            <w:r>
+              <w:t>CoinGecko</w:t>
+            </w:r>
+            <w:proofErr w:type="spellEnd"/>
+            <w:r>
+              <w:t xml:space="preserve"> API</w:t>
+            </w:r>
+          </w:p>
+        </w:tc>
+        <w:tc>
+          <w:tcPr>
+            <w:tcW w:w="0" w:type="auto"/>
+            <w:hideMark/>
+          </w:tcPr>
+          <w:p>
+            <w:pPr>
+              <w:spacing w:after="160" w:line="259" w:lineRule="auto"/>
+              <w:cnfStyle w:val="000000100000" w:firstRow="0" w:lastRow="0" w:firstColumn="0" w:lastColumn="0" w:oddVBand="0" w:evenVBand="0" w:oddHBand="1" w:evenHBand="0" w:firstRowFirstColumn="0" w:firstRowLastColumn="0" w:lastRowFirstColumn="0" w:lastRowLastColumn="0"/>
+            </w:pPr>
+            <w:r>
+              <w:t>Timestamp UTC conversion</w:t>
+            </w:r>
+          </w:p>
+        </w:tc>
+        <w:tc>
+          <w:tcPr>
+            <w:tcW w:w="0" w:type="auto"/>
+            <w:hideMark/>
+          </w:tcPr>
+          <w:p>
+            <w:pPr>
+              <w:spacing w:after="160" w:line="259" w:lineRule="auto"/>
+              <w:cnfStyle w:val="000000100000" w:firstRow="0" w:lastRow="0" w:firstColumn="0" w:lastColumn="0" w:oddVBand="0" w:evenVBand="0" w:oddHBand="1" w:evenHBand="0" w:firstRowFirstColumn="0" w:firstRowLastColumn="0" w:lastRowFirstColumn="0" w:lastRowLastColumn="0"/>
+            </w:pPr>
+            <w:r>
+              <w:t>Python (Pandas)</w:t>
+            </w:r>
+          </w:p>
+        </w:tc>
+        <w:tc>
+          <w:tcPr>
+            <w:tcW w:w="0" w:type="auto"/>
+            <w:hideMark/>
+          </w:tcPr>
+          <w:p>
+            <w:pPr>
+              <w:spacing w:after="160" w:line="259" w:lineRule="auto"/>
+              <w:cnfStyle w:val="000000100000" w:firstRow="0" w:lastRow="0" w:firstColumn="0" w:lastColumn="0" w:oddVBand="0" w:evenVBand="0" w:oddHBand="1" w:evenHBand="0" w:firstRowFirstColumn="0" w:firstRowLastColumn="0" w:lastRowFirstColumn="0" w:lastRowLastColumn="0"/>
+            </w:pPr>
+            <w:r>
+              <w:t>price_history.csv</w:t>
+            </w:r>
+          </w:p>
+        </w:tc>
+      </w:tr>
+      <w:tr>
+        <w:tc>
+          <w:tcPr>
+            <w:cnfStyle w:val="001000000000" w:firstRow="0" w:lastRow="0" w:firstColumn="1" w:lastColumn="0" w:oddVBand="0" w:evenVBand="0" w:oddHBand="0" w:evenHBand="0" w:firstRowFirstColumn="0" w:firstRowLastColumn="0" w:lastRowFirstColumn="0" w:lastRowLastColumn="0"/>
+            <w:tcW w:w="0" w:type="auto"/>
+            <w:hideMark/>
+          </w:tcPr>
+          <w:p>
+            <w:pPr>
+              <w:spacing w:after="160" w:line="259" w:lineRule="auto"/>
+            </w:pPr>
+            <w:r>
+              <w:t>Yahoo Finance</w:t>
+            </w:r>
+          </w:p>
+        </w:tc>
+        <w:tc>
+          <w:tcPr>
+            <w:tcW w:w="0" w:type="auto"/>
+            <w:hideMark/>
+          </w:tcPr>
+          <w:p>
+            <w:pPr>
+              <w:spacing w:after="160" w:line="259" w:lineRule="auto"/>
+              <w:cnfStyle w:val="000000000000" w:firstRow="0" w:lastRow="0" w:firstColumn="0" w:lastColumn="0" w:oddVBand="0" w:evenVBand="0" w:oddHBand="0" w:evenHBand="0" w:firstRowFirstColumn="0" w:firstRowLastColumn="0" w:lastRowFirstColumn="0" w:lastRowLastColumn="0"/>
+            </w:pPr>
+            <w:r>
+              <w:t xml:space="preserve">Removing </w:t>
+            </w:r>
+            <w:proofErr w:type="spellStart"/>
+            <w:r>
+              <w:t>timezone</w:t>
+            </w:r>
+            <w:proofErr w:type="spellEnd"/>
+            <w:r>
+              <w:t xml:space="preserve"> offsets</w:t>
+            </w:r>
+          </w:p>
+        </w:tc>
+        <w:tc>
+          <w:tcPr>
+            <w:tcW w:w="0" w:type="auto"/>
+            <w:hideMark/>
+          </w:tcPr>
+          <w:p>
+            <w:pPr>
+              <w:spacing w:after="160" w:line="259" w:lineRule="auto"/>
+              <w:cnfStyle w:val="000000000000" w:firstRow="0" w:lastRow="0" w:firstColumn="0" w:lastColumn="0" w:oddVBand="0" w:evenVBand="0" w:oddHBand="0" w:evenHBand="0" w:firstRowFirstColumn="0" w:firstRowLastColumn="0" w:lastRowFirstColumn="0" w:lastRowLastColumn="0"/>
+            </w:pPr>
+            <w:r>
+              <w:t>Python (</w:t>
+            </w:r>
+            <w:proofErr w:type="spellStart"/>
+            <w:r>
+              <w:t>yfinance</w:t>
+            </w:r>
+            <w:proofErr w:type="spellEnd"/>
+            <w:r>
+              <w:t>)</w:t>
+            </w:r>
+          </w:p>
+        </w:tc>
+        <w:tc>
+          <w:tcPr>
+            <w:tcW w:w="0" w:type="auto"/>
+            <w:hideMark/>
+          </w:tcPr>
+          <w:p>
+            <w:pPr>
+              <w:spacing w:after="160" w:line="259" w:lineRule="auto"/>
+              <w:cnfStyle w:val="000000000000" w:firstRow="0" w:lastRow="0" w:firstColumn="0" w:lastColumn="0" w:oddVBand="0" w:evenVBand="0" w:oddHBand="0" w:evenHBand="0" w:firstRowFirstColumn="0" w:firstRowLastColumn="0" w:lastRowFirstColumn="0" w:lastRowLastColumn="0"/>
+            </w:pPr>
+            <w:r>
+              <w:t>price_history.csv</w:t>
+            </w:r>
+          </w:p>
+        </w:tc>
+      </w:tr>
+      <w:tr>
+        <w:trPr>
+          <w:cnfStyle w:val="000000100000" w:firstRow="0" w:lastRow="0" w:firstColumn="0" w:lastColumn="0" w:oddVBand="0" w:evenVBand="0" w:oddHBand="1" w:evenHBand="0" w:firstRowFirstColumn="0" w:firstRowLastColumn="0" w:lastRowFirstColumn="0" w:lastRowLastColumn="0"/>
+        </w:trPr>
+        <w:tc>
+          <w:tcPr>
+            <w:cnfStyle w:val="001000000000" w:firstRow="0" w:lastRow="0" w:firstColumn="1" w:lastColumn="0" w:oddVBand="0" w:evenVBand="0" w:oddHBand="0" w:evenHBand="0" w:firstRowFirstColumn="0" w:firstRowLastColumn="0" w:lastRowFirstColumn="0" w:lastRowLastColumn="0"/>
+            <w:tcW w:w="0" w:type="auto"/>
+            <w:hideMark/>
+          </w:tcPr>
+          <w:p>
+            <w:pPr>
+              <w:spacing w:after="160" w:line="259" w:lineRule="auto"/>
+            </w:pPr>
+            <w:r>
+              <w:t>Static Metadata</w:t>
+            </w:r>
+          </w:p>
+        </w:tc>
+        <w:tc>
+          <w:tcPr>
+            <w:tcW w:w="0" w:type="auto"/>
+            <w:hideMark/>
+          </w:tcPr>
+          <w:p>
+            <w:pPr>
+              <w:spacing w:after="160" w:line="259" w:lineRule="auto"/>
+              <w:cnfStyle w:val="000000100000" w:firstRow="0" w:lastRow="0" w:firstColumn="0" w:lastColumn="0" w:oddVBand="0" w:evenVBand="0" w:oddHBand="1" w:evenHBand="0" w:firstRowFirstColumn="0" w:firstRowLastColumn="0" w:lastRowFirstColumn="0" w:lastRowLastColumn="0"/>
+            </w:pPr>
+            <w:r>
+              <w:t>ID Mapping &amp; De-duplication</w:t>
+            </w:r>
+          </w:p>
+        </w:tc>
+        <w:tc>
+          <w:tcPr>
+            <w:tcW w:w="0" w:type="auto"/>
+            <w:hideMark/>
+          </w:tcPr>
+          <w:p>
+            <w:pPr>
+              <w:spacing w:after="160" w:line="259" w:lineRule="auto"/>
+              <w:cnfStyle w:val="000000100000" w:firstRow="0" w:lastRow="0" w:firstColumn="0" w:lastColumn="0" w:oddVBand="0" w:evenVBand="0" w:oddHBand="1" w:evenHBand="0" w:firstRowFirstColumn="0" w:firstRowLastColumn="0" w:lastRowFirstColumn="0" w:lastRowLastColumn="0"/>
+            </w:pPr>
+            <w:r>
+              <w:t>Python</w:t>
+            </w:r>
+          </w:p>
+        </w:tc>
+        <w:tc>
+          <w:tcPr>
+            <w:tcW w:w="0" w:type="auto"/>
+            <w:hideMark/>
+          </w:tcPr>
+          <w:p>
+            <w:pPr>
+              <w:spacing w:after="160" w:line="259" w:lineRule="auto"/>
+              <w:cnfStyle w:val="000000100000" w:firstRow="0" w:lastRow="0" w:firstColumn="0" w:lastColumn="0" w:oddVBand="0" w:evenVBand="0" w:oddHBand="1" w:evenHBand="0" w:firstRowFirstColumn="0" w:firstRowLastColumn="0" w:lastRowFirstColumn="0" w:lastRowLastColumn="0"/>
+            </w:pPr>
+            <w:r>
+              <w:t>assets.csv</w:t>
+            </w:r>
+          </w:p>
+        </w:tc>
+      </w:tr>
+    </w:tbl>
+    <w:p>
+      <w:pPr>
+        <w:rPr>
+          <w:b/>
+          <w:bCs/>
+        </w:rPr>
+      </w:pPr>
+    </w:p>
+    <w:p>
+      <w:pPr>
+        <w:rPr>
+          <w:b/>
+          <w:bCs/>
+          <w:sz w:val="36"/>
+          <w:szCs w:val="36"/>
+        </w:rPr>
+      </w:pPr>
+      <w:r>
+        <w:rPr>
+          <w:b/>
+          <w:bCs/>
+          <w:sz w:val="36"/>
+          <w:szCs w:val="36"/>
+        </w:rPr>
+        <w:t>Deliverables</w:t>
+      </w:r>
+    </w:p>
+    <w:p>
+      <w:pPr>
+        <w:numPr>
+          <w:ilvl w:val="0"/>
+          <w:numId w:val="4"/>
+        </w:numPr>
+        <w:rPr>
+          <w:sz w:val="28"/>
+          <w:szCs w:val="28"/>
+        </w:rPr>
+      </w:pPr>
+      <w:r>
+        <w:rPr>
+          <w:b/>
+          <w:bCs/>
+          <w:sz w:val="28"/>
+          <w:szCs w:val="28"/>
+        </w:rPr>
+        <w:t>DATAFLOW.md:</w:t>
+      </w:r>
+      <w:r>
+        <w:rPr>
+          <w:sz w:val="28"/>
+          <w:szCs w:val="28"/>
+        </w:rPr>
+        <w:t> A formal document explaining the data lifecycle.</w:t>
+      </w:r>
+    </w:p>
+    <w:p>
+      <w:pPr>
+        <w:numPr>
+          <w:ilvl w:val="0"/>
+          <w:numId w:val="4"/>
+        </w:numPr>
+        <w:rPr>
+          <w:sz w:val="28"/>
+          <w:szCs w:val="28"/>
+        </w:rPr>
+      </w:pPr>
+      <w:r>
+        <w:rPr>
+          <w:b/>
+          <w:bCs/>
+          <w:sz w:val="28"/>
+          <w:szCs w:val="28"/>
+        </w:rPr>
+        <w:t>data_generator.py:</w:t>
+      </w:r>
+      <w:r>
+        <w:rPr>
+          <w:sz w:val="28"/>
+          <w:szCs w:val="28"/>
+        </w:rPr>
+        <w:t> Python source code for real-time ingestion.</w:t>
+      </w:r>
+    </w:p>
+    <w:p>
+      <w:pPr>
+        <w:numPr>
+          <w:ilvl w:val="0"/>
+          <w:numId w:val="4"/>
+        </w:numPr>
+        <w:pBdr>
+          <w:bottom w:val="single" w:sz="6" w:space="1" w:color="auto"/>
+        </w:pBdr>
+        <w:rPr>
+          <w:sz w:val="28"/>
+          <w:szCs w:val="28"/>
+        </w:rPr>
+      </w:pPr>
+      <w:proofErr w:type="spellStart"/>
+      <w:r>
+        <w:rPr>
+          <w:b/>
+          <w:bCs/>
+          <w:sz w:val="28"/>
+          <w:szCs w:val="28"/>
+        </w:rPr>
+        <w:t>data_exports</w:t>
+      </w:r>
+      <w:proofErr w:type="spellEnd"/>
+      <w:r>
+        <w:rPr>
+          <w:b/>
+          <w:bCs/>
+          <w:sz w:val="28"/>
+          <w:szCs w:val="28"/>
+        </w:rPr>
+        <w:t>/:</w:t>
+      </w:r>
+      <w:r>
+        <w:rPr>
+          <w:sz w:val="28"/>
+          <w:szCs w:val="28"/>
+        </w:rPr>
+        <w:t> Folder containing the clean CSV datasets (100+ rows each).</w:t>
+      </w:r>
+    </w:p>
+    <w:p>
+      <w:pPr>
+        <w:pBdr>
+          <w:bottom w:val="single" w:sz="6" w:space="1" w:color="auto"/>
+        </w:pBdr>
+        <w:ind w:left="360"/>
+        <w:rPr>
+          <w:sz w:val="28"/>
+          <w:szCs w:val="28"/>
+        </w:rPr>
+      </w:pPr>
+    </w:p>
+    <w:p>
+      <w:pPr>
+        <w:ind w:left="720"/>
+        <w:rPr>
+          <w:sz w:val="28"/>
+          <w:szCs w:val="28"/>
+        </w:rPr>
+      </w:pPr>
+    </w:p>
+    <w:p/>
+    <w:p>
+      <w:pPr>
+        <w:jc w:val="center"/>
+        <w:rPr>
+          <w:rFonts w:asciiTheme="majorBidi" w:hAnsiTheme="majorBidi" w:cstheme="majorBidi"/>
+          <w:sz w:val="56"/>
+          <w:szCs w:val="56"/>
+        </w:rPr>
+      </w:pPr>
+    </w:p>
+    <w:p>
+      <w:pPr>
         <w:rPr>
           <w:i/>
           <w:iCs/>
@@ -2996,6 +3723,155 @@
 <file path=word/numbering.xml><?xml version="1.0" encoding="utf-8"?>
 <w:numbering xmlns:wpc="http://schemas.microsoft.com/office/word/2010/wordprocessingCanvas" xmlns:cx="http://schemas.microsoft.com/office/drawing/2014/chartex" xmlns:cx1="http://schemas.microsoft.com/office/drawing/2015/9/8/chartex" xmlns:cx2="http://schemas.microsoft.com/office/drawing/2015/10/21/chartex" xmlns:cx3="http://schemas.microsoft.com/office/drawing/2016/5/9/chartex" xmlns:cx4="http://schemas.microsoft.com/office/drawing/2016/5/10/chartex" xmlns:cx5="http://schemas.microsoft.com/office/drawing/2016/5/11/chartex" xmlns:cx6="http://schemas.microsoft.com/office/drawing/2016/5/12/chartex" xmlns:cx7="http://schemas.microsoft.com/office/drawing/2016/5/13/chartex" xmlns:cx8="http://schemas.microsoft.com/office/drawing/2016/5/14/chartex" xmlns:mc="http://schemas.openxmlformats.org/markup-compatibility/2006" xmlns:aink="http://schemas.microsoft.com/office/drawing/2016/ink" xmlns:am3d="http://schemas.microsoft.com/office/drawing/2017/model3d" xmlns:o="urn:schemas-microsoft-com:office:office" xmlns:oel="http://schemas.microsoft.com/office/2019/extlst" xmlns:r="http://schemas.openxmlformats.org/officeDocument/2006/relationships" xmlns:m="http://schemas.openxmlformats.org/officeDocument/2006/math" xmlns:v="urn:schemas-microsoft-com:vml" xmlns:wp14="http://schemas.microsoft.com/office/word/2010/wordprocessingDrawing" xmlns:wp="http://schemas.openxmlformats.org/drawingml/2006/wordprocessingDrawing" xmlns:w10="urn:schemas-microsoft-com:office:word" xmlns:w="http://schemas.openxmlformats.org/wordprocessingml/2006/main" xmlns:w14="http://schemas.microsoft.com/office/word/2010/wordml" xmlns:w15="http://schemas.microsoft.com/office/word/2012/wordml" xmlns:w16cex="http://schemas.microsoft.com/office/word/2018/wordml/cex" xmlns:w16cid="http://schemas.microsoft.com/office/word/2016/wordml/cid" xmlns:w16="http://schemas.microsoft.com/office/word/2018/wordml" xmlns:w16du="http://schemas.microsoft.com/office/word/2023/wordml/word16du" xmlns:w16sdtdh="http://schemas.microsoft.com/office/word/2020/wordml/sdtdatahash" xmlns:w16sdtfl="http://schemas.microsoft.com/office/word/2024/wordml/sdtformatlock" xmlns:w16se="http://schemas.microsoft.com/office/word/2015/wordml/symex" xmlns:wpg="http://schemas.microsoft.com/office/word/2010/wordprocessingGroup" xmlns:wpi="http://schemas.microsoft.com/office/word/2010/wordprocessingInk" xmlns:wne="http://schemas.microsoft.com/office/word/2006/wordml" xmlns:wps="http://schemas.microsoft.com/office/word/2010/wordprocessingShape" mc:Ignorable="w14 w15 w16se w16cid w16 w16cex w16sdtdh w16sdtfl w16du wp14">
   <w:abstractNum w:abstractNumId="0" w15:restartNumberingAfterBreak="0">
+    <w:nsid w:val="052E6B37"/>
+    <w:multiLevelType w:val="multilevel"/>
+    <w:tmpl w:val="D248B0E6"/>
+    <w:lvl w:ilvl="0">
+      <w:start w:val="1"/>
+      <w:numFmt w:val="bullet"/>
+      <w:lvlText w:val=""/>
+      <w:lvlJc w:val="left"/>
+      <w:pPr>
+        <w:tabs>
+          <w:tab w:val="num" w:pos="720"/>
+        </w:tabs>
+        <w:ind w:left="720" w:hanging="360"/>
+      </w:pPr>
+      <w:rPr>
+        <w:rFonts w:ascii="Symbol" w:hAnsi="Symbol" w:hint="default"/>
+        <w:sz w:val="20"/>
+      </w:rPr>
+    </w:lvl>
+    <w:lvl w:ilvl="1" w:tentative="1">
+      <w:start w:val="1"/>
+      <w:numFmt w:val="bullet"/>
+      <w:lvlText w:val="o"/>
+      <w:lvlJc w:val="left"/>
+      <w:pPr>
+        <w:tabs>
+          <w:tab w:val="num" w:pos="1440"/>
+        </w:tabs>
+        <w:ind w:left="1440" w:hanging="360"/>
+      </w:pPr>
+      <w:rPr>
+        <w:rFonts w:ascii="Courier New" w:hAnsi="Courier New" w:hint="default"/>
+        <w:sz w:val="20"/>
+      </w:rPr>
+    </w:lvl>
+    <w:lvl w:ilvl="2" w:tentative="1">
+      <w:start w:val="1"/>
+      <w:numFmt w:val="bullet"/>
+      <w:lvlText w:val=""/>
+      <w:lvlJc w:val="left"/>
+      <w:pPr>
+        <w:tabs>
+          <w:tab w:val="num" w:pos="2160"/>
+        </w:tabs>
+        <w:ind w:left="2160" w:hanging="360"/>
+      </w:pPr>
+      <w:rPr>
+        <w:rFonts w:ascii="Wingdings" w:hAnsi="Wingdings" w:hint="default"/>
+        <w:sz w:val="20"/>
+      </w:rPr>
+    </w:lvl>
+    <w:lvl w:ilvl="3" w:tentative="1">
+      <w:start w:val="1"/>
+      <w:numFmt w:val="bullet"/>
+      <w:lvlText w:val=""/>
+      <w:lvlJc w:val="left"/>
+      <w:pPr>
+        <w:tabs>
+          <w:tab w:val="num" w:pos="2880"/>
+        </w:tabs>
+        <w:ind w:left="2880" w:hanging="360"/>
+      </w:pPr>
+      <w:rPr>
+        <w:rFonts w:ascii="Wingdings" w:hAnsi="Wingdings" w:hint="default"/>
+        <w:sz w:val="20"/>
+      </w:rPr>
+    </w:lvl>
+    <w:lvl w:ilvl="4" w:tentative="1">
+      <w:start w:val="1"/>
+      <w:numFmt w:val="bullet"/>
+      <w:lvlText w:val=""/>
+      <w:lvlJc w:val="left"/>
+      <w:pPr>
+        <w:tabs>
+          <w:tab w:val="num" w:pos="3600"/>
+        </w:tabs>
+        <w:ind w:left="3600" w:hanging="360"/>
+      </w:pPr>
+      <w:rPr>
+        <w:rFonts w:ascii="Wingdings" w:hAnsi="Wingdings" w:hint="default"/>
+        <w:sz w:val="20"/>
+      </w:rPr>
+    </w:lvl>
+    <w:lvl w:ilvl="5" w:tentative="1">
+      <w:start w:val="1"/>
+      <w:numFmt w:val="bullet"/>
+      <w:lvlText w:val=""/>
+      <w:lvlJc w:val="left"/>
+      <w:pPr>
+        <w:tabs>
+          <w:tab w:val="num" w:pos="4320"/>
+        </w:tabs>
+        <w:ind w:left="4320" w:hanging="360"/>
+      </w:pPr>
+      <w:rPr>
+        <w:rFonts w:ascii="Wingdings" w:hAnsi="Wingdings" w:hint="default"/>
+        <w:sz w:val="20"/>
+      </w:rPr>
+    </w:lvl>
+    <w:lvl w:ilvl="6" w:tentative="1">
+      <w:start w:val="1"/>
+      <w:numFmt w:val="bullet"/>
+      <w:lvlText w:val=""/>
+      <w:lvlJc w:val="left"/>
+      <w:pPr>
+        <w:tabs>
+          <w:tab w:val="num" w:pos="5040"/>
+        </w:tabs>
+        <w:ind w:left="5040" w:hanging="360"/>
+      </w:pPr>
+      <w:rPr>
+        <w:rFonts w:ascii="Wingdings" w:hAnsi="Wingdings" w:hint="default"/>
+        <w:sz w:val="20"/>
+      </w:rPr>
+    </w:lvl>
+    <w:lvl w:ilvl="7" w:tentative="1">
+      <w:start w:val="1"/>
+      <w:numFmt w:val="bullet"/>
+      <w:lvlText w:val=""/>
+      <w:lvlJc w:val="left"/>
+      <w:pPr>
+        <w:tabs>
+          <w:tab w:val="num" w:pos="5760"/>
+        </w:tabs>
+        <w:ind w:left="5760" w:hanging="360"/>
+      </w:pPr>
+      <w:rPr>
+        <w:rFonts w:ascii="Wingdings" w:hAnsi="Wingdings" w:hint="default"/>
+        <w:sz w:val="20"/>
+      </w:rPr>
+    </w:lvl>
+    <w:lvl w:ilvl="8" w:tentative="1">
+      <w:start w:val="1"/>
+      <w:numFmt w:val="bullet"/>
+      <w:lvlText w:val=""/>
+      <w:lvlJc w:val="left"/>
+      <w:pPr>
+        <w:tabs>
+          <w:tab w:val="num" w:pos="6480"/>
+        </w:tabs>
+        <w:ind w:left="6480" w:hanging="360"/>
+      </w:pPr>
+      <w:rPr>
+        <w:rFonts w:ascii="Wingdings" w:hAnsi="Wingdings" w:hint="default"/>
+        <w:sz w:val="20"/>
+      </w:rPr>
+    </w:lvl>
+  </w:abstractNum>
+  <w:abstractNum w:abstractNumId="1" w15:restartNumberingAfterBreak="0">
     <w:nsid w:val="1FAD7782"/>
     <w:multiLevelType w:val="multilevel"/>
     <w:tmpl w:val="1010BB26"/>
@@ -3144,7 +4020,120 @@
       </w:rPr>
     </w:lvl>
   </w:abstractNum>
-  <w:abstractNum w:abstractNumId="1" w15:restartNumberingAfterBreak="0">
+  <w:abstractNum w:abstractNumId="2" w15:restartNumberingAfterBreak="0">
+    <w:nsid w:val="5535141C"/>
+    <w:multiLevelType w:val="multilevel"/>
+    <w:tmpl w:val="47EA5D7A"/>
+    <w:lvl w:ilvl="0">
+      <w:start w:val="1"/>
+      <w:numFmt w:val="decimal"/>
+      <w:lvlText w:val="%1."/>
+      <w:lvlJc w:val="left"/>
+      <w:pPr>
+        <w:tabs>
+          <w:tab w:val="num" w:pos="720"/>
+        </w:tabs>
+        <w:ind w:left="720" w:hanging="360"/>
+      </w:pPr>
+    </w:lvl>
+    <w:lvl w:ilvl="1" w:tentative="1">
+      <w:start w:val="1"/>
+      <w:numFmt w:val="decimal"/>
+      <w:lvlText w:val="%2."/>
+      <w:lvlJc w:val="left"/>
+      <w:pPr>
+        <w:tabs>
+          <w:tab w:val="num" w:pos="1440"/>
+        </w:tabs>
+        <w:ind w:left="1440" w:hanging="360"/>
+      </w:pPr>
+    </w:lvl>
+    <w:lvl w:ilvl="2" w:tentative="1">
+      <w:start w:val="1"/>
+      <w:numFmt w:val="decimal"/>
+      <w:lvlText w:val="%3."/>
+      <w:lvlJc w:val="left"/>
+      <w:pPr>
+        <w:tabs>
+          <w:tab w:val="num" w:pos="2160"/>
+        </w:tabs>
+        <w:ind w:left="2160" w:hanging="360"/>
+      </w:pPr>
+    </w:lvl>
+    <w:lvl w:ilvl="3" w:tentative="1">
+      <w:start w:val="1"/>
+      <w:numFmt w:val="decimal"/>
+      <w:lvlText w:val="%4."/>
+      <w:lvlJc w:val="left"/>
+      <w:pPr>
+        <w:tabs>
+          <w:tab w:val="num" w:pos="2880"/>
+        </w:tabs>
+        <w:ind w:left="2880" w:hanging="360"/>
+      </w:pPr>
+    </w:lvl>
+    <w:lvl w:ilvl="4" w:tentative="1">
+      <w:start w:val="1"/>
+      <w:numFmt w:val="decimal"/>
+      <w:lvlText w:val="%5."/>
+      <w:lvlJc w:val="left"/>
+      <w:pPr>
+        <w:tabs>
+          <w:tab w:val="num" w:pos="3600"/>
+        </w:tabs>
+        <w:ind w:left="3600" w:hanging="360"/>
+      </w:pPr>
+    </w:lvl>
+    <w:lvl w:ilvl="5" w:tentative="1">
+      <w:start w:val="1"/>
+      <w:numFmt w:val="decimal"/>
+      <w:lvlText w:val="%6."/>
+      <w:lvlJc w:val="left"/>
+      <w:pPr>
+        <w:tabs>
+          <w:tab w:val="num" w:pos="4320"/>
+        </w:tabs>
+        <w:ind w:left="4320" w:hanging="360"/>
+      </w:pPr>
+    </w:lvl>
+    <w:lvl w:ilvl="6" w:tentative="1">
+      <w:start w:val="1"/>
+      <w:numFmt w:val="decimal"/>
+      <w:lvlText w:val="%7."/>
+      <w:lvlJc w:val="left"/>
+      <w:pPr>
+        <w:tabs>
+          <w:tab w:val="num" w:pos="5040"/>
+        </w:tabs>
+        <w:ind w:left="5040" w:hanging="360"/>
+      </w:pPr>
+    </w:lvl>
+    <w:lvl w:ilvl="7" w:tentative="1">
+      <w:start w:val="1"/>
+      <w:numFmt w:val="decimal"/>
+      <w:lvlText w:val="%8."/>
+      <w:lvlJc w:val="left"/>
+      <w:pPr>
+        <w:tabs>
+          <w:tab w:val="num" w:pos="5760"/>
+        </w:tabs>
+        <w:ind w:left="5760" w:hanging="360"/>
+      </w:pPr>
+    </w:lvl>
+    <w:lvl w:ilvl="8" w:tentative="1">
+      <w:start w:val="1"/>
+      <w:numFmt w:val="decimal"/>
+      <w:lvlText w:val="%9."/>
+      <w:lvlJc w:val="left"/>
+      <w:pPr>
+        <w:tabs>
+          <w:tab w:val="num" w:pos="6480"/>
+        </w:tabs>
+        <w:ind w:left="6480" w:hanging="360"/>
+      </w:pPr>
+    </w:lvl>
+  </w:abstractNum>
+  <w:abstractNum w:abstractNumId="3" w15:restartNumberingAfterBreak="0">
     <w:nsid w:val="79E05096"/>
     <w:multiLevelType w:val="multilevel"/>
     <w:tmpl w:val="ADAE6B7A"/>
@@ -3294,9 +4283,15 @@
     </w:lvl>
   </w:abstractNum>
   <w:num w:numId="1" w16cid:durableId="1366784308">
+    <w:abstractNumId w:val="3"/>
+  </w:num>
+  <w:num w:numId="2" w16cid:durableId="253170238">
     <w:abstractNumId w:val="1"/>
   </w:num>
-  <w:num w:numId="2" w16cid:durableId="253170238">
+  <w:num w:numId="3" w16cid:durableId="1190415741">
+    <w:abstractNumId w:val="2"/>
+  </w:num>
+  <w:num w:numId="4" w16cid:durableId="198903813">
     <w:abstractNumId w:val="0"/>
   </w:num>
 </w:numbering>
@@ -3700,7 +4695,7 @@
   <w:style w:type="paragraph" w:default="1" w:styleId="Normal">
     <w:name w:val="Normal"/>
     <w:qFormat/>
-    <w:rsid w:val="0000418A"/>
+    <w:rsid w:val="006F7F78"/>
   </w:style>
   <w:style w:type="character" w:default="1" w:styleId="DefaultParagraphFont">
     <w:name w:val="Default Paragraph Font"/>

</xml_diff>

<commit_message>
m4: finished the version control section for database setup and indexes
</commit_message>
<xml_diff>
--- a/Crypto & Stock Anomaly Detection System - Version Control Document.docx
+++ b/Crypto & Stock Anomaly Detection System - Version Control Document.docx
@@ -1094,18 +1094,29 @@
               <w:jc w:val="center"/>
               <w:rPr>
                 <w:rFonts w:asciiTheme="majorBidi" w:hAnsiTheme="majorBidi" w:cstheme="majorBidi"/>
-                <w:b/>
-                <w:bCs/>
                 <w:sz w:val="32"/>
                 <w:szCs w:val="32"/>
               </w:rPr>
             </w:pPr>
           </w:p>
-        </w:tc>
-        <w:tc>
-          <w:tcPr>
-            <w:tcW w:w="2611" w:type="dxa"/>
-          </w:tcPr>
+          <w:p>
+            <w:pPr>
+              <w:jc w:val="center"/>
+              <w:rPr>
+                <w:rFonts w:asciiTheme="majorBidi" w:hAnsiTheme="majorBidi" w:cstheme="majorBidi"/>
+                <w:sz w:val="32"/>
+                <w:szCs w:val="32"/>
+              </w:rPr>
+            </w:pPr>
+            <w:r>
+              <w:rPr>
+                <w:rFonts w:asciiTheme="majorBidi" w:hAnsiTheme="majorBidi" w:cstheme="majorBidi"/>
+                <w:sz w:val="32"/>
+                <w:szCs w:val="32"/>
+              </w:rPr>
+              <w:t>Dataset Preprocessing &amp; Dataflow</w:t>
+            </w:r>
+          </w:p>
           <w:p>
             <w:pPr>
               <w:jc w:val="center"/>
@@ -1127,19 +1138,22 @@
             <w:pPr>
               <w:jc w:val="center"/>
               <w:rPr>
-                <w:rFonts w:asciiTheme="majorBidi" w:hAnsiTheme="majorBidi" w:cstheme="majorBidi"/>
-                <w:b/>
-                <w:bCs/>
+                <w:rFonts w:ascii="Calibri" w:hAnsi="Calibri" w:cs="Calibri"/>
                 <w:sz w:val="32"/>
                 <w:szCs w:val="32"/>
               </w:rPr>
             </w:pPr>
           </w:p>
-        </w:tc>
-        <w:tc>
-          <w:tcPr>
-            <w:tcW w:w="2611" w:type="dxa"/>
-          </w:tcPr>
+          <w:p>
+            <w:pPr>
+              <w:jc w:val="center"/>
+              <w:rPr>
+                <w:rFonts w:ascii="Calibri" w:hAnsi="Calibri" w:cs="Calibri"/>
+                <w:sz w:val="32"/>
+                <w:szCs w:val="32"/>
+              </w:rPr>
+            </w:pPr>
+          </w:p>
           <w:p>
             <w:pPr>
               <w:jc w:val="center"/>
@@ -1151,13 +1165,40 @@
                 <w:szCs w:val="32"/>
               </w:rPr>
             </w:pPr>
-          </w:p>
-        </w:tc>
-      </w:tr>
-      <w:tr>
-        <w:trPr>
-          <w:trHeight w:val="1396"/>
-        </w:trPr>
+            <w:r>
+              <w:rPr>
+                <w:rFonts w:ascii="Calibri" w:hAnsi="Calibri" w:cs="Calibri"/>
+                <w:sz w:val="32"/>
+                <w:szCs w:val="32"/>
+              </w:rPr>
+              <w:t>Ver</w:t>
+            </w:r>
+            <w:r>
+              <w:rPr>
+                <w:rFonts w:ascii="Calibri" w:hAnsi="Calibri" w:cs="Calibri"/>
+                <w:sz w:val="32"/>
+                <w:szCs w:val="32"/>
+              </w:rPr>
+              <w:t>s</w:t>
+            </w:r>
+            <w:r>
+              <w:rPr>
+                <w:rFonts w:ascii="Calibri" w:hAnsi="Calibri" w:cs="Calibri"/>
+                <w:sz w:val="32"/>
+                <w:szCs w:val="32"/>
+              </w:rPr>
+              <w:t>ion</w:t>
+            </w:r>
+            <w:r>
+              <w:rPr>
+                <w:rFonts w:ascii="Calibri" w:hAnsi="Calibri" w:cs="Calibri"/>
+                <w:sz w:val="32"/>
+                <w:szCs w:val="32"/>
+              </w:rPr>
+              <w:t xml:space="preserve"> 1.2</w:t>
+            </w:r>
+          </w:p>
+        </w:tc>
         <w:tc>
           <w:tcPr>
             <w:tcW w:w="2611" w:type="dxa"/>
@@ -1191,11 +1232,16 @@
               </w:rPr>
             </w:pPr>
           </w:p>
-        </w:tc>
-        <w:tc>
-          <w:tcPr>
-            <w:tcW w:w="2611" w:type="dxa"/>
-          </w:tcPr>
+          <w:p>
+            <w:pPr>
+              <w:jc w:val="center"/>
+              <w:rPr>
+                <w:rFonts w:ascii="Calibri" w:hAnsi="Calibri" w:cs="Calibri"/>
+                <w:sz w:val="32"/>
+                <w:szCs w:val="32"/>
+              </w:rPr>
+            </w:pPr>
+          </w:p>
           <w:p>
             <w:pPr>
               <w:jc w:val="center"/>
@@ -1207,12 +1253,51 @@
                 <w:szCs w:val="32"/>
               </w:rPr>
             </w:pPr>
-          </w:p>
-        </w:tc>
+            <w:r>
+              <w:rPr>
+                <w:rFonts w:ascii="Calibri" w:hAnsi="Calibri" w:cs="Calibri"/>
+                <w:sz w:val="32"/>
+                <w:szCs w:val="32"/>
+              </w:rPr>
+              <w:t>May 16</w:t>
+            </w:r>
+            <w:r>
+              <w:rPr>
+                <w:rFonts w:ascii="Calibri" w:hAnsi="Calibri" w:cs="Calibri"/>
+                <w:sz w:val="32"/>
+                <w:szCs w:val="32"/>
+              </w:rPr>
+              <w:t>, 2026</w:t>
+            </w:r>
+          </w:p>
+        </w:tc>
+      </w:tr>
+      <w:tr>
+        <w:trPr>
+          <w:trHeight w:val="1396"/>
+        </w:trPr>
         <w:tc>
           <w:tcPr>
             <w:tcW w:w="2611" w:type="dxa"/>
           </w:tcPr>
+          <w:p>
+            <w:pPr>
+              <w:jc w:val="center"/>
+              <w:rPr>
+                <w:rFonts w:asciiTheme="majorBidi" w:hAnsiTheme="majorBidi" w:cstheme="majorBidi"/>
+                <w:sz w:val="32"/>
+                <w:szCs w:val="32"/>
+              </w:rPr>
+            </w:pPr>
+            <w:r>
+              <w:rPr>
+                <w:rFonts w:asciiTheme="majorBidi" w:hAnsiTheme="majorBidi" w:cstheme="majorBidi"/>
+                <w:sz w:val="32"/>
+                <w:szCs w:val="32"/>
+              </w:rPr>
+              <w:t>Database Setup (DDL &amp; Optimization)</w:t>
+            </w:r>
+          </w:p>
           <w:p>
             <w:pPr>
               <w:jc w:val="center"/>
@@ -1226,6 +1311,133 @@
             </w:pPr>
           </w:p>
         </w:tc>
+        <w:tc>
+          <w:tcPr>
+            <w:tcW w:w="2611" w:type="dxa"/>
+          </w:tcPr>
+          <w:p>
+            <w:pPr>
+              <w:jc w:val="center"/>
+              <w:rPr>
+                <w:rFonts w:ascii="Calibri" w:hAnsi="Calibri" w:cs="Calibri"/>
+                <w:sz w:val="32"/>
+                <w:szCs w:val="32"/>
+              </w:rPr>
+            </w:pPr>
+          </w:p>
+          <w:p>
+            <w:pPr>
+              <w:jc w:val="center"/>
+              <w:rPr>
+                <w:rFonts w:asciiTheme="majorBidi" w:hAnsiTheme="majorBidi" w:cstheme="majorBidi"/>
+                <w:b/>
+                <w:bCs/>
+                <w:sz w:val="32"/>
+                <w:szCs w:val="32"/>
+              </w:rPr>
+            </w:pPr>
+            <w:r>
+              <w:rPr>
+                <w:rFonts w:ascii="Calibri" w:hAnsi="Calibri" w:cs="Calibri"/>
+                <w:sz w:val="32"/>
+                <w:szCs w:val="32"/>
+              </w:rPr>
+              <w:t>Ver</w:t>
+            </w:r>
+            <w:r>
+              <w:rPr>
+                <w:rFonts w:ascii="Calibri" w:hAnsi="Calibri" w:cs="Calibri"/>
+                <w:sz w:val="32"/>
+                <w:szCs w:val="32"/>
+              </w:rPr>
+              <w:t>s</w:t>
+            </w:r>
+            <w:r>
+              <w:rPr>
+                <w:rFonts w:ascii="Calibri" w:hAnsi="Calibri" w:cs="Calibri"/>
+                <w:sz w:val="32"/>
+                <w:szCs w:val="32"/>
+              </w:rPr>
+              <w:t>ion</w:t>
+            </w:r>
+            <w:r>
+              <w:rPr>
+                <w:rFonts w:ascii="Calibri" w:hAnsi="Calibri" w:cs="Calibri"/>
+                <w:sz w:val="32"/>
+                <w:szCs w:val="32"/>
+              </w:rPr>
+              <w:t xml:space="preserve"> 1.</w:t>
+            </w:r>
+            <w:r>
+              <w:rPr>
+                <w:rFonts w:ascii="Calibri" w:hAnsi="Calibri" w:cs="Calibri"/>
+                <w:sz w:val="32"/>
+                <w:szCs w:val="32"/>
+              </w:rPr>
+              <w:t>3</w:t>
+            </w:r>
+          </w:p>
+        </w:tc>
+        <w:tc>
+          <w:tcPr>
+            <w:tcW w:w="2611" w:type="dxa"/>
+          </w:tcPr>
+          <w:p>
+            <w:pPr>
+              <w:jc w:val="center"/>
+              <w:rPr>
+                <w:rFonts w:asciiTheme="majorBidi" w:hAnsiTheme="majorBidi" w:cstheme="majorBidi"/>
+                <w:b/>
+                <w:bCs/>
+                <w:sz w:val="32"/>
+                <w:szCs w:val="32"/>
+              </w:rPr>
+            </w:pPr>
+          </w:p>
+        </w:tc>
+        <w:tc>
+          <w:tcPr>
+            <w:tcW w:w="2611" w:type="dxa"/>
+          </w:tcPr>
+          <w:p>
+            <w:pPr>
+              <w:jc w:val="center"/>
+              <w:rPr>
+                <w:rFonts w:ascii="Calibri" w:hAnsi="Calibri" w:cs="Calibri"/>
+                <w:sz w:val="32"/>
+                <w:szCs w:val="32"/>
+              </w:rPr>
+            </w:pPr>
+          </w:p>
+          <w:p>
+            <w:pPr>
+              <w:jc w:val="center"/>
+              <w:rPr>
+                <w:rFonts w:asciiTheme="majorBidi" w:hAnsiTheme="majorBidi" w:cstheme="majorBidi"/>
+                <w:b/>
+                <w:bCs/>
+                <w:sz w:val="32"/>
+                <w:szCs w:val="32"/>
+              </w:rPr>
+            </w:pPr>
+            <w:r>
+              <w:rPr>
+                <w:rFonts w:ascii="Calibri" w:hAnsi="Calibri" w:cs="Calibri"/>
+                <w:sz w:val="32"/>
+                <w:szCs w:val="32"/>
+              </w:rPr>
+              <w:t>May 16</w:t>
+            </w:r>
+            <w:r>
+              <w:rPr>
+                <w:rFonts w:ascii="Calibri" w:hAnsi="Calibri" w:cs="Calibri"/>
+                <w:sz w:val="32"/>
+                <w:szCs w:val="32"/>
+              </w:rPr>
+              <w:t>, 2026</w:t>
+            </w:r>
+          </w:p>
+        </w:tc>
       </w:tr>
     </w:tbl>
     <w:p>
@@ -1334,7 +1546,6 @@
           <w:sz w:val="56"/>
           <w:szCs w:val="56"/>
         </w:rPr>
-        <w:lastRenderedPageBreak/>
         <w:t>Milestone 1</w:t>
       </w:r>
     </w:p>
@@ -1508,7 +1719,6 @@
           <w:sz w:val="52"/>
           <w:szCs w:val="52"/>
         </w:rPr>
-        <w:lastRenderedPageBreak/>
         <w:t>Relational Database Schema</w:t>
       </w:r>
     </w:p>
@@ -2289,7 +2499,6 @@
           <w:sz w:val="56"/>
           <w:szCs w:val="56"/>
         </w:rPr>
-        <w:lastRenderedPageBreak/>
         <w:t xml:space="preserve">Milestone </w:t>
       </w:r>
       <w:r>
@@ -2552,6 +2761,7 @@
       <w:tblPr>
         <w:tblStyle w:val="GridTable4-Accent1"/>
         <w:tblW w:w="0" w:type="auto"/>
+        <w:jc w:val="center"/>
         <w:tblLook w:val="04A0" w:firstRow="1" w:lastRow="0" w:firstColumn="1" w:lastColumn="0" w:noHBand="0" w:noVBand="1"/>
       </w:tblPr>
       <w:tblGrid>
@@ -2563,6 +2773,7 @@
       <w:tr>
         <w:trPr>
           <w:cnfStyle w:val="100000000000" w:firstRow="1" w:lastRow="0" w:firstColumn="0" w:lastColumn="0" w:oddVBand="0" w:evenVBand="0" w:oddHBand="0" w:evenHBand="0" w:firstRowFirstColumn="0" w:firstRowLastColumn="0" w:lastRowFirstColumn="0" w:lastRowLastColumn="0"/>
+          <w:jc w:val="center"/>
         </w:trPr>
         <w:tc>
           <w:tcPr>
@@ -2628,6 +2839,7 @@
       <w:tr>
         <w:trPr>
           <w:cnfStyle w:val="000000100000" w:firstRow="0" w:lastRow="0" w:firstColumn="0" w:lastColumn="0" w:oddVBand="0" w:evenVBand="0" w:oddHBand="1" w:evenHBand="0" w:firstRowFirstColumn="0" w:firstRowLastColumn="0" w:lastRowFirstColumn="0" w:lastRowLastColumn="0"/>
+          <w:jc w:val="center"/>
         </w:trPr>
         <w:tc>
           <w:tcPr>
@@ -2716,6 +2928,9 @@
         </w:tc>
       </w:tr>
       <w:tr>
+        <w:trPr>
+          <w:jc w:val="center"/>
+        </w:trPr>
         <w:tc>
           <w:tcPr>
             <w:cnfStyle w:val="001000000000" w:firstRow="0" w:lastRow="0" w:firstColumn="1" w:lastColumn="0" w:oddVBand="0" w:evenVBand="0" w:oddHBand="0" w:evenHBand="0" w:firstRowFirstColumn="0" w:firstRowLastColumn="0" w:lastRowFirstColumn="0" w:lastRowLastColumn="0"/>
@@ -2800,6 +3015,7 @@
       <w:tr>
         <w:trPr>
           <w:cnfStyle w:val="000000100000" w:firstRow="0" w:lastRow="0" w:firstColumn="0" w:lastColumn="0" w:oddVBand="0" w:evenVBand="0" w:oddHBand="1" w:evenHBand="0" w:firstRowFirstColumn="0" w:firstRowLastColumn="0" w:lastRowFirstColumn="0" w:lastRowLastColumn="0"/>
+          <w:jc w:val="center"/>
         </w:trPr>
         <w:tc>
           <w:tcPr>
@@ -2961,19 +3177,6 @@
     </w:p>
     <w:p>
       <w:pPr>
-        <w:pBdr>
-          <w:bottom w:val="single" w:sz="6" w:space="1" w:color="auto"/>
-        </w:pBdr>
-        <w:rPr>
-          <w:i/>
-          <w:iCs/>
-          <w:sz w:val="28"/>
-          <w:szCs w:val="28"/>
-        </w:rPr>
-      </w:pPr>
-    </w:p>
-    <w:p>
-      <w:pPr>
         <w:jc w:val="center"/>
         <w:rPr>
           <w:rFonts w:asciiTheme="majorBidi" w:hAnsiTheme="majorBidi" w:cstheme="majorBidi"/>
@@ -3004,17 +3207,7 @@
           <w:szCs w:val="72"/>
         </w:rPr>
         <w:lastRenderedPageBreak/>
-        <w:t xml:space="preserve">Milestone </w:t>
-      </w:r>
-      <w:r>
-        <w:rPr>
-          <w:rFonts w:asciiTheme="majorBidi" w:hAnsiTheme="majorBidi" w:cstheme="majorBidi"/>
-          <w:b/>
-          <w:bCs/>
-          <w:sz w:val="72"/>
-          <w:szCs w:val="72"/>
-        </w:rPr>
-        <w:t xml:space="preserve">3 </w:t>
+        <w:t xml:space="preserve">Milestone 3 </w:t>
       </w:r>
     </w:p>
     <w:p>
@@ -3255,6 +3448,7 @@
       <w:tblPr>
         <w:tblStyle w:val="GridTable5Dark-Accent6"/>
         <w:tblW w:w="0" w:type="auto"/>
+        <w:jc w:val="center"/>
         <w:tblLook w:val="04A0" w:firstRow="1" w:lastRow="0" w:firstColumn="1" w:lastColumn="0" w:noHBand="0" w:noVBand="1"/>
       </w:tblPr>
       <w:tblGrid>
@@ -3266,6 +3460,7 @@
       <w:tr>
         <w:trPr>
           <w:cnfStyle w:val="100000000000" w:firstRow="1" w:lastRow="0" w:firstColumn="0" w:lastColumn="0" w:oddVBand="0" w:evenVBand="0" w:oddHBand="0" w:evenHBand="0" w:firstRowFirstColumn="0" w:firstRowLastColumn="0" w:lastRowFirstColumn="0" w:lastRowLastColumn="0"/>
+          <w:jc w:val="center"/>
         </w:trPr>
         <w:tc>
           <w:tcPr>
@@ -3331,6 +3526,7 @@
       <w:tr>
         <w:trPr>
           <w:cnfStyle w:val="000000100000" w:firstRow="0" w:lastRow="0" w:firstColumn="0" w:lastColumn="0" w:oddVBand="0" w:evenVBand="0" w:oddHBand="1" w:evenHBand="0" w:firstRowFirstColumn="0" w:firstRowLastColumn="0" w:lastRowFirstColumn="0" w:lastRowLastColumn="0"/>
+          <w:jc w:val="center"/>
         </w:trPr>
         <w:tc>
           <w:tcPr>
@@ -3360,6 +3556,7 @@
           <w:p>
             <w:pPr>
               <w:spacing w:after="160" w:line="259" w:lineRule="auto"/>
+              <w:jc w:val="center"/>
               <w:cnfStyle w:val="000000100000" w:firstRow="0" w:lastRow="0" w:firstColumn="0" w:lastColumn="0" w:oddVBand="0" w:evenVBand="0" w:oddHBand="1" w:evenHBand="0" w:firstRowFirstColumn="0" w:firstRowLastColumn="0" w:lastRowFirstColumn="0" w:lastRowLastColumn="0"/>
             </w:pPr>
             <w:r>
@@ -3399,6 +3596,9 @@
         </w:tc>
       </w:tr>
       <w:tr>
+        <w:trPr>
+          <w:jc w:val="center"/>
+        </w:trPr>
         <w:tc>
           <w:tcPr>
             <w:cnfStyle w:val="001000000000" w:firstRow="0" w:lastRow="0" w:firstColumn="1" w:lastColumn="0" w:oddVBand="0" w:evenVBand="0" w:oddHBand="0" w:evenHBand="0" w:firstRowFirstColumn="0" w:firstRowLastColumn="0" w:lastRowFirstColumn="0" w:lastRowLastColumn="0"/>
@@ -3479,6 +3679,7 @@
       <w:tr>
         <w:trPr>
           <w:cnfStyle w:val="000000100000" w:firstRow="0" w:lastRow="0" w:firstColumn="0" w:lastColumn="0" w:oddVBand="0" w:evenVBand="0" w:oddHBand="1" w:evenHBand="0" w:firstRowFirstColumn="0" w:firstRowLastColumn="0" w:lastRowFirstColumn="0" w:lastRowLastColumn="0"/>
+          <w:jc w:val="center"/>
         </w:trPr>
         <w:tc>
           <w:tcPr>
@@ -3685,6 +3886,782 @@
         <w:rPr>
           <w:sz w:val="28"/>
           <w:szCs w:val="28"/>
+        </w:rPr>
+      </w:pPr>
+    </w:p>
+    <w:p>
+      <w:pPr>
+        <w:jc w:val="center"/>
+        <w:rPr>
+          <w:rFonts w:asciiTheme="majorBidi" w:hAnsiTheme="majorBidi" w:cstheme="majorBidi"/>
+          <w:b/>
+          <w:bCs/>
+          <w:sz w:val="72"/>
+          <w:szCs w:val="72"/>
+        </w:rPr>
+      </w:pPr>
+      <w:r>
+        <w:rPr>
+          <w:rFonts w:asciiTheme="majorBidi" w:hAnsiTheme="majorBidi" w:cstheme="majorBidi"/>
+          <w:b/>
+          <w:bCs/>
+          <w:sz w:val="72"/>
+          <w:szCs w:val="72"/>
+        </w:rPr>
+        <w:t xml:space="preserve">Milestone </w:t>
+      </w:r>
+      <w:r>
+        <w:rPr>
+          <w:rFonts w:asciiTheme="majorBidi" w:hAnsiTheme="majorBidi" w:cstheme="majorBidi"/>
+          <w:b/>
+          <w:bCs/>
+          <w:sz w:val="72"/>
+          <w:szCs w:val="72"/>
+        </w:rPr>
+        <w:t>4</w:t>
+      </w:r>
+    </w:p>
+    <w:p>
+      <w:pPr>
+        <w:jc w:val="center"/>
+        <w:rPr>
+          <w:rFonts w:asciiTheme="majorBidi" w:hAnsiTheme="majorBidi" w:cstheme="majorBidi"/>
+          <w:b/>
+          <w:bCs/>
+          <w:sz w:val="44"/>
+          <w:szCs w:val="44"/>
+        </w:rPr>
+      </w:pPr>
+      <w:r>
+        <w:rPr>
+          <w:rFonts w:asciiTheme="majorBidi" w:hAnsiTheme="majorBidi" w:cstheme="majorBidi"/>
+          <w:b/>
+          <w:bCs/>
+          <w:sz w:val="44"/>
+          <w:szCs w:val="44"/>
+        </w:rPr>
+        <w:t>Database Setup (DDL &amp; Optimization)</w:t>
+      </w:r>
+    </w:p>
+    <w:p>
+      <w:pPr>
+        <w:rPr>
+          <w:b/>
+          <w:bCs/>
+          <w:sz w:val="28"/>
+          <w:szCs w:val="28"/>
+        </w:rPr>
+      </w:pPr>
+      <w:r>
+        <w:rPr>
+          <w:b/>
+          <w:bCs/>
+          <w:sz w:val="28"/>
+          <w:szCs w:val="28"/>
+        </w:rPr>
+        <w:t>Database Implementation Details</w:t>
+      </w:r>
+    </w:p>
+    <w:p>
+      <w:pPr>
+        <w:rPr>
+          <w:sz w:val="24"/>
+          <w:szCs w:val="24"/>
+        </w:rPr>
+      </w:pPr>
+      <w:r>
+        <w:rPr>
+          <w:sz w:val="24"/>
+          <w:szCs w:val="24"/>
+        </w:rPr>
+        <w:t>The finalized schema was implemented in MySQL with a focus on data integrity and query performance. Every table now includes appropriate primary keys, foreign key constraints, and performance-enhancing indexes.</w:t>
+      </w:r>
+    </w:p>
+    <w:p>
+      <w:pPr>
+        <w:rPr>
+          <w:b/>
+          <w:bCs/>
+          <w:sz w:val="28"/>
+          <w:szCs w:val="28"/>
+        </w:rPr>
+      </w:pPr>
+      <w:r>
+        <w:rPr>
+          <w:b/>
+          <w:bCs/>
+          <w:sz w:val="28"/>
+          <w:szCs w:val="28"/>
+        </w:rPr>
+        <w:t>Key Enhancements in DDL</w:t>
+      </w:r>
+    </w:p>
+    <w:p>
+      <w:pPr>
+        <w:numPr>
+          <w:ilvl w:val="0"/>
+          <w:numId w:val="5"/>
+        </w:numPr>
+        <w:rPr>
+          <w:sz w:val="24"/>
+          <w:szCs w:val="24"/>
+        </w:rPr>
+      </w:pPr>
+      <w:r>
+        <w:rPr>
+          <w:b/>
+          <w:bCs/>
+          <w:sz w:val="24"/>
+          <w:szCs w:val="24"/>
+        </w:rPr>
+        <w:t>Constraints:</w:t>
+      </w:r>
+      <w:r>
+        <w:rPr>
+          <w:sz w:val="24"/>
+          <w:szCs w:val="24"/>
+        </w:rPr>
+        <w:t> Applied NOT NULL constraints on critical market columns (price, volume, score) to prevent dirty data entry.</w:t>
+      </w:r>
+    </w:p>
+    <w:p>
+      <w:pPr>
+        <w:numPr>
+          <w:ilvl w:val="0"/>
+          <w:numId w:val="5"/>
+        </w:numPr>
+        <w:rPr>
+          <w:sz w:val="24"/>
+          <w:szCs w:val="24"/>
+        </w:rPr>
+      </w:pPr>
+      <w:r>
+        <w:rPr>
+          <w:b/>
+          <w:bCs/>
+          <w:sz w:val="24"/>
+          <w:szCs w:val="24"/>
+        </w:rPr>
+        <w:t>Indexing:</w:t>
+      </w:r>
+      <w:r>
+        <w:rPr>
+          <w:sz w:val="24"/>
+          <w:szCs w:val="24"/>
+        </w:rPr>
+        <w:t> Created non-clustered indexes on </w:t>
+      </w:r>
+      <w:proofErr w:type="spellStart"/>
+      <w:r>
+        <w:rPr>
+          <w:sz w:val="24"/>
+          <w:szCs w:val="24"/>
+        </w:rPr>
+        <w:t>price_</w:t>
+      </w:r>
+      <w:proofErr w:type="gramStart"/>
+      <w:r>
+        <w:rPr>
+          <w:sz w:val="24"/>
+          <w:szCs w:val="24"/>
+        </w:rPr>
+        <w:t>history.timestamp</w:t>
+      </w:r>
+      <w:proofErr w:type="spellEnd"/>
+      <w:proofErr w:type="gramEnd"/>
+      <w:r>
+        <w:rPr>
+          <w:sz w:val="24"/>
+          <w:szCs w:val="24"/>
+        </w:rPr>
+        <w:t> and </w:t>
+      </w:r>
+      <w:proofErr w:type="spellStart"/>
+      <w:r>
+        <w:rPr>
+          <w:sz w:val="24"/>
+          <w:szCs w:val="24"/>
+        </w:rPr>
+        <w:t>price_</w:t>
+      </w:r>
+      <w:proofErr w:type="gramStart"/>
+      <w:r>
+        <w:rPr>
+          <w:sz w:val="24"/>
+          <w:szCs w:val="24"/>
+        </w:rPr>
+        <w:t>history.asset</w:t>
+      </w:r>
+      <w:proofErr w:type="gramEnd"/>
+      <w:r>
+        <w:rPr>
+          <w:sz w:val="24"/>
+          <w:szCs w:val="24"/>
+        </w:rPr>
+        <w:t>_id</w:t>
+      </w:r>
+      <w:proofErr w:type="spellEnd"/>
+      <w:r>
+        <w:rPr>
+          <w:sz w:val="24"/>
+          <w:szCs w:val="24"/>
+        </w:rPr>
+        <w:t> to ensure ultra-fast retrieval of time-series data for the Flask dashboard.</w:t>
+      </w:r>
+    </w:p>
+    <w:p>
+      <w:pPr>
+        <w:numPr>
+          <w:ilvl w:val="0"/>
+          <w:numId w:val="5"/>
+        </w:numPr>
+        <w:rPr>
+          <w:sz w:val="24"/>
+          <w:szCs w:val="24"/>
+        </w:rPr>
+      </w:pPr>
+      <w:r>
+        <w:rPr>
+          <w:b/>
+          <w:bCs/>
+          <w:sz w:val="24"/>
+          <w:szCs w:val="24"/>
+        </w:rPr>
+        <w:t>Indexing on Severity:</w:t>
+      </w:r>
+      <w:r>
+        <w:rPr>
+          <w:sz w:val="24"/>
+          <w:szCs w:val="24"/>
+        </w:rPr>
+        <w:t> Added an index to </w:t>
+      </w:r>
+      <w:proofErr w:type="spellStart"/>
+      <w:proofErr w:type="gramStart"/>
+      <w:r>
+        <w:rPr>
+          <w:sz w:val="24"/>
+          <w:szCs w:val="24"/>
+        </w:rPr>
+        <w:t>anomalies.severity</w:t>
+      </w:r>
+      <w:proofErr w:type="spellEnd"/>
+      <w:proofErr w:type="gramEnd"/>
+      <w:r>
+        <w:rPr>
+          <w:sz w:val="24"/>
+          <w:szCs w:val="24"/>
+        </w:rPr>
+        <w:t> to speed up the filtering of "High" vs "Low" anomaly alerts.</w:t>
+      </w:r>
+    </w:p>
+    <w:p>
+      <w:pPr>
+        <w:numPr>
+          <w:ilvl w:val="0"/>
+          <w:numId w:val="5"/>
+        </w:numPr>
+        <w:rPr>
+          <w:sz w:val="24"/>
+          <w:szCs w:val="24"/>
+        </w:rPr>
+      </w:pPr>
+      <w:r>
+        <w:rPr>
+          <w:b/>
+          <w:bCs/>
+          <w:sz w:val="24"/>
+          <w:szCs w:val="24"/>
+        </w:rPr>
+        <w:t>Referential Integrity:</w:t>
+      </w:r>
+      <w:r>
+        <w:rPr>
+          <w:sz w:val="24"/>
+          <w:szCs w:val="24"/>
+        </w:rPr>
+        <w:t> Enforced ON DELETE CASCADE / ON UPDATE logic where necessary to keep records synchronized between assets and prices.</w:t>
+      </w:r>
+    </w:p>
+    <w:p>
+      <w:pPr>
+        <w:ind w:left="720"/>
+        <w:rPr>
+          <w:sz w:val="24"/>
+          <w:szCs w:val="24"/>
+        </w:rPr>
+      </w:pPr>
+    </w:p>
+    <w:p>
+      <w:pPr>
+        <w:rPr>
+          <w:b/>
+          <w:bCs/>
+          <w:sz w:val="32"/>
+          <w:szCs w:val="32"/>
+        </w:rPr>
+      </w:pPr>
+      <w:r>
+        <w:rPr>
+          <w:b/>
+          <w:bCs/>
+          <w:sz w:val="32"/>
+          <w:szCs w:val="32"/>
+        </w:rPr>
+        <w:t>Final Table Structure Summary</w:t>
+      </w:r>
+    </w:p>
+    <w:tbl>
+      <w:tblPr>
+        <w:tblStyle w:val="GridTable4-Accent5"/>
+        <w:tblW w:w="0" w:type="auto"/>
+        <w:jc w:val="center"/>
+        <w:tblLook w:val="04A0" w:firstRow="1" w:lastRow="0" w:firstColumn="1" w:lastColumn="0" w:noHBand="0" w:noVBand="1"/>
+      </w:tblPr>
+      <w:tblGrid>
+        <w:gridCol w:w="1416"/>
+        <w:gridCol w:w="1321"/>
+        <w:gridCol w:w="1778"/>
+        <w:gridCol w:w="2644"/>
+      </w:tblGrid>
+      <w:tr>
+        <w:trPr>
+          <w:cnfStyle w:val="100000000000" w:firstRow="1" w:lastRow="0" w:firstColumn="0" w:lastColumn="0" w:oddVBand="0" w:evenVBand="0" w:oddHBand="0" w:evenHBand="0" w:firstRowFirstColumn="0" w:firstRowLastColumn="0" w:lastRowFirstColumn="0" w:lastRowLastColumn="0"/>
+          <w:jc w:val="center"/>
+        </w:trPr>
+        <w:tc>
+          <w:tcPr>
+            <w:cnfStyle w:val="001000000000" w:firstRow="0" w:lastRow="0" w:firstColumn="1" w:lastColumn="0" w:oddVBand="0" w:evenVBand="0" w:oddHBand="0" w:evenHBand="0" w:firstRowFirstColumn="0" w:firstRowLastColumn="0" w:lastRowFirstColumn="0" w:lastRowLastColumn="0"/>
+            <w:tcW w:w="0" w:type="auto"/>
+            <w:hideMark/>
+          </w:tcPr>
+          <w:p>
+            <w:pPr>
+              <w:spacing w:after="160" w:line="259" w:lineRule="auto"/>
+            </w:pPr>
+            <w:r>
+              <w:t>Table Name</w:t>
+            </w:r>
+          </w:p>
+        </w:tc>
+        <w:tc>
+          <w:tcPr>
+            <w:tcW w:w="0" w:type="auto"/>
+            <w:hideMark/>
+          </w:tcPr>
+          <w:p>
+            <w:pPr>
+              <w:spacing w:after="160" w:line="259" w:lineRule="auto"/>
+              <w:cnfStyle w:val="100000000000" w:firstRow="1" w:lastRow="0" w:firstColumn="0" w:lastColumn="0" w:oddVBand="0" w:evenVBand="0" w:oddHBand="0" w:evenHBand="0" w:firstRowFirstColumn="0" w:firstRowLastColumn="0" w:lastRowFirstColumn="0" w:lastRowLastColumn="0"/>
+            </w:pPr>
+            <w:r>
+              <w:t>Primary Key</w:t>
+            </w:r>
+          </w:p>
+        </w:tc>
+        <w:tc>
+          <w:tcPr>
+            <w:tcW w:w="0" w:type="auto"/>
+            <w:hideMark/>
+          </w:tcPr>
+          <w:p>
+            <w:pPr>
+              <w:spacing w:after="160" w:line="259" w:lineRule="auto"/>
+              <w:cnfStyle w:val="100000000000" w:firstRow="1" w:lastRow="0" w:firstColumn="0" w:lastColumn="0" w:oddVBand="0" w:evenVBand="0" w:oddHBand="0" w:evenHBand="0" w:firstRowFirstColumn="0" w:firstRowLastColumn="0" w:lastRowFirstColumn="0" w:lastRowLastColumn="0"/>
+            </w:pPr>
+            <w:r>
+              <w:t>Foreign Keys</w:t>
+            </w:r>
+          </w:p>
+        </w:tc>
+        <w:tc>
+          <w:tcPr>
+            <w:tcW w:w="0" w:type="auto"/>
+            <w:hideMark/>
+          </w:tcPr>
+          <w:p>
+            <w:pPr>
+              <w:spacing w:after="160" w:line="259" w:lineRule="auto"/>
+              <w:cnfStyle w:val="100000000000" w:firstRow="1" w:lastRow="0" w:firstColumn="0" w:lastColumn="0" w:oddVBand="0" w:evenVBand="0" w:oddHBand="0" w:evenHBand="0" w:firstRowFirstColumn="0" w:firstRowLastColumn="0" w:lastRowFirstColumn="0" w:lastRowLastColumn="0"/>
+            </w:pPr>
+            <w:r>
+              <w:t>Optimization</w:t>
+            </w:r>
+          </w:p>
+        </w:tc>
+      </w:tr>
+      <w:tr>
+        <w:trPr>
+          <w:cnfStyle w:val="000000100000" w:firstRow="0" w:lastRow="0" w:firstColumn="0" w:lastColumn="0" w:oddVBand="0" w:evenVBand="0" w:oddHBand="1" w:evenHBand="0" w:firstRowFirstColumn="0" w:firstRowLastColumn="0" w:lastRowFirstColumn="0" w:lastRowLastColumn="0"/>
+          <w:jc w:val="center"/>
+        </w:trPr>
+        <w:tc>
+          <w:tcPr>
+            <w:cnfStyle w:val="001000000000" w:firstRow="0" w:lastRow="0" w:firstColumn="1" w:lastColumn="0" w:oddVBand="0" w:evenVBand="0" w:oddHBand="0" w:evenHBand="0" w:firstRowFirstColumn="0" w:firstRowLastColumn="0" w:lastRowFirstColumn="0" w:lastRowLastColumn="0"/>
+            <w:tcW w:w="0" w:type="auto"/>
+            <w:hideMark/>
+          </w:tcPr>
+          <w:p>
+            <w:pPr>
+              <w:spacing w:after="160" w:line="259" w:lineRule="auto"/>
+            </w:pPr>
+            <w:r>
+              <w:t>assets</w:t>
+            </w:r>
+          </w:p>
+        </w:tc>
+        <w:tc>
+          <w:tcPr>
+            <w:tcW w:w="0" w:type="auto"/>
+            <w:hideMark/>
+          </w:tcPr>
+          <w:p>
+            <w:pPr>
+              <w:spacing w:after="160" w:line="259" w:lineRule="auto"/>
+              <w:cnfStyle w:val="000000100000" w:firstRow="0" w:lastRow="0" w:firstColumn="0" w:lastColumn="0" w:oddVBand="0" w:evenVBand="0" w:oddHBand="1" w:evenHBand="0" w:firstRowFirstColumn="0" w:firstRowLastColumn="0" w:lastRowFirstColumn="0" w:lastRowLastColumn="0"/>
+            </w:pPr>
+            <w:proofErr w:type="spellStart"/>
+            <w:r>
+              <w:t>asset_id</w:t>
+            </w:r>
+            <w:proofErr w:type="spellEnd"/>
+          </w:p>
+        </w:tc>
+        <w:tc>
+          <w:tcPr>
+            <w:tcW w:w="0" w:type="auto"/>
+            <w:hideMark/>
+          </w:tcPr>
+          <w:p>
+            <w:pPr>
+              <w:spacing w:after="160" w:line="259" w:lineRule="auto"/>
+              <w:cnfStyle w:val="000000100000" w:firstRow="0" w:lastRow="0" w:firstColumn="0" w:lastColumn="0" w:oddVBand="0" w:evenVBand="0" w:oddHBand="1" w:evenHBand="0" w:firstRowFirstColumn="0" w:firstRowLastColumn="0" w:lastRowFirstColumn="0" w:lastRowLastColumn="0"/>
+            </w:pPr>
+            <w:r>
+              <w:t>-</w:t>
+            </w:r>
+          </w:p>
+        </w:tc>
+        <w:tc>
+          <w:tcPr>
+            <w:tcW w:w="0" w:type="auto"/>
+            <w:hideMark/>
+          </w:tcPr>
+          <w:p>
+            <w:pPr>
+              <w:spacing w:after="160" w:line="259" w:lineRule="auto"/>
+              <w:cnfStyle w:val="000000100000" w:firstRow="0" w:lastRow="0" w:firstColumn="0" w:lastColumn="0" w:oddVBand="0" w:evenVBand="0" w:oddHBand="1" w:evenHBand="0" w:firstRowFirstColumn="0" w:firstRowLastColumn="0" w:lastRowFirstColumn="0" w:lastRowLastColumn="0"/>
+            </w:pPr>
+            <w:r>
+              <w:t>Unique Index on symbol</w:t>
+            </w:r>
+          </w:p>
+        </w:tc>
+      </w:tr>
+      <w:tr>
+        <w:trPr>
+          <w:jc w:val="center"/>
+        </w:trPr>
+        <w:tc>
+          <w:tcPr>
+            <w:cnfStyle w:val="001000000000" w:firstRow="0" w:lastRow="0" w:firstColumn="1" w:lastColumn="0" w:oddVBand="0" w:evenVBand="0" w:oddHBand="0" w:evenHBand="0" w:firstRowFirstColumn="0" w:firstRowLastColumn="0" w:lastRowFirstColumn="0" w:lastRowLastColumn="0"/>
+            <w:tcW w:w="0" w:type="auto"/>
+            <w:hideMark/>
+          </w:tcPr>
+          <w:p>
+            <w:pPr>
+              <w:spacing w:after="160" w:line="259" w:lineRule="auto"/>
+            </w:pPr>
+            <w:proofErr w:type="spellStart"/>
+            <w:r>
+              <w:t>price_history</w:t>
+            </w:r>
+            <w:proofErr w:type="spellEnd"/>
+          </w:p>
+        </w:tc>
+        <w:tc>
+          <w:tcPr>
+            <w:tcW w:w="0" w:type="auto"/>
+            <w:hideMark/>
+          </w:tcPr>
+          <w:p>
+            <w:pPr>
+              <w:spacing w:after="160" w:line="259" w:lineRule="auto"/>
+              <w:cnfStyle w:val="000000000000" w:firstRow="0" w:lastRow="0" w:firstColumn="0" w:lastColumn="0" w:oddVBand="0" w:evenVBand="0" w:oddHBand="0" w:evenHBand="0" w:firstRowFirstColumn="0" w:firstRowLastColumn="0" w:lastRowFirstColumn="0" w:lastRowLastColumn="0"/>
+            </w:pPr>
+            <w:proofErr w:type="spellStart"/>
+            <w:r>
+              <w:t>price_id</w:t>
+            </w:r>
+            <w:proofErr w:type="spellEnd"/>
+          </w:p>
+        </w:tc>
+        <w:tc>
+          <w:tcPr>
+            <w:tcW w:w="0" w:type="auto"/>
+            <w:hideMark/>
+          </w:tcPr>
+          <w:p>
+            <w:pPr>
+              <w:spacing w:after="160" w:line="259" w:lineRule="auto"/>
+              <w:cnfStyle w:val="000000000000" w:firstRow="0" w:lastRow="0" w:firstColumn="0" w:lastColumn="0" w:oddVBand="0" w:evenVBand="0" w:oddHBand="0" w:evenHBand="0" w:firstRowFirstColumn="0" w:firstRowLastColumn="0" w:lastRowFirstColumn="0" w:lastRowLastColumn="0"/>
+            </w:pPr>
+            <w:proofErr w:type="spellStart"/>
+            <w:r>
+              <w:t>asset_id</w:t>
+            </w:r>
+            <w:proofErr w:type="spellEnd"/>
+          </w:p>
+        </w:tc>
+        <w:tc>
+          <w:tcPr>
+            <w:tcW w:w="0" w:type="auto"/>
+            <w:hideMark/>
+          </w:tcPr>
+          <w:p>
+            <w:pPr>
+              <w:spacing w:after="160" w:line="259" w:lineRule="auto"/>
+              <w:cnfStyle w:val="000000000000" w:firstRow="0" w:lastRow="0" w:firstColumn="0" w:lastColumn="0" w:oddVBand="0" w:evenVBand="0" w:oddHBand="0" w:evenHBand="0" w:firstRowFirstColumn="0" w:firstRowLastColumn="0" w:lastRowFirstColumn="0" w:lastRowLastColumn="0"/>
+            </w:pPr>
+            <w:r>
+              <w:t>B-Tree Index on timestamp</w:t>
+            </w:r>
+          </w:p>
+        </w:tc>
+      </w:tr>
+      <w:tr>
+        <w:trPr>
+          <w:cnfStyle w:val="000000100000" w:firstRow="0" w:lastRow="0" w:firstColumn="0" w:lastColumn="0" w:oddVBand="0" w:evenVBand="0" w:oddHBand="1" w:evenHBand="0" w:firstRowFirstColumn="0" w:firstRowLastColumn="0" w:lastRowFirstColumn="0" w:lastRowLastColumn="0"/>
+          <w:jc w:val="center"/>
+        </w:trPr>
+        <w:tc>
+          <w:tcPr>
+            <w:cnfStyle w:val="001000000000" w:firstRow="0" w:lastRow="0" w:firstColumn="1" w:lastColumn="0" w:oddVBand="0" w:evenVBand="0" w:oddHBand="0" w:evenHBand="0" w:firstRowFirstColumn="0" w:firstRowLastColumn="0" w:lastRowFirstColumn="0" w:lastRowLastColumn="0"/>
+            <w:tcW w:w="0" w:type="auto"/>
+            <w:hideMark/>
+          </w:tcPr>
+          <w:p>
+            <w:pPr>
+              <w:spacing w:after="160" w:line="259" w:lineRule="auto"/>
+            </w:pPr>
+            <w:r>
+              <w:t>anomalies</w:t>
+            </w:r>
+          </w:p>
+        </w:tc>
+        <w:tc>
+          <w:tcPr>
+            <w:tcW w:w="0" w:type="auto"/>
+            <w:hideMark/>
+          </w:tcPr>
+          <w:p>
+            <w:pPr>
+              <w:spacing w:after="160" w:line="259" w:lineRule="auto"/>
+              <w:cnfStyle w:val="000000100000" w:firstRow="0" w:lastRow="0" w:firstColumn="0" w:lastColumn="0" w:oddVBand="0" w:evenVBand="0" w:oddHBand="1" w:evenHBand="0" w:firstRowFirstColumn="0" w:firstRowLastColumn="0" w:lastRowFirstColumn="0" w:lastRowLastColumn="0"/>
+            </w:pPr>
+            <w:proofErr w:type="spellStart"/>
+            <w:r>
+              <w:t>anomaly_id</w:t>
+            </w:r>
+            <w:proofErr w:type="spellEnd"/>
+          </w:p>
+        </w:tc>
+        <w:tc>
+          <w:tcPr>
+            <w:tcW w:w="0" w:type="auto"/>
+            <w:hideMark/>
+          </w:tcPr>
+          <w:p>
+            <w:pPr>
+              <w:spacing w:after="160" w:line="259" w:lineRule="auto"/>
+              <w:cnfStyle w:val="000000100000" w:firstRow="0" w:lastRow="0" w:firstColumn="0" w:lastColumn="0" w:oddVBand="0" w:evenVBand="0" w:oddHBand="1" w:evenHBand="0" w:firstRowFirstColumn="0" w:firstRowLastColumn="0" w:lastRowFirstColumn="0" w:lastRowLastColumn="0"/>
+            </w:pPr>
+            <w:proofErr w:type="spellStart"/>
+            <w:r>
+              <w:t>asset_id</w:t>
+            </w:r>
+            <w:proofErr w:type="spellEnd"/>
+            <w:r>
+              <w:t>, </w:t>
+            </w:r>
+            <w:proofErr w:type="spellStart"/>
+            <w:r>
+              <w:t>price_id</w:t>
+            </w:r>
+            <w:proofErr w:type="spellEnd"/>
+          </w:p>
+        </w:tc>
+        <w:tc>
+          <w:tcPr>
+            <w:tcW w:w="0" w:type="auto"/>
+            <w:hideMark/>
+          </w:tcPr>
+          <w:p>
+            <w:pPr>
+              <w:spacing w:after="160" w:line="259" w:lineRule="auto"/>
+              <w:cnfStyle w:val="000000100000" w:firstRow="0" w:lastRow="0" w:firstColumn="0" w:lastColumn="0" w:oddVBand="0" w:evenVBand="0" w:oddHBand="1" w:evenHBand="0" w:firstRowFirstColumn="0" w:firstRowLastColumn="0" w:lastRowFirstColumn="0" w:lastRowLastColumn="0"/>
+            </w:pPr>
+            <w:r>
+              <w:t>Index on severity</w:t>
+            </w:r>
+          </w:p>
+        </w:tc>
+      </w:tr>
+      <w:tr>
+        <w:trPr>
+          <w:jc w:val="center"/>
+        </w:trPr>
+        <w:tc>
+          <w:tcPr>
+            <w:cnfStyle w:val="001000000000" w:firstRow="0" w:lastRow="0" w:firstColumn="1" w:lastColumn="0" w:oddVBand="0" w:evenVBand="0" w:oddHBand="0" w:evenHBand="0" w:firstRowFirstColumn="0" w:firstRowLastColumn="0" w:lastRowFirstColumn="0" w:lastRowLastColumn="0"/>
+            <w:tcW w:w="0" w:type="auto"/>
+            <w:hideMark/>
+          </w:tcPr>
+          <w:p>
+            <w:pPr>
+              <w:spacing w:after="160" w:line="259" w:lineRule="auto"/>
+            </w:pPr>
+            <w:r>
+              <w:t>alerts</w:t>
+            </w:r>
+          </w:p>
+        </w:tc>
+        <w:tc>
+          <w:tcPr>
+            <w:tcW w:w="0" w:type="auto"/>
+            <w:hideMark/>
+          </w:tcPr>
+          <w:p>
+            <w:pPr>
+              <w:spacing w:after="160" w:line="259" w:lineRule="auto"/>
+              <w:cnfStyle w:val="000000000000" w:firstRow="0" w:lastRow="0" w:firstColumn="0" w:lastColumn="0" w:oddVBand="0" w:evenVBand="0" w:oddHBand="0" w:evenHBand="0" w:firstRowFirstColumn="0" w:firstRowLastColumn="0" w:lastRowFirstColumn="0" w:lastRowLastColumn="0"/>
+            </w:pPr>
+            <w:proofErr w:type="spellStart"/>
+            <w:r>
+              <w:t>alert_id</w:t>
+            </w:r>
+            <w:proofErr w:type="spellEnd"/>
+          </w:p>
+        </w:tc>
+        <w:tc>
+          <w:tcPr>
+            <w:tcW w:w="0" w:type="auto"/>
+            <w:hideMark/>
+          </w:tcPr>
+          <w:p>
+            <w:pPr>
+              <w:spacing w:after="160" w:line="259" w:lineRule="auto"/>
+              <w:cnfStyle w:val="000000000000" w:firstRow="0" w:lastRow="0" w:firstColumn="0" w:lastColumn="0" w:oddVBand="0" w:evenVBand="0" w:oddHBand="0" w:evenHBand="0" w:firstRowFirstColumn="0" w:firstRowLastColumn="0" w:lastRowFirstColumn="0" w:lastRowLastColumn="0"/>
+            </w:pPr>
+            <w:proofErr w:type="spellStart"/>
+            <w:r>
+              <w:t>anomaly_id</w:t>
+            </w:r>
+            <w:proofErr w:type="spellEnd"/>
+          </w:p>
+        </w:tc>
+        <w:tc>
+          <w:tcPr>
+            <w:tcW w:w="0" w:type="auto"/>
+            <w:hideMark/>
+          </w:tcPr>
+          <w:p>
+            <w:pPr>
+              <w:spacing w:after="160" w:line="259" w:lineRule="auto"/>
+              <w:cnfStyle w:val="000000000000" w:firstRow="0" w:lastRow="0" w:firstColumn="0" w:lastColumn="0" w:oddVBand="0" w:evenVBand="0" w:oddHBand="0" w:evenHBand="0" w:firstRowFirstColumn="0" w:firstRowLastColumn="0" w:lastRowFirstColumn="0" w:lastRowLastColumn="0"/>
+            </w:pPr>
+            <w:r>
+              <w:t>-</w:t>
+            </w:r>
+          </w:p>
+        </w:tc>
+      </w:tr>
+      <w:tr>
+        <w:trPr>
+          <w:cnfStyle w:val="000000100000" w:firstRow="0" w:lastRow="0" w:firstColumn="0" w:lastColumn="0" w:oddVBand="0" w:evenVBand="0" w:oddHBand="1" w:evenHBand="0" w:firstRowFirstColumn="0" w:firstRowLastColumn="0" w:lastRowFirstColumn="0" w:lastRowLastColumn="0"/>
+          <w:jc w:val="center"/>
+        </w:trPr>
+        <w:tc>
+          <w:tcPr>
+            <w:cnfStyle w:val="001000000000" w:firstRow="0" w:lastRow="0" w:firstColumn="1" w:lastColumn="0" w:oddVBand="0" w:evenVBand="0" w:oddHBand="0" w:evenHBand="0" w:firstRowFirstColumn="0" w:firstRowLastColumn="0" w:lastRowFirstColumn="0" w:lastRowLastColumn="0"/>
+            <w:tcW w:w="0" w:type="auto"/>
+            <w:hideMark/>
+          </w:tcPr>
+          <w:p>
+            <w:pPr>
+              <w:spacing w:after="160" w:line="259" w:lineRule="auto"/>
+            </w:pPr>
+            <w:r>
+              <w:t>users</w:t>
+            </w:r>
+          </w:p>
+        </w:tc>
+        <w:tc>
+          <w:tcPr>
+            <w:tcW w:w="0" w:type="auto"/>
+            <w:hideMark/>
+          </w:tcPr>
+          <w:p>
+            <w:pPr>
+              <w:spacing w:after="160" w:line="259" w:lineRule="auto"/>
+              <w:cnfStyle w:val="000000100000" w:firstRow="0" w:lastRow="0" w:firstColumn="0" w:lastColumn="0" w:oddVBand="0" w:evenVBand="0" w:oddHBand="1" w:evenHBand="0" w:firstRowFirstColumn="0" w:firstRowLastColumn="0" w:lastRowFirstColumn="0" w:lastRowLastColumn="0"/>
+            </w:pPr>
+            <w:proofErr w:type="spellStart"/>
+            <w:r>
+              <w:t>user_id</w:t>
+            </w:r>
+            <w:proofErr w:type="spellEnd"/>
+          </w:p>
+        </w:tc>
+        <w:tc>
+          <w:tcPr>
+            <w:tcW w:w="0" w:type="auto"/>
+            <w:hideMark/>
+          </w:tcPr>
+          <w:p>
+            <w:pPr>
+              <w:spacing w:after="160" w:line="259" w:lineRule="auto"/>
+              <w:cnfStyle w:val="000000100000" w:firstRow="0" w:lastRow="0" w:firstColumn="0" w:lastColumn="0" w:oddVBand="0" w:evenVBand="0" w:oddHBand="1" w:evenHBand="0" w:firstRowFirstColumn="0" w:firstRowLastColumn="0" w:lastRowFirstColumn="0" w:lastRowLastColumn="0"/>
+            </w:pPr>
+            <w:r>
+              <w:t>-</w:t>
+            </w:r>
+          </w:p>
+        </w:tc>
+        <w:tc>
+          <w:tcPr>
+            <w:tcW w:w="0" w:type="auto"/>
+            <w:hideMark/>
+          </w:tcPr>
+          <w:p>
+            <w:pPr>
+              <w:spacing w:after="160" w:line="259" w:lineRule="auto"/>
+              <w:cnfStyle w:val="000000100000" w:firstRow="0" w:lastRow="0" w:firstColumn="0" w:lastColumn="0" w:oddVBand="0" w:evenVBand="0" w:oddHBand="1" w:evenHBand="0" w:firstRowFirstColumn="0" w:firstRowLastColumn="0" w:lastRowFirstColumn="0" w:lastRowLastColumn="0"/>
+            </w:pPr>
+            <w:r>
+              <w:t>Unique Index on username</w:t>
+            </w:r>
+          </w:p>
+        </w:tc>
+      </w:tr>
+    </w:tbl>
+    <w:p>
+      <w:pPr>
+        <w:pBdr>
+          <w:bottom w:val="single" w:sz="6" w:space="1" w:color="auto"/>
+        </w:pBdr>
+      </w:pPr>
+    </w:p>
+    <w:p/>
+    <w:p>
+      <w:pPr>
+        <w:jc w:val="center"/>
+        <w:rPr>
+          <w:rFonts w:asciiTheme="majorBidi" w:hAnsiTheme="majorBidi" w:cstheme="majorBidi"/>
+          <w:b/>
+          <w:bCs/>
+          <w:sz w:val="72"/>
+          <w:szCs w:val="72"/>
         </w:rPr>
       </w:pPr>
     </w:p>
@@ -4134,6 +5111,155 @@
     </w:lvl>
   </w:abstractNum>
   <w:abstractNum w:abstractNumId="3" w15:restartNumberingAfterBreak="0">
+    <w:nsid w:val="6EA614A1"/>
+    <w:multiLevelType w:val="multilevel"/>
+    <w:tmpl w:val="0DFA7C30"/>
+    <w:lvl w:ilvl="0">
+      <w:start w:val="1"/>
+      <w:numFmt w:val="bullet"/>
+      <w:lvlText w:val=""/>
+      <w:lvlJc w:val="left"/>
+      <w:pPr>
+        <w:tabs>
+          <w:tab w:val="num" w:pos="720"/>
+        </w:tabs>
+        <w:ind w:left="720" w:hanging="360"/>
+      </w:pPr>
+      <w:rPr>
+        <w:rFonts w:ascii="Symbol" w:hAnsi="Symbol" w:hint="default"/>
+        <w:sz w:val="20"/>
+      </w:rPr>
+    </w:lvl>
+    <w:lvl w:ilvl="1" w:tentative="1">
+      <w:start w:val="1"/>
+      <w:numFmt w:val="bullet"/>
+      <w:lvlText w:val="o"/>
+      <w:lvlJc w:val="left"/>
+      <w:pPr>
+        <w:tabs>
+          <w:tab w:val="num" w:pos="1440"/>
+        </w:tabs>
+        <w:ind w:left="1440" w:hanging="360"/>
+      </w:pPr>
+      <w:rPr>
+        <w:rFonts w:ascii="Courier New" w:hAnsi="Courier New" w:hint="default"/>
+        <w:sz w:val="20"/>
+      </w:rPr>
+    </w:lvl>
+    <w:lvl w:ilvl="2" w:tentative="1">
+      <w:start w:val="1"/>
+      <w:numFmt w:val="bullet"/>
+      <w:lvlText w:val=""/>
+      <w:lvlJc w:val="left"/>
+      <w:pPr>
+        <w:tabs>
+          <w:tab w:val="num" w:pos="2160"/>
+        </w:tabs>
+        <w:ind w:left="2160" w:hanging="360"/>
+      </w:pPr>
+      <w:rPr>
+        <w:rFonts w:ascii="Wingdings" w:hAnsi="Wingdings" w:hint="default"/>
+        <w:sz w:val="20"/>
+      </w:rPr>
+    </w:lvl>
+    <w:lvl w:ilvl="3" w:tentative="1">
+      <w:start w:val="1"/>
+      <w:numFmt w:val="bullet"/>
+      <w:lvlText w:val=""/>
+      <w:lvlJc w:val="left"/>
+      <w:pPr>
+        <w:tabs>
+          <w:tab w:val="num" w:pos="2880"/>
+        </w:tabs>
+        <w:ind w:left="2880" w:hanging="360"/>
+      </w:pPr>
+      <w:rPr>
+        <w:rFonts w:ascii="Wingdings" w:hAnsi="Wingdings" w:hint="default"/>
+        <w:sz w:val="20"/>
+      </w:rPr>
+    </w:lvl>
+    <w:lvl w:ilvl="4" w:tentative="1">
+      <w:start w:val="1"/>
+      <w:numFmt w:val="bullet"/>
+      <w:lvlText w:val=""/>
+      <w:lvlJc w:val="left"/>
+      <w:pPr>
+        <w:tabs>
+          <w:tab w:val="num" w:pos="3600"/>
+        </w:tabs>
+        <w:ind w:left="3600" w:hanging="360"/>
+      </w:pPr>
+      <w:rPr>
+        <w:rFonts w:ascii="Wingdings" w:hAnsi="Wingdings" w:hint="default"/>
+        <w:sz w:val="20"/>
+      </w:rPr>
+    </w:lvl>
+    <w:lvl w:ilvl="5" w:tentative="1">
+      <w:start w:val="1"/>
+      <w:numFmt w:val="bullet"/>
+      <w:lvlText w:val=""/>
+      <w:lvlJc w:val="left"/>
+      <w:pPr>
+        <w:tabs>
+          <w:tab w:val="num" w:pos="4320"/>
+        </w:tabs>
+        <w:ind w:left="4320" w:hanging="360"/>
+      </w:pPr>
+      <w:rPr>
+        <w:rFonts w:ascii="Wingdings" w:hAnsi="Wingdings" w:hint="default"/>
+        <w:sz w:val="20"/>
+      </w:rPr>
+    </w:lvl>
+    <w:lvl w:ilvl="6" w:tentative="1">
+      <w:start w:val="1"/>
+      <w:numFmt w:val="bullet"/>
+      <w:lvlText w:val=""/>
+      <w:lvlJc w:val="left"/>
+      <w:pPr>
+        <w:tabs>
+          <w:tab w:val="num" w:pos="5040"/>
+        </w:tabs>
+        <w:ind w:left="5040" w:hanging="360"/>
+      </w:pPr>
+      <w:rPr>
+        <w:rFonts w:ascii="Wingdings" w:hAnsi="Wingdings" w:hint="default"/>
+        <w:sz w:val="20"/>
+      </w:rPr>
+    </w:lvl>
+    <w:lvl w:ilvl="7" w:tentative="1">
+      <w:start w:val="1"/>
+      <w:numFmt w:val="bullet"/>
+      <w:lvlText w:val=""/>
+      <w:lvlJc w:val="left"/>
+      <w:pPr>
+        <w:tabs>
+          <w:tab w:val="num" w:pos="5760"/>
+        </w:tabs>
+        <w:ind w:left="5760" w:hanging="360"/>
+      </w:pPr>
+      <w:rPr>
+        <w:rFonts w:ascii="Wingdings" w:hAnsi="Wingdings" w:hint="default"/>
+        <w:sz w:val="20"/>
+      </w:rPr>
+    </w:lvl>
+    <w:lvl w:ilvl="8" w:tentative="1">
+      <w:start w:val="1"/>
+      <w:numFmt w:val="bullet"/>
+      <w:lvlText w:val=""/>
+      <w:lvlJc w:val="left"/>
+      <w:pPr>
+        <w:tabs>
+          <w:tab w:val="num" w:pos="6480"/>
+        </w:tabs>
+        <w:ind w:left="6480" w:hanging="360"/>
+      </w:pPr>
+      <w:rPr>
+        <w:rFonts w:ascii="Wingdings" w:hAnsi="Wingdings" w:hint="default"/>
+        <w:sz w:val="20"/>
+      </w:rPr>
+    </w:lvl>
+  </w:abstractNum>
+  <w:abstractNum w:abstractNumId="4" w15:restartNumberingAfterBreak="0">
     <w:nsid w:val="79E05096"/>
     <w:multiLevelType w:val="multilevel"/>
     <w:tmpl w:val="ADAE6B7A"/>
@@ -4283,7 +5409,7 @@
     </w:lvl>
   </w:abstractNum>
   <w:num w:numId="1" w16cid:durableId="1366784308">
-    <w:abstractNumId w:val="3"/>
+    <w:abstractNumId w:val="4"/>
   </w:num>
   <w:num w:numId="2" w16cid:durableId="253170238">
     <w:abstractNumId w:val="1"/>
@@ -4293,6 +5419,9 @@
   </w:num>
   <w:num w:numId="4" w16cid:durableId="198903813">
     <w:abstractNumId w:val="0"/>
+  </w:num>
+  <w:num w:numId="5" w16cid:durableId="1541237145">
+    <w:abstractNumId w:val="3"/>
   </w:num>
 </w:numbering>
 </file>
@@ -4695,7 +5824,7 @@
   <w:style w:type="paragraph" w:default="1" w:styleId="Normal">
     <w:name w:val="Normal"/>
     <w:qFormat/>
-    <w:rsid w:val="006F7F78"/>
+    <w:rsid w:val="001C1957"/>
   </w:style>
   <w:style w:type="character" w:default="1" w:styleId="DefaultParagraphFont">
     <w:name w:val="Default Paragraph Font"/>
@@ -6153,6 +7282,82 @@
       <w:tblPr/>
       <w:tcPr>
         <w:shd w:val="clear" w:color="auto" w:fill="DEEAF6" w:themeFill="accent1" w:themeFillTint="33"/>
+      </w:tcPr>
+    </w:tblStylePr>
+  </w:style>
+  <w:style w:type="table" w:styleId="GridTable4-Accent5">
+    <w:name w:val="Grid Table 4 Accent 5"/>
+    <w:basedOn w:val="TableNormal"/>
+    <w:uiPriority w:val="49"/>
+    <w:rsid w:val="001C1957"/>
+    <w:pPr>
+      <w:spacing w:after="0" w:line="240" w:lineRule="auto"/>
+    </w:pPr>
+    <w:tblPr>
+      <w:tblStyleRowBandSize w:val="1"/>
+      <w:tblStyleColBandSize w:val="1"/>
+      <w:tblBorders>
+        <w:top w:val="single" w:sz="4" w:space="0" w:color="8EAADB" w:themeColor="accent5" w:themeTint="99"/>
+        <w:left w:val="single" w:sz="4" w:space="0" w:color="8EAADB" w:themeColor="accent5" w:themeTint="99"/>
+        <w:bottom w:val="single" w:sz="4" w:space="0" w:color="8EAADB" w:themeColor="accent5" w:themeTint="99"/>
+        <w:right w:val="single" w:sz="4" w:space="0" w:color="8EAADB" w:themeColor="accent5" w:themeTint="99"/>
+        <w:insideH w:val="single" w:sz="4" w:space="0" w:color="8EAADB" w:themeColor="accent5" w:themeTint="99"/>
+        <w:insideV w:val="single" w:sz="4" w:space="0" w:color="8EAADB" w:themeColor="accent5" w:themeTint="99"/>
+      </w:tblBorders>
+    </w:tblPr>
+    <w:tblStylePr w:type="firstRow">
+      <w:rPr>
+        <w:b/>
+        <w:bCs/>
+        <w:color w:val="FFFFFF" w:themeColor="background1"/>
+      </w:rPr>
+      <w:tblPr/>
+      <w:tcPr>
+        <w:tcBorders>
+          <w:top w:val="single" w:sz="4" w:space="0" w:color="4472C4" w:themeColor="accent5"/>
+          <w:left w:val="single" w:sz="4" w:space="0" w:color="4472C4" w:themeColor="accent5"/>
+          <w:bottom w:val="single" w:sz="4" w:space="0" w:color="4472C4" w:themeColor="accent5"/>
+          <w:right w:val="single" w:sz="4" w:space="0" w:color="4472C4" w:themeColor="accent5"/>
+          <w:insideH w:val="nil"/>
+          <w:insideV w:val="nil"/>
+        </w:tcBorders>
+        <w:shd w:val="clear" w:color="auto" w:fill="4472C4" w:themeFill="accent5"/>
+      </w:tcPr>
+    </w:tblStylePr>
+    <w:tblStylePr w:type="lastRow">
+      <w:rPr>
+        <w:b/>
+        <w:bCs/>
+      </w:rPr>
+      <w:tblPr/>
+      <w:tcPr>
+        <w:tcBorders>
+          <w:top w:val="double" w:sz="4" w:space="0" w:color="4472C4" w:themeColor="accent5"/>
+        </w:tcBorders>
+      </w:tcPr>
+    </w:tblStylePr>
+    <w:tblStylePr w:type="firstCol">
+      <w:rPr>
+        <w:b/>
+        <w:bCs/>
+      </w:rPr>
+    </w:tblStylePr>
+    <w:tblStylePr w:type="lastCol">
+      <w:rPr>
+        <w:b/>
+        <w:bCs/>
+      </w:rPr>
+    </w:tblStylePr>
+    <w:tblStylePr w:type="band1Vert">
+      <w:tblPr/>
+      <w:tcPr>
+        <w:shd w:val="clear" w:color="auto" w:fill="D9E2F3" w:themeFill="accent5" w:themeFillTint="33"/>
+      </w:tcPr>
+    </w:tblStylePr>
+    <w:tblStylePr w:type="band1Horz">
+      <w:tblPr/>
+      <w:tcPr>
+        <w:shd w:val="clear" w:color="auto" w:fill="D9E2F3" w:themeFill="accent5" w:themeFillTint="33"/>
       </w:tcPr>
     </w:tblStylePr>
   </w:style>

</xml_diff>

<commit_message>
m5: updated version control document with data population details
</commit_message>
<xml_diff>
--- a/Crypto & Stock Anomaly Detection System - Version Control Document.docx
+++ b/Crypto & Stock Anomaly Detection System - Version Control Document.docx
@@ -1366,15 +1366,7 @@
                 <w:sz w:val="32"/>
                 <w:szCs w:val="32"/>
               </w:rPr>
-              <w:t xml:space="preserve"> 1.</w:t>
-            </w:r>
-            <w:r>
-              <w:rPr>
-                <w:rFonts w:ascii="Calibri" w:hAnsi="Calibri" w:cs="Calibri"/>
-                <w:sz w:val="32"/>
-                <w:szCs w:val="32"/>
-              </w:rPr>
-              <w:t>3</w:t>
+              <w:t xml:space="preserve"> 1.3</w:t>
             </w:r>
           </w:p>
         </w:tc>
@@ -1435,6 +1427,159 @@
                 <w:szCs w:val="32"/>
               </w:rPr>
               <w:t>, 2026</w:t>
+            </w:r>
+          </w:p>
+        </w:tc>
+      </w:tr>
+      <w:tr>
+        <w:trPr>
+          <w:trHeight w:val="1396"/>
+        </w:trPr>
+        <w:tc>
+          <w:tcPr>
+            <w:tcW w:w="2611" w:type="dxa"/>
+          </w:tcPr>
+          <w:p>
+            <w:pPr>
+              <w:jc w:val="center"/>
+              <w:rPr>
+                <w:rFonts w:asciiTheme="majorBidi" w:hAnsiTheme="majorBidi" w:cstheme="majorBidi"/>
+                <w:sz w:val="32"/>
+                <w:szCs w:val="32"/>
+              </w:rPr>
+            </w:pPr>
+            <w:r>
+              <w:rPr>
+                <w:rFonts w:asciiTheme="majorBidi" w:hAnsiTheme="majorBidi" w:cstheme="majorBidi"/>
+                <w:sz w:val="32"/>
+                <w:szCs w:val="32"/>
+              </w:rPr>
+              <w:t>Data Population &amp; Validation (DML)</w:t>
+            </w:r>
+          </w:p>
+          <w:p>
+            <w:pPr>
+              <w:jc w:val="center"/>
+              <w:rPr>
+                <w:rFonts w:asciiTheme="majorBidi" w:hAnsiTheme="majorBidi" w:cstheme="majorBidi"/>
+                <w:sz w:val="32"/>
+                <w:szCs w:val="32"/>
+              </w:rPr>
+            </w:pPr>
+          </w:p>
+        </w:tc>
+        <w:tc>
+          <w:tcPr>
+            <w:tcW w:w="2611" w:type="dxa"/>
+          </w:tcPr>
+          <w:p>
+            <w:pPr>
+              <w:jc w:val="center"/>
+              <w:rPr>
+                <w:rFonts w:ascii="Calibri" w:hAnsi="Calibri" w:cs="Calibri"/>
+                <w:sz w:val="32"/>
+                <w:szCs w:val="32"/>
+              </w:rPr>
+            </w:pPr>
+          </w:p>
+          <w:p>
+            <w:pPr>
+              <w:jc w:val="center"/>
+              <w:rPr>
+                <w:rFonts w:ascii="Calibri" w:hAnsi="Calibri" w:cs="Calibri"/>
+                <w:sz w:val="32"/>
+                <w:szCs w:val="32"/>
+              </w:rPr>
+            </w:pPr>
+            <w:r>
+              <w:rPr>
+                <w:rFonts w:ascii="Calibri" w:hAnsi="Calibri" w:cs="Calibri"/>
+                <w:sz w:val="32"/>
+                <w:szCs w:val="32"/>
+              </w:rPr>
+              <w:t>Ver</w:t>
+            </w:r>
+            <w:r>
+              <w:rPr>
+                <w:rFonts w:ascii="Calibri" w:hAnsi="Calibri" w:cs="Calibri"/>
+                <w:sz w:val="32"/>
+                <w:szCs w:val="32"/>
+              </w:rPr>
+              <w:t>s</w:t>
+            </w:r>
+            <w:r>
+              <w:rPr>
+                <w:rFonts w:ascii="Calibri" w:hAnsi="Calibri" w:cs="Calibri"/>
+                <w:sz w:val="32"/>
+                <w:szCs w:val="32"/>
+              </w:rPr>
+              <w:t>ion</w:t>
+            </w:r>
+            <w:r>
+              <w:rPr>
+                <w:rFonts w:ascii="Calibri" w:hAnsi="Calibri" w:cs="Calibri"/>
+                <w:sz w:val="32"/>
+                <w:szCs w:val="32"/>
+              </w:rPr>
+              <w:t xml:space="preserve"> 1.</w:t>
+            </w:r>
+            <w:r>
+              <w:rPr>
+                <w:rFonts w:ascii="Calibri" w:hAnsi="Calibri" w:cs="Calibri"/>
+                <w:sz w:val="32"/>
+                <w:szCs w:val="32"/>
+              </w:rPr>
+              <w:t>4</w:t>
+            </w:r>
+          </w:p>
+        </w:tc>
+        <w:tc>
+          <w:tcPr>
+            <w:tcW w:w="2611" w:type="dxa"/>
+          </w:tcPr>
+          <w:p>
+            <w:pPr>
+              <w:jc w:val="center"/>
+              <w:rPr>
+                <w:rFonts w:asciiTheme="majorBidi" w:hAnsiTheme="majorBidi" w:cstheme="majorBidi"/>
+                <w:b/>
+                <w:bCs/>
+                <w:sz w:val="32"/>
+                <w:szCs w:val="32"/>
+              </w:rPr>
+            </w:pPr>
+          </w:p>
+        </w:tc>
+        <w:tc>
+          <w:tcPr>
+            <w:tcW w:w="2611" w:type="dxa"/>
+          </w:tcPr>
+          <w:p>
+            <w:pPr>
+              <w:jc w:val="center"/>
+              <w:rPr>
+                <w:rFonts w:ascii="Calibri" w:hAnsi="Calibri" w:cs="Calibri"/>
+                <w:sz w:val="32"/>
+                <w:szCs w:val="32"/>
+              </w:rPr>
+            </w:pPr>
+          </w:p>
+          <w:p>
+            <w:pPr>
+              <w:jc w:val="center"/>
+              <w:rPr>
+                <w:rFonts w:ascii="Calibri" w:hAnsi="Calibri" w:cs="Calibri"/>
+                <w:sz w:val="32"/>
+                <w:szCs w:val="32"/>
+              </w:rPr>
+            </w:pPr>
+            <w:r>
+              <w:rPr>
+                <w:rFonts w:ascii="Calibri" w:hAnsi="Calibri" w:cs="Calibri"/>
+                <w:sz w:val="32"/>
+                <w:szCs w:val="32"/>
+              </w:rPr>
+              <w:t>May 17, 2026</w:t>
             </w:r>
           </w:p>
         </w:tc>
@@ -3206,7 +3351,6 @@
           <w:sz w:val="72"/>
           <w:szCs w:val="72"/>
         </w:rPr>
-        <w:lastRenderedPageBreak/>
         <w:t xml:space="preserve">Milestone 3 </w:t>
       </w:r>
     </w:p>
@@ -3848,6 +3992,7 @@
           <w:sz w:val="28"/>
           <w:szCs w:val="28"/>
         </w:rPr>
+        <w:lastRenderedPageBreak/>
         <w:t>data_exports</w:t>
       </w:r>
       <w:proofErr w:type="spellEnd"/>
@@ -4653,6 +4798,241 @@
       </w:pPr>
     </w:p>
     <w:p/>
+    <w:p>
+      <w:pPr>
+        <w:jc w:val="center"/>
+        <w:rPr>
+          <w:rFonts w:asciiTheme="majorBidi" w:hAnsiTheme="majorBidi" w:cstheme="majorBidi"/>
+          <w:b/>
+          <w:bCs/>
+          <w:sz w:val="56"/>
+          <w:szCs w:val="56"/>
+        </w:rPr>
+      </w:pPr>
+      <w:r>
+        <w:rPr>
+          <w:rFonts w:asciiTheme="majorBidi" w:hAnsiTheme="majorBidi" w:cstheme="majorBidi"/>
+          <w:b/>
+          <w:bCs/>
+          <w:sz w:val="56"/>
+          <w:szCs w:val="56"/>
+        </w:rPr>
+        <w:t xml:space="preserve">Milestone </w:t>
+      </w:r>
+      <w:r>
+        <w:rPr>
+          <w:rFonts w:asciiTheme="majorBidi" w:hAnsiTheme="majorBidi" w:cstheme="majorBidi"/>
+          <w:b/>
+          <w:bCs/>
+          <w:sz w:val="56"/>
+          <w:szCs w:val="56"/>
+        </w:rPr>
+        <w:t>5</w:t>
+      </w:r>
+    </w:p>
+    <w:p>
+      <w:pPr>
+        <w:jc w:val="center"/>
+        <w:rPr>
+          <w:rFonts w:asciiTheme="majorBidi" w:hAnsiTheme="majorBidi"/>
+          <w:b/>
+          <w:bCs/>
+          <w:sz w:val="44"/>
+          <w:szCs w:val="44"/>
+        </w:rPr>
+      </w:pPr>
+      <w:r>
+        <w:rPr>
+          <w:rFonts w:ascii="Segoe UI" w:eastAsia="Times New Roman" w:hAnsi="Segoe UI" w:cs="Segoe UI"/>
+          <w:b/>
+          <w:bCs/>
+          <w:i/>
+          <w:iCs/>
+          <w:color w:val="ABB2BF"/>
+          <w:sz w:val="20"/>
+          <w:szCs w:val="20"/>
+        </w:rPr>
+        <w:t xml:space="preserve"> </w:t>
+      </w:r>
+      <w:r>
+        <w:rPr>
+          <w:rFonts w:asciiTheme="majorBidi" w:hAnsiTheme="majorBidi"/>
+          <w:b/>
+          <w:bCs/>
+          <w:sz w:val="44"/>
+          <w:szCs w:val="44"/>
+        </w:rPr>
+        <w:t>Data Population &amp; Validation (DML)</w:t>
+      </w:r>
+    </w:p>
+    <w:p>
+      <w:pPr>
+        <w:rPr>
+          <w:sz w:val="36"/>
+          <w:szCs w:val="36"/>
+        </w:rPr>
+      </w:pPr>
+      <w:r>
+        <w:rPr>
+          <w:b/>
+          <w:bCs/>
+          <w:sz w:val="36"/>
+          <w:szCs w:val="36"/>
+        </w:rPr>
+        <w:t>Operations performed:</w:t>
+      </w:r>
+    </w:p>
+    <w:p>
+      <w:pPr>
+        <w:numPr>
+          <w:ilvl w:val="0"/>
+          <w:numId w:val="6"/>
+        </w:numPr>
+        <w:rPr>
+          <w:sz w:val="28"/>
+          <w:szCs w:val="28"/>
+        </w:rPr>
+      </w:pPr>
+      <w:r>
+        <w:rPr>
+          <w:b/>
+          <w:bCs/>
+          <w:sz w:val="28"/>
+          <w:szCs w:val="28"/>
+        </w:rPr>
+        <w:t>Bulk Ingestion:</w:t>
+      </w:r>
+      <w:r>
+        <w:rPr>
+          <w:sz w:val="28"/>
+          <w:szCs w:val="28"/>
+        </w:rPr>
+        <w:t> Loaded approximately 400 rows of real-market data from assets.csv and price_history.csv using the LOAD DATA INFILE command.</w:t>
+      </w:r>
+    </w:p>
+    <w:p>
+      <w:pPr>
+        <w:numPr>
+          <w:ilvl w:val="0"/>
+          <w:numId w:val="6"/>
+        </w:numPr>
+        <w:rPr>
+          <w:sz w:val="28"/>
+          <w:szCs w:val="28"/>
+        </w:rPr>
+      </w:pPr>
+      <w:r>
+        <w:rPr>
+          <w:b/>
+          <w:bCs/>
+          <w:sz w:val="28"/>
+          <w:szCs w:val="28"/>
+        </w:rPr>
+        <w:t>DML Tasks:</w:t>
+      </w:r>
+    </w:p>
+    <w:p>
+      <w:pPr>
+        <w:numPr>
+          <w:ilvl w:val="1"/>
+          <w:numId w:val="6"/>
+        </w:numPr>
+        <w:rPr>
+          <w:sz w:val="28"/>
+          <w:szCs w:val="28"/>
+        </w:rPr>
+      </w:pPr>
+      <w:r>
+        <w:rPr>
+          <w:sz w:val="28"/>
+          <w:szCs w:val="28"/>
+        </w:rPr>
+        <w:t>Executed an UPDATE to standardize asset names.</w:t>
+      </w:r>
+    </w:p>
+    <w:p>
+      <w:pPr>
+        <w:numPr>
+          <w:ilvl w:val="1"/>
+          <w:numId w:val="6"/>
+        </w:numPr>
+        <w:rPr>
+          <w:sz w:val="28"/>
+          <w:szCs w:val="28"/>
+        </w:rPr>
+      </w:pPr>
+      <w:r>
+        <w:rPr>
+          <w:sz w:val="28"/>
+          <w:szCs w:val="28"/>
+        </w:rPr>
+        <w:t>Executed a DELETE operation to prune invalid/test price records.</w:t>
+      </w:r>
+    </w:p>
+    <w:p>
+      <w:pPr>
+        <w:numPr>
+          <w:ilvl w:val="0"/>
+          <w:numId w:val="6"/>
+        </w:numPr>
+        <w:pBdr>
+          <w:bottom w:val="single" w:sz="6" w:space="1" w:color="auto"/>
+        </w:pBdr>
+        <w:rPr>
+          <w:sz w:val="28"/>
+          <w:szCs w:val="28"/>
+        </w:rPr>
+      </w:pPr>
+      <w:r>
+        <w:rPr>
+          <w:b/>
+          <w:bCs/>
+          <w:sz w:val="28"/>
+          <w:szCs w:val="28"/>
+        </w:rPr>
+        <w:t>Integrity Checks:</w:t>
+      </w:r>
+      <w:r>
+        <w:rPr>
+          <w:sz w:val="28"/>
+          <w:szCs w:val="28"/>
+        </w:rPr>
+        <w:t> Verified Foreign Key links using multi-table JOINs and confirmed row counts match the source CSVs.</w:t>
+      </w:r>
+    </w:p>
+    <w:p>
+      <w:pPr>
+        <w:pBdr>
+          <w:bottom w:val="single" w:sz="6" w:space="1" w:color="auto"/>
+        </w:pBdr>
+        <w:ind w:left="360"/>
+        <w:rPr>
+          <w:sz w:val="28"/>
+          <w:szCs w:val="28"/>
+        </w:rPr>
+      </w:pPr>
+    </w:p>
+    <w:p>
+      <w:pPr>
+        <w:rPr>
+          <w:sz w:val="28"/>
+          <w:szCs w:val="28"/>
+        </w:rPr>
+      </w:pPr>
+    </w:p>
+    <w:p/>
+    <w:p>
+      <w:pPr>
+        <w:jc w:val="center"/>
+        <w:rPr>
+          <w:rFonts w:asciiTheme="majorBidi" w:hAnsiTheme="majorBidi" w:cstheme="majorBidi"/>
+          <w:b/>
+          <w:bCs/>
+          <w:sz w:val="56"/>
+          <w:szCs w:val="56"/>
+        </w:rPr>
+      </w:pPr>
+    </w:p>
     <w:p>
       <w:pPr>
         <w:jc w:val="center"/>
@@ -4998,6 +5378,155 @@
     </w:lvl>
   </w:abstractNum>
   <w:abstractNum w:abstractNumId="2" w15:restartNumberingAfterBreak="0">
+    <w:nsid w:val="3D133C73"/>
+    <w:multiLevelType w:val="multilevel"/>
+    <w:tmpl w:val="B338E092"/>
+    <w:lvl w:ilvl="0">
+      <w:start w:val="1"/>
+      <w:numFmt w:val="bullet"/>
+      <w:lvlText w:val=""/>
+      <w:lvlJc w:val="left"/>
+      <w:pPr>
+        <w:tabs>
+          <w:tab w:val="num" w:pos="720"/>
+        </w:tabs>
+        <w:ind w:left="720" w:hanging="360"/>
+      </w:pPr>
+      <w:rPr>
+        <w:rFonts w:ascii="Symbol" w:hAnsi="Symbol" w:hint="default"/>
+        <w:sz w:val="20"/>
+      </w:rPr>
+    </w:lvl>
+    <w:lvl w:ilvl="1">
+      <w:start w:val="1"/>
+      <w:numFmt w:val="bullet"/>
+      <w:lvlText w:val="o"/>
+      <w:lvlJc w:val="left"/>
+      <w:pPr>
+        <w:tabs>
+          <w:tab w:val="num" w:pos="1440"/>
+        </w:tabs>
+        <w:ind w:left="1440" w:hanging="360"/>
+      </w:pPr>
+      <w:rPr>
+        <w:rFonts w:ascii="Courier New" w:hAnsi="Courier New" w:hint="default"/>
+        <w:sz w:val="20"/>
+      </w:rPr>
+    </w:lvl>
+    <w:lvl w:ilvl="2" w:tentative="1">
+      <w:start w:val="1"/>
+      <w:numFmt w:val="bullet"/>
+      <w:lvlText w:val=""/>
+      <w:lvlJc w:val="left"/>
+      <w:pPr>
+        <w:tabs>
+          <w:tab w:val="num" w:pos="2160"/>
+        </w:tabs>
+        <w:ind w:left="2160" w:hanging="360"/>
+      </w:pPr>
+      <w:rPr>
+        <w:rFonts w:ascii="Wingdings" w:hAnsi="Wingdings" w:hint="default"/>
+        <w:sz w:val="20"/>
+      </w:rPr>
+    </w:lvl>
+    <w:lvl w:ilvl="3" w:tentative="1">
+      <w:start w:val="1"/>
+      <w:numFmt w:val="bullet"/>
+      <w:lvlText w:val=""/>
+      <w:lvlJc w:val="left"/>
+      <w:pPr>
+        <w:tabs>
+          <w:tab w:val="num" w:pos="2880"/>
+        </w:tabs>
+        <w:ind w:left="2880" w:hanging="360"/>
+      </w:pPr>
+      <w:rPr>
+        <w:rFonts w:ascii="Wingdings" w:hAnsi="Wingdings" w:hint="default"/>
+        <w:sz w:val="20"/>
+      </w:rPr>
+    </w:lvl>
+    <w:lvl w:ilvl="4" w:tentative="1">
+      <w:start w:val="1"/>
+      <w:numFmt w:val="bullet"/>
+      <w:lvlText w:val=""/>
+      <w:lvlJc w:val="left"/>
+      <w:pPr>
+        <w:tabs>
+          <w:tab w:val="num" w:pos="3600"/>
+        </w:tabs>
+        <w:ind w:left="3600" w:hanging="360"/>
+      </w:pPr>
+      <w:rPr>
+        <w:rFonts w:ascii="Wingdings" w:hAnsi="Wingdings" w:hint="default"/>
+        <w:sz w:val="20"/>
+      </w:rPr>
+    </w:lvl>
+    <w:lvl w:ilvl="5" w:tentative="1">
+      <w:start w:val="1"/>
+      <w:numFmt w:val="bullet"/>
+      <w:lvlText w:val=""/>
+      <w:lvlJc w:val="left"/>
+      <w:pPr>
+        <w:tabs>
+          <w:tab w:val="num" w:pos="4320"/>
+        </w:tabs>
+        <w:ind w:left="4320" w:hanging="360"/>
+      </w:pPr>
+      <w:rPr>
+        <w:rFonts w:ascii="Wingdings" w:hAnsi="Wingdings" w:hint="default"/>
+        <w:sz w:val="20"/>
+      </w:rPr>
+    </w:lvl>
+    <w:lvl w:ilvl="6" w:tentative="1">
+      <w:start w:val="1"/>
+      <w:numFmt w:val="bullet"/>
+      <w:lvlText w:val=""/>
+      <w:lvlJc w:val="left"/>
+      <w:pPr>
+        <w:tabs>
+          <w:tab w:val="num" w:pos="5040"/>
+        </w:tabs>
+        <w:ind w:left="5040" w:hanging="360"/>
+      </w:pPr>
+      <w:rPr>
+        <w:rFonts w:ascii="Wingdings" w:hAnsi="Wingdings" w:hint="default"/>
+        <w:sz w:val="20"/>
+      </w:rPr>
+    </w:lvl>
+    <w:lvl w:ilvl="7" w:tentative="1">
+      <w:start w:val="1"/>
+      <w:numFmt w:val="bullet"/>
+      <w:lvlText w:val=""/>
+      <w:lvlJc w:val="left"/>
+      <w:pPr>
+        <w:tabs>
+          <w:tab w:val="num" w:pos="5760"/>
+        </w:tabs>
+        <w:ind w:left="5760" w:hanging="360"/>
+      </w:pPr>
+      <w:rPr>
+        <w:rFonts w:ascii="Wingdings" w:hAnsi="Wingdings" w:hint="default"/>
+        <w:sz w:val="20"/>
+      </w:rPr>
+    </w:lvl>
+    <w:lvl w:ilvl="8" w:tentative="1">
+      <w:start w:val="1"/>
+      <w:numFmt w:val="bullet"/>
+      <w:lvlText w:val=""/>
+      <w:lvlJc w:val="left"/>
+      <w:pPr>
+        <w:tabs>
+          <w:tab w:val="num" w:pos="6480"/>
+        </w:tabs>
+        <w:ind w:left="6480" w:hanging="360"/>
+      </w:pPr>
+      <w:rPr>
+        <w:rFonts w:ascii="Wingdings" w:hAnsi="Wingdings" w:hint="default"/>
+        <w:sz w:val="20"/>
+      </w:rPr>
+    </w:lvl>
+  </w:abstractNum>
+  <w:abstractNum w:abstractNumId="3" w15:restartNumberingAfterBreak="0">
     <w:nsid w:val="5535141C"/>
     <w:multiLevelType w:val="multilevel"/>
     <w:tmpl w:val="47EA5D7A"/>
@@ -5110,7 +5639,7 @@
       </w:pPr>
     </w:lvl>
   </w:abstractNum>
-  <w:abstractNum w:abstractNumId="3" w15:restartNumberingAfterBreak="0">
+  <w:abstractNum w:abstractNumId="4" w15:restartNumberingAfterBreak="0">
     <w:nsid w:val="6EA614A1"/>
     <w:multiLevelType w:val="multilevel"/>
     <w:tmpl w:val="0DFA7C30"/>
@@ -5259,7 +5788,7 @@
       </w:rPr>
     </w:lvl>
   </w:abstractNum>
-  <w:abstractNum w:abstractNumId="4" w15:restartNumberingAfterBreak="0">
+  <w:abstractNum w:abstractNumId="5" w15:restartNumberingAfterBreak="0">
     <w:nsid w:val="79E05096"/>
     <w:multiLevelType w:val="multilevel"/>
     <w:tmpl w:val="ADAE6B7A"/>
@@ -5409,19 +5938,22 @@
     </w:lvl>
   </w:abstractNum>
   <w:num w:numId="1" w16cid:durableId="1366784308">
-    <w:abstractNumId w:val="4"/>
+    <w:abstractNumId w:val="5"/>
   </w:num>
   <w:num w:numId="2" w16cid:durableId="253170238">
     <w:abstractNumId w:val="1"/>
   </w:num>
   <w:num w:numId="3" w16cid:durableId="1190415741">
-    <w:abstractNumId w:val="2"/>
+    <w:abstractNumId w:val="3"/>
   </w:num>
   <w:num w:numId="4" w16cid:durableId="198903813">
     <w:abstractNumId w:val="0"/>
   </w:num>
   <w:num w:numId="5" w16cid:durableId="1541237145">
-    <w:abstractNumId w:val="3"/>
+    <w:abstractNumId w:val="4"/>
+  </w:num>
+  <w:num w:numId="6" w16cid:durableId="1858155159">
+    <w:abstractNumId w:val="2"/>
   </w:num>
 </w:numbering>
 </file>
@@ -5824,7 +6356,30 @@
   <w:style w:type="paragraph" w:default="1" w:styleId="Normal">
     <w:name w:val="Normal"/>
     <w:qFormat/>
-    <w:rsid w:val="001C1957"/>
+    <w:rsid w:val="00D66651"/>
+  </w:style>
+  <w:style w:type="paragraph" w:styleId="Heading4">
+    <w:name w:val="heading 4"/>
+    <w:basedOn w:val="Normal"/>
+    <w:next w:val="Normal"/>
+    <w:link w:val="Heading4Char"/>
+    <w:uiPriority w:val="9"/>
+    <w:semiHidden/>
+    <w:unhideWhenUsed/>
+    <w:qFormat/>
+    <w:rsid w:val="00D66651"/>
+    <w:pPr>
+      <w:keepNext/>
+      <w:keepLines/>
+      <w:spacing w:before="40" w:after="0"/>
+      <w:outlineLvl w:val="3"/>
+    </w:pPr>
+    <w:rPr>
+      <w:rFonts w:asciiTheme="majorHAnsi" w:eastAsiaTheme="majorEastAsia" w:hAnsiTheme="majorHAnsi" w:cstheme="majorBidi"/>
+      <w:i/>
+      <w:iCs/>
+      <w:color w:val="2E74B5" w:themeColor="accent1" w:themeShade="BF"/>
+    </w:rPr>
   </w:style>
   <w:style w:type="character" w:default="1" w:styleId="DefaultParagraphFont">
     <w:name w:val="Default Paragraph Font"/>
@@ -7360,6 +7915,20 @@
         <w:shd w:val="clear" w:color="auto" w:fill="D9E2F3" w:themeFill="accent5" w:themeFillTint="33"/>
       </w:tcPr>
     </w:tblStylePr>
+  </w:style>
+  <w:style w:type="character" w:customStyle="1" w:styleId="Heading4Char">
+    <w:name w:val="Heading 4 Char"/>
+    <w:basedOn w:val="DefaultParagraphFont"/>
+    <w:link w:val="Heading4"/>
+    <w:uiPriority w:val="9"/>
+    <w:semiHidden/>
+    <w:rsid w:val="00D66651"/>
+    <w:rPr>
+      <w:rFonts w:asciiTheme="majorHAnsi" w:eastAsiaTheme="majorEastAsia" w:hAnsiTheme="majorHAnsi" w:cstheme="majorBidi"/>
+      <w:i/>
+      <w:iCs/>
+      <w:color w:val="2E74B5" w:themeColor="accent1" w:themeShade="BF"/>
+    </w:rPr>
   </w:style>
 </w:styles>
 </file>

</xml_diff>